<commit_message>
docs: fixed header and footer from manual
</commit_message>
<xml_diff>
--- a/docs/NTG — Technical Manual.docx
+++ b/docs/NTG — Technical Manual.docx
@@ -45651,20 +45651,87 @@
     </w:r>
     <w:r>
       <w:rPr>
-        <w:rFonts w:ascii="Calibri" w:cs="Calibri" w:eastAsia="Calibri" w:hAnsi="Calibri"/>
         <w:color w:val="5B6472"/>
         <w:sz w:val="16"/>
-        <w:szCs w:val="16"/>
       </w:rPr>
-      <w:t xml:space="preserve">	Page </w:t>
+      <w:tab/>
+      <w:t xml:space="preserve">Page </w:t>
+    </w:r>
+    <w:r>
+      <w:rPr>
+        <w:color w:val="5B6472"/>
+        <w:sz w:val="16"/>
+      </w:rPr>
       <w:fldChar w:fldCharType="begin"/>
-      <w:instrText xml:space="preserve">PAGE</w:instrText>
+    </w:r>
+    <w:r>
+      <w:rPr>
+        <w:color w:val="5B6472"/>
+        <w:sz w:val="16"/>
+      </w:rPr>
+      <w:instrText xml:space="preserve"> PAGE </w:instrText>
+    </w:r>
+    <w:r>
+      <w:rPr>
+        <w:color w:val="5B6472"/>
+        <w:sz w:val="16"/>
+      </w:rPr>
       <w:fldChar w:fldCharType="separate"/>
+    </w:r>
+    <w:r>
+      <w:rPr>
+        <w:color w:val="5B6472"/>
+        <w:sz w:val="16"/>
+      </w:rPr>
+      <w:t>1</w:t>
+    </w:r>
+    <w:r>
+      <w:rPr>
+        <w:color w:val="5B6472"/>
+        <w:sz w:val="16"/>
+      </w:rPr>
       <w:fldChar w:fldCharType="end"/>
+    </w:r>
+    <w:r>
+      <w:rPr>
+        <w:color w:val="5B6472"/>
+        <w:sz w:val="16"/>
+      </w:rPr>
       <w:t xml:space="preserve"> of </w:t>
+    </w:r>
+    <w:r>
+      <w:rPr>
+        <w:color w:val="5B6472"/>
+        <w:sz w:val="16"/>
+      </w:rPr>
       <w:fldChar w:fldCharType="begin"/>
-      <w:instrText xml:space="preserve">NUMPAGES</w:instrText>
+    </w:r>
+    <w:r>
+      <w:rPr>
+        <w:color w:val="5B6472"/>
+        <w:sz w:val="16"/>
+      </w:rPr>
+      <w:instrText xml:space="preserve"> NUMPAGES </w:instrText>
+    </w:r>
+    <w:r>
+      <w:rPr>
+        <w:color w:val="5B6472"/>
+        <w:sz w:val="16"/>
+      </w:rPr>
       <w:fldChar w:fldCharType="separate"/>
+    </w:r>
+    <w:r>
+      <w:rPr>
+        <w:color w:val="5B6472"/>
+        <w:sz w:val="16"/>
+      </w:rPr>
+      <w:t>1</w:t>
+    </w:r>
+    <w:r>
+      <w:rPr>
+        <w:color w:val="5B6472"/>
+        <w:sz w:val="16"/>
+      </w:rPr>
       <w:fldChar w:fldCharType="end"/>
     </w:r>
   </w:p>
@@ -45741,7 +45808,8 @@
         <w:sz w:val="16"/>
         <w:szCs w:val="16"/>
       </w:rPr>
-      <w:t xml:space="preserve">	Version 2.0</w:t>
+      <w:tab/>
+      <w:t xml:space="preserve">Version 2.0</w:t>
     </w:r>
   </w:p>
 </w:hdr>

</xml_diff>

<commit_message>
docs: document the frontend conventions and tooling
- Frontend README: new core/ tree, naming, visibility, modal and comment conventions,
  lint and format commands.
- Technical manual 2.1: frontend tree, AuthSession and GameCatalog names, conventions and
  changelog entry.

Co-Authored-By: Claude Opus 5.5 <noreply@anthropic.com>
</commit_message>
<xml_diff>
--- a/docs/NTG — Technical Manual.docx
+++ b/docs/NTG — Technical Manual.docx
@@ -119,7 +119,7 @@
           <w:sz w:val="22"/>
           <w:szCs w:val="22"/>
         </w:rPr>
-        <w:t xml:space="preserve">Version 2.0  ·  Oct 27, 2026</w:t>
+        <w:t xml:space="preserve">Version 2.1  ·  Oct 28, 2026</w:t>
       </w:r>
     </w:p>
     <w:p>
@@ -13785,7 +13785,7 @@
           <w:sz w:val="17"/>
           <w:szCs w:val="17"/>
         </w:rPr>
-        <w:t xml:space="preserve">    │   ├── config/       api.ts (API_BASE_URL), game-module.ts (GameModule contract)</w:t>
+        <w:t xml:space="preserve">    │   ├── api/          api.ts (API_BASE_URL)</w:t>
       </w:r>
     </w:p>
     <w:p>
@@ -13806,7 +13806,7 @@
           <w:sz w:val="17"/>
           <w:szCs w:val="17"/>
         </w:rPr>
-        <w:t xml:space="preserve">    │   ├── services/     auth, game-catalog, asset, user, tag, notification</w:t>
+        <w:t xml:space="preserve">    │   ├── auth/         AuthSession, auth-interceptor, auth · admin · role-home guards</w:t>
       </w:r>
     </w:p>
     <w:p>
@@ -13827,7 +13827,7 @@
           <w:sz w:val="17"/>
           <w:szCs w:val="17"/>
         </w:rPr>
-        <w:t xml:space="preserve">    │   ├── interceptors/ auth (token + silent renewal)</w:t>
+        <w:t xml:space="preserve">    │   ├── games/        GameModule contract, GameCatalog, game-guard</w:t>
       </w:r>
     </w:p>
     <w:p>
@@ -13848,7 +13848,7 @@
           <w:sz w:val="17"/>
           <w:szCs w:val="17"/>
         </w:rPr>
-        <w:t xml:space="preserve">    │   └── guards/       auth · admin · role-home · game</w:t>
+        <w:t xml:space="preserve">    │   ├── users/ tags/  UserApi, TagApi</w:t>
       </w:r>
     </w:p>
     <w:p>
@@ -13869,7 +13869,49 @@
           <w:sz w:val="17"/>
           <w:szCs w:val="17"/>
         </w:rPr>
-        <w:t xml:space="preserve">    ├── shared/           models (user, tag, game, asset), notifications, utils</w:t>
+        <w:t xml:space="preserve">    │   ├── assets/       AssetApi (pictures)</w:t>
+      </w:r>
+    </w:p>
+    <w:p>
+      <w:pPr>
+        <w:keepNext/>
+        <w:keepLines/>
+        <w:pBdr>
+          <w:left w:val="single" w:color="1F6FD1" w:sz="18" w:space="6"/>
+        </w:pBdr>
+        <w:shd w:fill="F3F4F6" w:color="auto" w:val="clear"/>
+        <w:spacing w:after="0" w:before="0" w:line="252"/>
+        <w:ind w:left="840" w:right="60"/>
+      </w:pPr>
+      <w:r>
+        <w:rPr>
+          <w:rFonts w:ascii="Courier New" w:cs="Courier New" w:eastAsia="Courier New" w:hAnsi="Courier New"/>
+          <w:color w:val="1F2937"/>
+          <w:sz w:val="17"/>
+          <w:szCs w:val="17"/>
+        </w:rPr>
+        <w:t xml:space="preserve">    │   └── notifications/ NotificationCenter</w:t>
+      </w:r>
+    </w:p>
+    <w:p>
+      <w:pPr>
+        <w:keepNext/>
+        <w:keepLines/>
+        <w:pBdr>
+          <w:left w:val="single" w:color="1F6FD1" w:sz="18" w:space="6"/>
+        </w:pBdr>
+        <w:shd w:fill="F3F4F6" w:color="auto" w:val="clear"/>
+        <w:spacing w:after="0" w:before="0" w:line="252"/>
+        <w:ind w:left="840" w:right="60"/>
+      </w:pPr>
+      <w:r>
+        <w:rPr>
+          <w:rFonts w:ascii="Courier New" w:cs="Courier New" w:eastAsia="Courier New" w:hAnsi="Courier New"/>
+          <w:color w:val="1F2937"/>
+          <w:sz w:val="17"/>
+          <w:szCs w:val="17"/>
+        </w:rPr>
+        <w:t xml:space="preserve">    ├── shared/           models (user, tag, game, asset), notifications, directives (modal overlay), utils</w:t>
       </w:r>
     </w:p>
     <w:p>
@@ -15065,7 +15107,7 @@
           <w:szCs w:val="18"/>
           <w:shd w:fill="EEF1F6" w:color="auto" w:val="clear"/>
         </w:rPr>
-        <w:t xml:space="preserve">GameCatalogService</w:t>
+        <w:t xml:space="preserve">GameCatalog</w:t>
       </w:r>
       <w:r>
         <w:rPr>
@@ -15172,7 +15214,7 @@
           <w:szCs w:val="18"/>
           <w:shd w:fill="EEF1F6" w:color="auto" w:val="clear"/>
         </w:rPr>
-        <w:t xml:space="preserve">AuthService</w:t>
+        <w:t xml:space="preserve">AuthSession</w:t>
       </w:r>
       <w:r>
         <w:rPr>
@@ -16492,7 +16534,314 @@
           <w:sz w:val="21"/>
           <w:szCs w:val="21"/>
         </w:rPr>
-        <w:t xml:space="preserve">; every file starts with a short English header comment.</w:t>
+        <w:t xml:space="preserve">. Services are named for what they do (</w:t>
+      </w:r>
+      <w:r>
+        <w:rPr>
+          <w:rFonts w:ascii="Courier New" w:cs="Courier New" w:eastAsia="Courier New" w:hAnsi="Courier New"/>
+          <w:color w:val="1F2937"/>
+          <w:sz w:val="18"/>
+          <w:szCs w:val="18"/>
+          <w:shd w:fill="EEF1F6" w:color="auto" w:val="clear"/>
+        </w:rPr>
+        <w:t xml:space="preserve">AuthSession</w:t>
+      </w:r>
+      <w:r>
+        <w:rPr>
+          <w:rFonts w:ascii="Calibri" w:cs="Calibri" w:eastAsia="Calibri" w:hAnsi="Calibri"/>
+          <w:color w:val="1F2937"/>
+          <w:sz w:val="21"/>
+          <w:szCs w:val="21"/>
+        </w:rPr>
+        <w:t xml:space="preserve">, </w:t>
+      </w:r>
+      <w:r>
+        <w:rPr>
+          <w:rFonts w:ascii="Courier New" w:cs="Courier New" w:eastAsia="Courier New" w:hAnsi="Courier New"/>
+          <w:color w:val="1F2937"/>
+          <w:sz w:val="18"/>
+          <w:szCs w:val="18"/>
+          <w:shd w:fill="EEF1F6" w:color="auto" w:val="clear"/>
+        </w:rPr>
+        <w:t xml:space="preserve">GameCatalog</w:t>
+      </w:r>
+      <w:r>
+        <w:rPr>
+          <w:rFonts w:ascii="Calibri" w:cs="Calibri" w:eastAsia="Calibri" w:hAnsi="Calibri"/>
+          <w:color w:val="1F2937"/>
+          <w:sz w:val="21"/>
+          <w:szCs w:val="21"/>
+        </w:rPr>
+        <w:t xml:space="preserve">, </w:t>
+      </w:r>
+      <w:r>
+        <w:rPr>
+          <w:rFonts w:ascii="Courier New" w:cs="Courier New" w:eastAsia="Courier New" w:hAnsi="Courier New"/>
+          <w:color w:val="1F2937"/>
+          <w:sz w:val="18"/>
+          <w:szCs w:val="18"/>
+          <w:shd w:fill="EEF1F6" w:color="auto" w:val="clear"/>
+        </w:rPr>
+        <w:t xml:space="preserve">UserApi</w:t>
+      </w:r>
+      <w:r>
+        <w:rPr>
+          <w:rFonts w:ascii="Calibri" w:cs="Calibri" w:eastAsia="Calibri" w:hAnsi="Calibri"/>
+          <w:color w:val="1F2937"/>
+          <w:sz w:val="21"/>
+          <w:szCs w:val="21"/>
+        </w:rPr>
+        <w:t xml:space="preserve">); guards and interceptors keep their type with a hyphen (</w:t>
+      </w:r>
+      <w:r>
+        <w:rPr>
+          <w:rFonts w:ascii="Courier New" w:cs="Courier New" w:eastAsia="Courier New" w:hAnsi="Courier New"/>
+          <w:color w:val="1F2937"/>
+          <w:sz w:val="18"/>
+          <w:szCs w:val="18"/>
+          <w:shd w:fill="EEF1F6" w:color="auto" w:val="clear"/>
+        </w:rPr>
+        <w:t xml:space="preserve">auth-guard.ts</w:t>
+      </w:r>
+      <w:r>
+        <w:rPr>
+          <w:rFonts w:ascii="Calibri" w:cs="Calibri" w:eastAsia="Calibri" w:hAnsi="Calibri"/>
+          <w:color w:val="1F2937"/>
+          <w:sz w:val="21"/>
+          <w:szCs w:val="21"/>
+        </w:rPr>
+        <w:t xml:space="preserve">, </w:t>
+      </w:r>
+      <w:r>
+        <w:rPr>
+          <w:rFonts w:ascii="Courier New" w:cs="Courier New" w:eastAsia="Courier New" w:hAnsi="Courier New"/>
+          <w:color w:val="1F2937"/>
+          <w:sz w:val="18"/>
+          <w:szCs w:val="18"/>
+          <w:shd w:fill="EEF1F6" w:color="auto" w:val="clear"/>
+        </w:rPr>
+        <w:t xml:space="preserve">auth-interceptor.ts</w:t>
+      </w:r>
+      <w:r>
+        <w:rPr>
+          <w:rFonts w:ascii="Calibri" w:cs="Calibri" w:eastAsia="Calibri" w:hAnsi="Calibri"/>
+          <w:color w:val="1F2937"/>
+          <w:sz w:val="21"/>
+          <w:szCs w:val="21"/>
+        </w:rPr>
+        <w:t xml:space="preserve">).</w:t>
+      </w:r>
+    </w:p>
+    <w:p>
+      <w:pPr>
+        <w:pStyle w:val="ListParagraph"/>
+        <w:numPr>
+          <w:ilvl w:val="0"/>
+          <w:numId w:val="3"/>
+        </w:numPr>
+        <w:spacing w:after="70" w:line="264"/>
+        <w:ind w:left="1080" w:hanging="300"/>
+      </w:pPr>
+      <w:r>
+        <w:rPr>
+          <w:rFonts w:ascii="Calibri" w:cs="Calibri" w:eastAsia="Calibri" w:hAnsi="Calibri"/>
+          <w:color w:val="1F2937"/>
+          <w:sz w:val="21"/>
+          <w:szCs w:val="21"/>
+        </w:rPr>
+        <w:t xml:space="preserve">Members used only by a component template are </w:t>
+      </w:r>
+      <w:r>
+        <w:rPr>
+          <w:rFonts w:ascii="Courier New" w:cs="Courier New" w:eastAsia="Courier New" w:hAnsi="Courier New"/>
+          <w:color w:val="1F2937"/>
+          <w:sz w:val="18"/>
+          <w:szCs w:val="18"/>
+          <w:shd w:fill="EEF1F6" w:color="auto" w:val="clear"/>
+        </w:rPr>
+        <w:t xml:space="preserve">protected</w:t>
+      </w:r>
+      <w:r>
+        <w:rPr>
+          <w:rFonts w:ascii="Calibri" w:cs="Calibri" w:eastAsia="Calibri" w:hAnsi="Calibri"/>
+          <w:color w:val="1F2937"/>
+          <w:sz w:val="21"/>
+          <w:szCs w:val="21"/>
+        </w:rPr>
+        <w:t xml:space="preserve">, members used only by its class are </w:t>
+      </w:r>
+      <w:r>
+        <w:rPr>
+          <w:rFonts w:ascii="Courier New" w:cs="Courier New" w:eastAsia="Courier New" w:hAnsi="Courier New"/>
+          <w:color w:val="1F2937"/>
+          <w:sz w:val="18"/>
+          <w:szCs w:val="18"/>
+          <w:shd w:fill="EEF1F6" w:color="auto" w:val="clear"/>
+        </w:rPr>
+        <w:t xml:space="preserve">private</w:t>
+      </w:r>
+      <w:r>
+        <w:rPr>
+          <w:rFonts w:ascii="Calibri" w:cs="Calibri" w:eastAsia="Calibri" w:hAnsi="Calibri"/>
+          <w:color w:val="1F2937"/>
+          <w:sz w:val="21"/>
+          <w:szCs w:val="21"/>
+        </w:rPr>
+        <w:t xml:space="preserve">; event handlers are named for their action (</w:t>
+      </w:r>
+      <w:r>
+        <w:rPr>
+          <w:rFonts w:ascii="Courier New" w:cs="Courier New" w:eastAsia="Courier New" w:hAnsi="Courier New"/>
+          <w:color w:val="1F2937"/>
+          <w:sz w:val="18"/>
+          <w:szCs w:val="18"/>
+          <w:shd w:fill="EEF1F6" w:color="auto" w:val="clear"/>
+        </w:rPr>
+        <w:t xml:space="preserve">signIn()</w:t>
+      </w:r>
+      <w:r>
+        <w:rPr>
+          <w:rFonts w:ascii="Calibri" w:cs="Calibri" w:eastAsia="Calibri" w:hAnsi="Calibri"/>
+          <w:color w:val="1F2937"/>
+          <w:sz w:val="21"/>
+          <w:szCs w:val="21"/>
+        </w:rPr>
+        <w:t xml:space="preserve">, </w:t>
+      </w:r>
+      <w:r>
+        <w:rPr>
+          <w:rFonts w:ascii="Courier New" w:cs="Courier New" w:eastAsia="Courier New" w:hAnsi="Courier New"/>
+          <w:color w:val="1F2937"/>
+          <w:sz w:val="18"/>
+          <w:szCs w:val="18"/>
+          <w:shd w:fill="EEF1F6" w:color="auto" w:val="clear"/>
+        </w:rPr>
+        <w:t xml:space="preserve">uploadPicture()</w:t>
+      </w:r>
+      <w:r>
+        <w:rPr>
+          <w:rFonts w:ascii="Calibri" w:cs="Calibri" w:eastAsia="Calibri" w:hAnsi="Calibri"/>
+          <w:color w:val="1F2937"/>
+          <w:sz w:val="21"/>
+          <w:szCs w:val="21"/>
+        </w:rPr>
+        <w:t xml:space="preserve">).</w:t>
+      </w:r>
+    </w:p>
+    <w:p>
+      <w:pPr>
+        <w:pStyle w:val="ListParagraph"/>
+        <w:numPr>
+          <w:ilvl w:val="0"/>
+          <w:numId w:val="3"/>
+        </w:numPr>
+        <w:spacing w:after="70" w:line="264"/>
+        <w:ind w:left="1080" w:hanging="300"/>
+      </w:pPr>
+      <w:r>
+        <w:rPr>
+          <w:rFonts w:ascii="Calibri" w:cs="Calibri" w:eastAsia="Calibri" w:hAnsi="Calibri"/>
+          <w:color w:val="1F2937"/>
+          <w:sz w:val="21"/>
+          <w:szCs w:val="21"/>
+        </w:rPr>
+        <w:t xml:space="preserve">Every modal backdrop uses the </w:t>
+      </w:r>
+      <w:r>
+        <w:rPr>
+          <w:rFonts w:ascii="Courier New" w:cs="Courier New" w:eastAsia="Courier New" w:hAnsi="Courier New"/>
+          <w:color w:val="1F2937"/>
+          <w:sz w:val="18"/>
+          <w:szCs w:val="18"/>
+          <w:shd w:fill="EEF1F6" w:color="auto" w:val="clear"/>
+        </w:rPr>
+        <w:t xml:space="preserve">appModalOverlay</w:t>
+      </w:r>
+      <w:r>
+        <w:rPr>
+          <w:rFonts w:ascii="Calibri" w:cs="Calibri" w:eastAsia="Calibri" w:hAnsi="Calibri"/>
+          <w:color w:val="1F2937"/>
+          <w:sz w:val="21"/>
+          <w:szCs w:val="21"/>
+        </w:rPr>
+        <w:t xml:space="preserve"> directive: Escape or a click outside closes it, focus stays inside the dialog, the dialog is named after its title and focus returns to the element that opened it.</w:t>
+      </w:r>
+    </w:p>
+    <w:p>
+      <w:pPr>
+        <w:pStyle w:val="ListParagraph"/>
+        <w:numPr>
+          <w:ilvl w:val="0"/>
+          <w:numId w:val="3"/>
+        </w:numPr>
+        <w:spacing w:after="70" w:line="264"/>
+        <w:ind w:left="1080" w:hanging="300"/>
+      </w:pPr>
+      <w:r>
+        <w:rPr>
+          <w:rFonts w:ascii="Calibri" w:cs="Calibri" w:eastAsia="Calibri" w:hAnsi="Calibri"/>
+          <w:color w:val="1F2937"/>
+          <w:sz w:val="21"/>
+          <w:szCs w:val="21"/>
+        </w:rPr>
+        <w:t xml:space="preserve">Every </w:t>
+      </w:r>
+      <w:r>
+        <w:rPr>
+          <w:rFonts w:ascii="Courier New" w:cs="Courier New" w:eastAsia="Courier New" w:hAnsi="Courier New"/>
+          <w:color w:val="1F2937"/>
+          <w:sz w:val="18"/>
+          <w:szCs w:val="18"/>
+          <w:shd w:fill="EEF1F6" w:color="auto" w:val="clear"/>
+        </w:rPr>
+        <w:t xml:space="preserve">.ts</w:t>
+      </w:r>
+      <w:r>
+        <w:rPr>
+          <w:rFonts w:ascii="Calibri" w:cs="Calibri" w:eastAsia="Calibri" w:hAnsi="Calibri"/>
+          <w:color w:val="1F2937"/>
+          <w:sz w:val="21"/>
+          <w:szCs w:val="21"/>
+        </w:rPr>
+        <w:t xml:space="preserve"> file starts with a short English header comment and there are no other comments in the code, styles or templates. ESLint (angular-eslint, including template accessibility) and Prettier (120 columns, 4 spaces) must pass: </w:t>
+      </w:r>
+      <w:r>
+        <w:rPr>
+          <w:rFonts w:ascii="Courier New" w:cs="Courier New" w:eastAsia="Courier New" w:hAnsi="Courier New"/>
+          <w:color w:val="1F2937"/>
+          <w:sz w:val="18"/>
+          <w:szCs w:val="18"/>
+          <w:shd w:fill="EEF1F6" w:color="auto" w:val="clear"/>
+        </w:rPr>
+        <w:t xml:space="preserve">npm run lint</w:t>
+      </w:r>
+      <w:r>
+        <w:rPr>
+          <w:rFonts w:ascii="Calibri" w:cs="Calibri" w:eastAsia="Calibri" w:hAnsi="Calibri"/>
+          <w:color w:val="1F2937"/>
+          <w:sz w:val="21"/>
+          <w:szCs w:val="21"/>
+        </w:rPr>
+        <w:t xml:space="preserve">, </w:t>
+      </w:r>
+      <w:r>
+        <w:rPr>
+          <w:rFonts w:ascii="Courier New" w:cs="Courier New" w:eastAsia="Courier New" w:hAnsi="Courier New"/>
+          <w:color w:val="1F2937"/>
+          <w:sz w:val="18"/>
+          <w:szCs w:val="18"/>
+          <w:shd w:fill="EEF1F6" w:color="auto" w:val="clear"/>
+        </w:rPr>
+        <w:t xml:space="preserve">npm run format:check</w:t>
+      </w:r>
+      <w:r>
+        <w:rPr>
+          <w:rFonts w:ascii="Calibri" w:cs="Calibri" w:eastAsia="Calibri" w:hAnsi="Calibri"/>
+          <w:color w:val="1F2937"/>
+          <w:sz w:val="21"/>
+          <w:szCs w:val="21"/>
+        </w:rPr>
+        <w:t xml:space="preserve">.</w:t>
       </w:r>
     </w:p>
     <w:p>
@@ -44854,6 +45203,104 @@
                 <w:szCs w:val="19"/>
               </w:rPr>
               <w:t xml:space="preserve">Change</w:t>
+            </w:r>
+          </w:p>
+        </w:tc>
+      </w:tr>
+      <w:tr>
+        <w:trPr>
+          <w:cantSplit/>
+        </w:trPr>
+        <w:tc>
+          <w:tcPr>
+            <w:tcW w:type="dxa" w:w="955"/>
+            <w:tcBorders>
+              <w:top w:val="single" w:color="C9D3E3" w:sz="4"/>
+              <w:left w:val="single" w:color="C9D3E3" w:sz="4"/>
+              <w:bottom w:val="single" w:color="C9D3E3" w:sz="4"/>
+              <w:right w:val="single" w:color="C9D3E3" w:sz="4"/>
+            </w:tcBorders>
+            <w:tcMar>
+              <w:top w:type="dxa" w:w="60"/>
+              <w:left w:type="dxa" w:w="100"/>
+              <w:bottom w:type="dxa" w:w="60"/>
+              <w:right w:type="dxa" w:w="100"/>
+            </w:tcMar>
+          </w:tcPr>
+          <w:p>
+            <w:pPr>
+              <w:spacing w:after="30" w:line="250"/>
+            </w:pPr>
+            <w:r>
+              <w:rPr>
+                <w:rFonts w:ascii="Calibri" w:cs="Calibri" w:eastAsia="Calibri" w:hAnsi="Calibri"/>
+                <w:color w:val="1F2937"/>
+                <w:sz w:val="21"/>
+                <w:szCs w:val="21"/>
+              </w:rPr>
+              <w:t xml:space="preserve">2.1</w:t>
+            </w:r>
+          </w:p>
+        </w:tc>
+        <w:tc>
+          <w:tcPr>
+            <w:tcW w:type="dxa" w:w="1337"/>
+            <w:tcBorders>
+              <w:top w:val="single" w:color="C9D3E3" w:sz="4"/>
+              <w:left w:val="single" w:color="C9D3E3" w:sz="4"/>
+              <w:bottom w:val="single" w:color="C9D3E3" w:sz="4"/>
+              <w:right w:val="single" w:color="C9D3E3" w:sz="4"/>
+            </w:tcBorders>
+            <w:tcMar>
+              <w:top w:type="dxa" w:w="60"/>
+              <w:left w:type="dxa" w:w="100"/>
+              <w:bottom w:type="dxa" w:w="60"/>
+              <w:right w:type="dxa" w:w="100"/>
+            </w:tcMar>
+          </w:tcPr>
+          <w:p>
+            <w:pPr>
+              <w:spacing w:after="30" w:line="250"/>
+            </w:pPr>
+            <w:r>
+              <w:rPr>
+                <w:rFonts w:ascii="Calibri" w:cs="Calibri" w:eastAsia="Calibri" w:hAnsi="Calibri"/>
+                <w:color w:val="1F2937"/>
+                <w:sz w:val="21"/>
+                <w:szCs w:val="21"/>
+              </w:rPr>
+              <w:t xml:space="preserve">2026-10-28</w:t>
+            </w:r>
+          </w:p>
+        </w:tc>
+        <w:tc>
+          <w:tcPr>
+            <w:tcW w:type="dxa" w:w="6308"/>
+            <w:tcBorders>
+              <w:top w:val="single" w:color="C9D3E3" w:sz="4"/>
+              <w:left w:val="single" w:color="C9D3E3" w:sz="4"/>
+              <w:bottom w:val="single" w:color="C9D3E3" w:sz="4"/>
+              <w:right w:val="single" w:color="C9D3E3" w:sz="4"/>
+            </w:tcBorders>
+            <w:tcMar>
+              <w:top w:type="dxa" w:w="60"/>
+              <w:left w:type="dxa" w:w="100"/>
+              <w:bottom w:type="dxa" w:w="60"/>
+              <w:right w:type="dxa" w:w="100"/>
+            </w:tcMar>
+          </w:tcPr>
+          <w:p>
+            <w:pPr>
+              <w:spacing w:after="30" w:line="250"/>
+            </w:pPr>
+            <w:r>
+              <w:rPr>
+                <w:rFonts w:ascii="Calibri" w:cs="Calibri" w:eastAsia="Calibri" w:hAnsi="Calibri"/>
+                <w:color w:val="1F2937"/>
+                <w:sz w:val="21"/>
+                <w:szCs w:val="21"/>
+              </w:rPr>
+              <w:t xml:space="preserve">Frontend: ESLint and Prettier, accessible modals and form labels, core grouped by area, naming and visibility conventions, no comments besides file headers</w:t>
             </w:r>
           </w:p>
         </w:tc>
@@ -45809,7 +46256,7 @@
         <w:szCs w:val="16"/>
       </w:rPr>
       <w:tab/>
-      <w:t xml:space="preserve">Version 2.0</w:t>
+      <w:t xml:space="preserve">Version 2.1</w:t>
     </w:r>
   </w:p>
 </w:hdr>

</xml_diff>

<commit_message>
feat(wow-forever): revalidate game data on every request and show the build on the launcher
- Game data and the Pokémon type chart are sent with Cache-Control: no-cache and an ETag,
  so players see new data right after a deploy instead of up to an hour (or a day) later.
- The index credit carries the game build, read from the talent sources of each class.
- The launcher play button shows that build and cannot be pressed.
- Technical manual 2.2: cache rules, build, Razas y raciales, changelog.

Co-Authored-By: Claude Opus 5.5 <noreply@anthropic.com>
</commit_message>
<xml_diff>
--- a/docs/NTG — Technical Manual.docx
+++ b/docs/NTG — Technical Manual.docx
@@ -119,7 +119,7 @@
           <w:sz w:val="22"/>
           <w:szCs w:val="22"/>
         </w:rPr>
-        <w:t xml:space="preserve">Version 2.1  ·  Oct 28, 2026</w:t>
+        <w:t xml:space="preserve">Version 2.2  ·  Oct 28, 2026</w:t>
       </w:r>
     </w:p>
     <w:p>
@@ -26820,7 +26820,7 @@
                 <w:sz w:val="19"/>
                 <w:szCs w:val="19"/>
               </w:rPr>
-              <w:t xml:space="preserve">, cached one day</w:t>
+              <w:t xml:space="preserve">, revalidated on every request</w:t>
             </w:r>
           </w:p>
         </w:tc>
@@ -29617,7 +29617,7 @@
                 <w:sz w:val="19"/>
                 <w:szCs w:val="19"/>
               </w:rPr>
-              <w:t xml:space="preserve">Razas y racials</w:t>
+              <w:t xml:space="preserve">Razas y raciales</w:t>
             </w:r>
           </w:p>
         </w:tc>
@@ -31348,7 +31348,7 @@
                 <w:sz w:val="19"/>
                 <w:szCs w:val="19"/>
               </w:rPr>
-              <w:t xml:space="preserve">Credit, classes, tools and news of the home, faction names, the levels that give a talent point</w:t>
+              <w:t xml:space="preserve">Credit (with the game build, shown on the launcher button), classes, tools and news of the home, faction names, the levels that give a talent point</w:t>
             </w:r>
           </w:p>
         </w:tc>
@@ -31784,7 +31784,7 @@
           <w:szCs w:val="18"/>
           <w:shd w:fill="EEF1F6" w:color="auto" w:val="clear"/>
         </w:rPr>
-        <w:t xml:space="preserve">Cache-Control: max-age=3600, private</w:t>
+        <w:t xml:space="preserve">Cache-Control: no-cache, private</w:t>
       </w:r>
       <w:r>
         <w:rPr>
@@ -31869,7 +31869,7 @@
           <w:sz w:val="21"/>
           <w:szCs w:val="21"/>
         </w:rPr>
-        <w:t xml:space="preserve">. The frontend asks for each response once per session.</w:t>
+        <w:t xml:space="preserve">. The browser keeps each response but checks its ETag on every request (304 with no body while unchanged), so players see new data right after a deploy. The frontend asks for each response once per session.</w:t>
       </w:r>
     </w:p>
     <w:p>
@@ -33294,7 +33294,7 @@
                 <w:sz w:val="19"/>
                 <w:szCs w:val="19"/>
               </w:rPr>
-              <w:t xml:space="preserve">1.60.1.70425 (some classes carry later hotfixes; their source line says so)</w:t>
+              <w:t xml:space="preserve">1.60.1.70630, read from the source line of each class (the launcher button shows the first one found)</w:t>
             </w:r>
           </w:p>
         </w:tc>
@@ -35839,7 +35839,7 @@
           <w:sz w:val="21"/>
           <w:szCs w:val="21"/>
         </w:rPr>
-        <w:t xml:space="preserve"> (the game data tests use the real file), start the backend, open every tool as an admin and check the credit line shows the new build. Then commit and push: Render rebuilds the image with the new file. Browsers may keep the previous response up to one hour. Update the content table above and the changelog. To go back, restore the previous file from Git and redeploy.</w:t>
+        <w:t xml:space="preserve"> (the game data tests use the real file), start the backend, open every tool as an admin and check the credit line and the launcher button show the new build. Then commit and push: Render rebuilds the image with the new file. Browsers check the ETag on every request, so players see the new data on their next visit or reload. Update the content table above and the changelog. To go back, restore the previous file from Git and redeploy.</w:t>
       </w:r>
     </w:p>
     <w:p>
@@ -45203,6 +45203,104 @@
                 <w:szCs w:val="19"/>
               </w:rPr>
               <w:t xml:space="preserve">Change</w:t>
+            </w:r>
+          </w:p>
+        </w:tc>
+      </w:tr>
+      <w:tr>
+        <w:trPr>
+          <w:cantSplit/>
+        </w:trPr>
+        <w:tc>
+          <w:tcPr>
+            <w:tcW w:type="dxa" w:w="955"/>
+            <w:tcBorders>
+              <w:top w:val="single" w:color="C9D3E3" w:sz="4"/>
+              <w:left w:val="single" w:color="C9D3E3" w:sz="4"/>
+              <w:bottom w:val="single" w:color="C9D3E3" w:sz="4"/>
+              <w:right w:val="single" w:color="C9D3E3" w:sz="4"/>
+            </w:tcBorders>
+            <w:tcMar>
+              <w:top w:type="dxa" w:w="60"/>
+              <w:left w:type="dxa" w:w="100"/>
+              <w:bottom w:type="dxa" w:w="60"/>
+              <w:right w:type="dxa" w:w="100"/>
+            </w:tcMar>
+          </w:tcPr>
+          <w:p>
+            <w:pPr>
+              <w:spacing w:after="30" w:line="250"/>
+            </w:pPr>
+            <w:r>
+              <w:rPr>
+                <w:rFonts w:ascii="Calibri" w:cs="Calibri" w:eastAsia="Calibri" w:hAnsi="Calibri"/>
+                <w:color w:val="1F2937"/>
+                <w:sz w:val="21"/>
+                <w:szCs w:val="21"/>
+              </w:rPr>
+              <w:t xml:space="preserve">2.2</w:t>
+            </w:r>
+          </w:p>
+        </w:tc>
+        <w:tc>
+          <w:tcPr>
+            <w:tcW w:type="dxa" w:w="1337"/>
+            <w:tcBorders>
+              <w:top w:val="single" w:color="C9D3E3" w:sz="4"/>
+              <w:left w:val="single" w:color="C9D3E3" w:sz="4"/>
+              <w:bottom w:val="single" w:color="C9D3E3" w:sz="4"/>
+              <w:right w:val="single" w:color="C9D3E3" w:sz="4"/>
+            </w:tcBorders>
+            <w:tcMar>
+              <w:top w:type="dxa" w:w="60"/>
+              <w:left w:type="dxa" w:w="100"/>
+              <w:bottom w:type="dxa" w:w="60"/>
+              <w:right w:type="dxa" w:w="100"/>
+            </w:tcMar>
+          </w:tcPr>
+          <w:p>
+            <w:pPr>
+              <w:spacing w:after="30" w:line="250"/>
+            </w:pPr>
+            <w:r>
+              <w:rPr>
+                <w:rFonts w:ascii="Calibri" w:cs="Calibri" w:eastAsia="Calibri" w:hAnsi="Calibri"/>
+                <w:color w:val="1F2937"/>
+                <w:sz w:val="21"/>
+                <w:szCs w:val="21"/>
+              </w:rPr>
+              <w:t xml:space="preserve">2026-10-28</w:t>
+            </w:r>
+          </w:p>
+        </w:tc>
+        <w:tc>
+          <w:tcPr>
+            <w:tcW w:type="dxa" w:w="6308"/>
+            <w:tcBorders>
+              <w:top w:val="single" w:color="C9D3E3" w:sz="4"/>
+              <w:left w:val="single" w:color="C9D3E3" w:sz="4"/>
+              <w:bottom w:val="single" w:color="C9D3E3" w:sz="4"/>
+              <w:right w:val="single" w:color="C9D3E3" w:sz="4"/>
+            </w:tcBorders>
+            <w:tcMar>
+              <w:top w:type="dxa" w:w="60"/>
+              <w:left w:type="dxa" w:w="100"/>
+              <w:bottom w:type="dxa" w:w="60"/>
+              <w:right w:type="dxa" w:w="100"/>
+            </w:tcMar>
+          </w:tcPr>
+          <w:p>
+            <w:pPr>
+              <w:spacing w:after="30" w:line="250"/>
+            </w:pPr>
+            <w:r>
+              <w:rPr>
+                <w:rFonts w:ascii="Calibri" w:cs="Calibri" w:eastAsia="Calibri" w:hAnsi="Calibri"/>
+                <w:color w:val="1F2937"/>
+                <w:sz w:val="21"/>
+                <w:szCs w:val="21"/>
+              </w:rPr>
+              <w:t xml:space="preserve">Game data revalidated on every request (Cache-Control: no-cache with ETag) for WoW Forever and the Pokémon type chart; the WoW launcher button shows the game build instead of JUGAR and cannot be pressed; tool renamed Razas y raciales; game build 1.60.1.70630</w:t>
             </w:r>
           </w:p>
         </w:tc>
@@ -46256,7 +46354,7 @@
         <w:szCs w:val="16"/>
       </w:rPr>
       <w:tab/>
-      <w:t xml:space="preserve">Version 2.1</w:t>
+      <w:t xml:space="preserve">Version 2.2</w:t>
     </w:r>
   </w:p>
 </w:hdr>

</xml_diff>

<commit_message>
feat(wow-forever): launcher news from the Wowhead RSS feed
- Backend: new news feature (GET /api/v1/wow-forever/news). The Wowhead Forever feed is read
  only when someone asks and the copy is older than 5 minutes; concurrent visits share one
  download and the last good news are served when Wowhead fails. Safe XML parsing, Forever
  category only, 15 items, clean summaries. Placeholder news removed from config.json and the index.
- Frontend: news folder in the WoW Forever module (NewsApi, models, Spanish relative and
  absolute dates) and a redesigned news panel: featured item with a 16:9 picture, list with
  thumbnails, links to the article on Wowhead and the source credit. Panel height capped on
  tablet until the small-screen redesign.
- LICENSE credits the Wowhead feed; technical manual 2.3.

Co-Authored-By: Claude Opus 5.5 <noreply@anthropic.com>
</commit_message>
<xml_diff>
--- a/docs/NTG — Technical Manual.docx
+++ b/docs/NTG — Technical Manual.docx
@@ -119,7 +119,7 @@
           <w:sz w:val="22"/>
           <w:szCs w:val="22"/>
         </w:rPr>
-        <w:t xml:space="preserve">Version 2.2  ·  Oct 28, 2026</w:t>
+        <w:t xml:space="preserve">Version 2.3  ·  Oct 29, 2026</w:t>
       </w:r>
     </w:p>
     <w:p>
@@ -30098,7 +30098,7 @@
                 <w:sz w:val="19"/>
                 <w:szCs w:val="19"/>
               </w:rPr>
-              <w:t xml:space="preserve">Texts in Spanish, faction names, tool list, launcher news, talent rules, tree ids of share codes, icon host</w:t>
+              <w:t xml:space="preserve">Texts in Spanish, faction names, tool list, news feed settings, talent rules, tree ids of share codes, icon host</w:t>
             </w:r>
           </w:p>
         </w:tc>
@@ -30518,6 +30518,123 @@
                 <w:szCs w:val="19"/>
               </w:rPr>
               <w:t xml:space="preserve">Nothing to maintain</w:t>
+            </w:r>
+          </w:p>
+        </w:tc>
+      </w:tr>
+      <w:tr>
+        <w:trPr>
+          <w:cantSplit/>
+        </w:trPr>
+        <w:tc>
+          <w:tcPr>
+            <w:tcW w:type="dxa" w:w="3248"/>
+            <w:tcBorders>
+              <w:top w:val="single" w:color="C9D3E3" w:sz="4"/>
+              <w:left w:val="single" w:color="C9D3E3" w:sz="4"/>
+              <w:bottom w:val="single" w:color="C9D3E3" w:sz="4"/>
+              <w:right w:val="single" w:color="C9D3E3" w:sz="4"/>
+            </w:tcBorders>
+            <w:tcMar>
+              <w:top w:type="dxa" w:w="60"/>
+              <w:left w:type="dxa" w:w="100"/>
+              <w:bottom w:type="dxa" w:w="60"/>
+              <w:right w:type="dxa" w:w="100"/>
+            </w:tcMar>
+          </w:tcPr>
+          <w:p>
+            <w:pPr>
+              <w:spacing w:after="30" w:line="250"/>
+            </w:pPr>
+            <w:r>
+              <w:rPr>
+                <w:rFonts w:ascii="Calibri" w:cs="Calibri" w:eastAsia="Calibri" w:hAnsi="Calibri"/>
+                <w:color w:val="1F2937"/>
+                <w:sz w:val="19"/>
+                <w:szCs w:val="19"/>
+              </w:rPr>
+              <w:t xml:space="preserve">Launcher news</w:t>
+            </w:r>
+          </w:p>
+        </w:tc>
+        <w:tc>
+          <w:tcPr>
+            <w:tcW w:type="dxa" w:w="2484"/>
+            <w:tcBorders>
+              <w:top w:val="single" w:color="C9D3E3" w:sz="4"/>
+              <w:left w:val="single" w:color="C9D3E3" w:sz="4"/>
+              <w:bottom w:val="single" w:color="C9D3E3" w:sz="4"/>
+              <w:right w:val="single" w:color="C9D3E3" w:sz="4"/>
+            </w:tcBorders>
+            <w:tcMar>
+              <w:top w:type="dxa" w:w="60"/>
+              <w:left w:type="dxa" w:w="100"/>
+              <w:bottom w:type="dxa" w:w="60"/>
+              <w:right w:type="dxa" w:w="100"/>
+            </w:tcMar>
+          </w:tcPr>
+          <w:p>
+            <w:pPr>
+              <w:spacing w:after="30" w:line="250"/>
+            </w:pPr>
+            <w:r>
+              <w:rPr>
+                <w:rFonts w:ascii="Calibri" w:cs="Calibri" w:eastAsia="Calibri" w:hAnsi="Calibri"/>
+                <w:color w:val="1F2937"/>
+                <w:sz w:val="19"/>
+                <w:szCs w:val="19"/>
+              </w:rPr>
+              <w:t xml:space="preserve">Wowhead RSS feed (news/rss/forever), read by the backend</w:t>
+            </w:r>
+            <w:r>
+              <w:rPr>
+                <w:rFonts w:ascii="Courier New" w:cs="Courier New" w:eastAsia="Courier New" w:hAnsi="Courier New"/>
+                <w:color w:val="1F2937"/>
+                <w:sz w:val="16"/>
+                <w:szCs w:val="16"/>
+                <w:shd w:fill="EEF1F6" w:color="auto" w:val="clear"/>
+              </w:rPr>
+              <w:t xml:space="preserve"/>
+            </w:r>
+            <w:r>
+              <w:rPr>
+                <w:rFonts w:ascii="Calibri" w:cs="Calibri" w:eastAsia="Calibri" w:hAnsi="Calibri"/>
+                <w:color w:val="1F2937"/>
+                <w:sz w:val="19"/>
+                <w:szCs w:val="19"/>
+              </w:rPr>
+              <w:t xml:space="preserve"/>
+            </w:r>
+          </w:p>
+        </w:tc>
+        <w:tc>
+          <w:tcPr>
+            <w:tcW w:type="dxa" w:w="2868"/>
+            <w:tcBorders>
+              <w:top w:val="single" w:color="C9D3E3" w:sz="4"/>
+              <w:left w:val="single" w:color="C9D3E3" w:sz="4"/>
+              <w:bottom w:val="single" w:color="C9D3E3" w:sz="4"/>
+              <w:right w:val="single" w:color="C9D3E3" w:sz="4"/>
+            </w:tcBorders>
+            <w:tcMar>
+              <w:top w:type="dxa" w:w="60"/>
+              <w:left w:type="dxa" w:w="100"/>
+              <w:bottom w:type="dxa" w:w="60"/>
+              <w:right w:type="dxa" w:w="100"/>
+            </w:tcMar>
+          </w:tcPr>
+          <w:p>
+            <w:pPr>
+              <w:spacing w:after="30" w:line="250"/>
+            </w:pPr>
+            <w:r>
+              <w:rPr>
+                <w:rFonts w:ascii="Calibri" w:cs="Calibri" w:eastAsia="Calibri" w:hAnsi="Calibri"/>
+                <w:color w:val="1F2937"/>
+                <w:sz w:val="19"/>
+                <w:szCs w:val="19"/>
+              </w:rPr>
+              <w:t xml:space="preserve">Nothing: new items show up on their own within about five minutes</w:t>
             </w:r>
           </w:p>
         </w:tc>
@@ -30690,7 +30807,7 @@
           <w:sz w:val="17"/>
           <w:szCs w:val="17"/>
         </w:rPr>
-        <w:t xml:space="preserve">└── resources/wow-forever/    data.json · config.json</w:t>
+        <w:t xml:space="preserve">├── features/news/              NewsController, NewsResponses, NewsService, NewsFeedClient, NewsFeedParser</w:t>
       </w:r>
     </w:p>
     <w:p>
@@ -30711,7 +30828,7 @@
           <w:sz w:val="17"/>
           <w:szCs w:val="17"/>
         </w:rPr>
-        <w:t xml:space="preserve"> </w:t>
+        <w:t xml:space="preserve">└── resources/wow-forever/    data.json · config.json</w:t>
       </w:r>
     </w:p>
     <w:p>
@@ -30732,7 +30849,7 @@
           <w:sz w:val="17"/>
           <w:szCs w:val="17"/>
         </w:rPr>
-        <w:t xml:space="preserve">frontend/src/app/games/wow-forever/</w:t>
+        <w:t xml:space="preserve"> </w:t>
       </w:r>
     </w:p>
     <w:p>
@@ -30753,7 +30870,7 @@
           <w:sz w:val="17"/>
           <w:szCs w:val="17"/>
         </w:rPr>
-        <w:t xml:space="preserve">├── wow-forever.game.ts · wow-forever.routes.ts</w:t>
+        <w:t xml:space="preserve">frontend/src/app/games/wow-forever/</w:t>
       </w:r>
     </w:p>
     <w:p>
@@ -30774,7 +30891,7 @@
           <w:sz w:val="17"/>
           <w:szCs w:val="17"/>
         </w:rPr>
-        <w:t xml:space="preserve">├── wow-forever-config.ts     Credit line and broken-icon helper</w:t>
+        <w:t xml:space="preserve">├── wow-forever.game.ts · wow-forever.routes.ts</w:t>
       </w:r>
     </w:p>
     <w:p>
@@ -30795,7 +30912,7 @@
           <w:sz w:val="17"/>
           <w:szCs w:val="17"/>
         </w:rPr>
-        <w:t xml:space="preserve">├── game-data/                GameDataApi (session cache), models, game-images (picture URLs)</w:t>
+        <w:t xml:space="preserve">├── wow-forever-config.ts     Credit line and broken-icon helper</w:t>
       </w:r>
     </w:p>
     <w:p>
@@ -30816,7 +30933,49 @@
           <w:sz w:val="17"/>
           <w:szCs w:val="17"/>
         </w:rPr>
-        <w:t xml:space="preserve">├── home/                     Launcher: home, launcher-header, news-panel</w:t>
+        <w:t xml:space="preserve">├── game-data/                GameDataApi (session cache), models, game-images (picture URLs)</w:t>
+      </w:r>
+    </w:p>
+    <w:p>
+      <w:pPr>
+        <w:keepNext/>
+        <w:keepLines/>
+        <w:pBdr>
+          <w:left w:val="single" w:color="1F6FD1" w:sz="18" w:space="6"/>
+        </w:pBdr>
+        <w:shd w:fill="F3F4F6" w:color="auto" w:val="clear"/>
+        <w:spacing w:after="0" w:before="0" w:line="252"/>
+        <w:ind w:left="840" w:right="60"/>
+      </w:pPr>
+      <w:r>
+        <w:rPr>
+          <w:rFonts w:ascii="Courier New" w:cs="Courier New" w:eastAsia="Courier New" w:hAnsi="Courier New"/>
+          <w:color w:val="1F2937"/>
+          <w:sz w:val="17"/>
+          <w:szCs w:val="17"/>
+        </w:rPr>
+        <w:t xml:space="preserve">├── home/                     Launcher: home, launcher-header</w:t>
+      </w:r>
+    </w:p>
+    <w:p>
+      <w:pPr>
+        <w:keepNext/>
+        <w:keepLines/>
+        <w:pBdr>
+          <w:left w:val="single" w:color="1F6FD1" w:sz="18" w:space="6"/>
+        </w:pBdr>
+        <w:shd w:fill="F3F4F6" w:color="auto" w:val="clear"/>
+        <w:spacing w:after="0" w:before="0" w:line="252"/>
+        <w:ind w:left="840" w:right="60"/>
+      </w:pPr>
+      <w:r>
+        <w:rPr>
+          <w:rFonts w:ascii="Courier New" w:cs="Courier New" w:eastAsia="Courier New" w:hAnsi="Courier New"/>
+          <w:color w:val="1F2937"/>
+          <w:sz w:val="17"/>
+          <w:szCs w:val="17"/>
+        </w:rPr>
+        <w:t xml:space="preserve">├── news/                     NewsApi (no session cache), models, Spanish dates, news-panel</w:t>
       </w:r>
     </w:p>
     <w:p>
@@ -31348,7 +31507,7 @@
                 <w:sz w:val="19"/>
                 <w:szCs w:val="19"/>
               </w:rPr>
-              <w:t xml:space="preserve">Credit (with the game build, shown on the launcher button), classes, tools and news of the home, faction names, the levels that give a talent point</w:t>
+              <w:t xml:space="preserve">Credit (with the game build, shown on the launcher button), classes, tools of the home, faction names, the levels that give a talent point</w:t>
             </w:r>
           </w:p>
         </w:tc>
@@ -31756,6 +31915,133 @@
           </w:p>
         </w:tc>
       </w:tr>
+      <w:tr>
+        <w:trPr>
+          <w:cantSplit/>
+        </w:trPr>
+        <w:tc>
+          <w:tcPr>
+            <w:tcW w:type="dxa" w:w="2866"/>
+            <w:tcBorders>
+              <w:top w:val="single" w:color="C9D3E3" w:sz="4"/>
+              <w:left w:val="single" w:color="C9D3E3" w:sz="4"/>
+              <w:bottom w:val="single" w:color="C9D3E3" w:sz="4"/>
+              <w:right w:val="single" w:color="C9D3E3" w:sz="4"/>
+            </w:tcBorders>
+            <w:shd w:fill="F3F6FC" w:color="auto" w:val="clear"/>
+            <w:tcMar>
+              <w:top w:type="dxa" w:w="60"/>
+              <w:left w:type="dxa" w:w="100"/>
+              <w:bottom w:type="dxa" w:w="60"/>
+              <w:right w:type="dxa" w:w="100"/>
+            </w:tcMar>
+          </w:tcPr>
+          <w:p>
+            <w:pPr>
+              <w:spacing w:after="30" w:line="250"/>
+            </w:pPr>
+            <w:r>
+              <w:rPr>
+                <w:rFonts w:ascii="Courier New" w:cs="Courier New" w:eastAsia="Courier New" w:hAnsi="Courier New"/>
+                <w:color w:val="1F2937"/>
+                <w:sz w:val="16"/>
+                <w:szCs w:val="16"/>
+                <w:shd w:fill="EEF1F6" w:color="auto" w:val="clear"/>
+              </w:rPr>
+              <w:t xml:space="preserve">GET /news</w:t>
+            </w:r>
+          </w:p>
+        </w:tc>
+        <w:tc>
+          <w:tcPr>
+            <w:tcW w:type="dxa" w:w="5734"/>
+            <w:tcBorders>
+              <w:top w:val="single" w:color="C9D3E3" w:sz="4"/>
+              <w:left w:val="single" w:color="C9D3E3" w:sz="4"/>
+              <w:bottom w:val="single" w:color="C9D3E3" w:sz="4"/>
+              <w:right w:val="single" w:color="C9D3E3" w:sz="4"/>
+            </w:tcBorders>
+            <w:shd w:fill="F3F6FC" w:color="auto" w:val="clear"/>
+            <w:tcMar>
+              <w:top w:type="dxa" w:w="60"/>
+              <w:left w:type="dxa" w:w="100"/>
+              <w:bottom w:type="dxa" w:w="60"/>
+              <w:right w:type="dxa" w:w="100"/>
+            </w:tcMar>
+          </w:tcPr>
+          <w:p>
+            <w:pPr>
+              <w:spacing w:after="30" w:line="250"/>
+            </w:pPr>
+            <w:r>
+              <w:rPr>
+                <w:rFonts w:ascii="Calibri" w:cs="Calibri" w:eastAsia="Calibri" w:hAnsi="Calibri"/>
+                <w:color w:val="1F2937"/>
+                <w:sz w:val="19"/>
+                <w:szCs w:val="19"/>
+              </w:rPr>
+              <w:t xml:space="preserve">Latest 15 Forever news of Wowhead (title, summary, publishedAt, image, url) and the credit of the source; no-cache with ETag, not tied to a deploy</w:t>
+            </w:r>
+            <w:r>
+              <w:rPr>
+                <w:rFonts w:ascii="Courier New" w:cs="Courier New" w:eastAsia="Courier New" w:hAnsi="Courier New"/>
+                <w:color w:val="1F2937"/>
+                <w:sz w:val="16"/>
+                <w:szCs w:val="16"/>
+                <w:shd w:fill="EEF1F6" w:color="auto" w:val="clear"/>
+              </w:rPr>
+              <w:t xml:space="preserve"/>
+            </w:r>
+            <w:r>
+              <w:rPr>
+                <w:rFonts w:ascii="Calibri" w:cs="Calibri" w:eastAsia="Calibri" w:hAnsi="Calibri"/>
+                <w:color w:val="1F2937"/>
+                <w:sz w:val="19"/>
+                <w:szCs w:val="19"/>
+              </w:rPr>
+              <w:t xml:space="preserve"/>
+            </w:r>
+            <w:r>
+              <w:rPr>
+                <w:rFonts w:ascii="Courier New" w:cs="Courier New" w:eastAsia="Courier New" w:hAnsi="Courier New"/>
+                <w:color w:val="1F2937"/>
+                <w:sz w:val="16"/>
+                <w:szCs w:val="16"/>
+                <w:shd w:fill="EEF1F6" w:color="auto" w:val="clear"/>
+              </w:rPr>
+              <w:t xml:space="preserve"/>
+            </w:r>
+            <w:r>
+              <w:rPr>
+                <w:rFonts w:ascii="Calibri" w:cs="Calibri" w:eastAsia="Calibri" w:hAnsi="Calibri"/>
+                <w:color w:val="1F2937"/>
+                <w:sz w:val="19"/>
+                <w:szCs w:val="19"/>
+              </w:rPr>
+              <w:t xml:space="preserve"/>
+            </w:r>
+            <w:r>
+              <w:rPr>
+                <w:rFonts w:ascii="Courier New" w:cs="Courier New" w:eastAsia="Courier New" w:hAnsi="Courier New"/>
+                <w:color w:val="1F2937"/>
+                <w:sz w:val="16"/>
+                <w:szCs w:val="16"/>
+                <w:shd w:fill="EEF1F6" w:color="auto" w:val="clear"/>
+              </w:rPr>
+              <w:t xml:space="preserve"/>
+            </w:r>
+            <w:r>
+              <w:rPr>
+                <w:rFonts w:ascii="Calibri" w:cs="Calibri" w:eastAsia="Calibri" w:hAnsi="Calibri"/>
+                <w:color w:val="1F2937"/>
+                <w:sz w:val="19"/>
+                <w:szCs w:val="19"/>
+              </w:rPr>
+              <w:t xml:space="preserve"/>
+            </w:r>
+          </w:p>
+        </w:tc>
+      </w:tr>
     </w:tbl>
     <w:p>
       <w:pPr>
@@ -31870,6 +32156,21 @@
           <w:szCs w:val="21"/>
         </w:rPr>
         <w:t xml:space="preserve">. The browser keeps each response but checks its ETag on every request (304 with no body while unchanged), so players see new data right after a deploy. The frontend asks for each response once per session.</w:t>
+      </w:r>
+    </w:p>
+    <w:p>
+      <w:pPr>
+        <w:spacing w:after="120" w:line="264"/>
+        <w:ind w:left="720"/>
+      </w:pPr>
+      <w:r>
+        <w:rPr>
+          <w:rFonts w:ascii="Calibri" w:cs="Calibri" w:eastAsia="Calibri" w:hAnsi="Calibri"/>
+          <w:color w:val="1F2937"/>
+          <w:sz w:val="21"/>
+          <w:szCs w:val="21"/>
+        </w:rPr>
+        <w:t xml:space="preserve">Launcher news. NewsService reads the RSS feed named in config.json only when someone opens the launcher and its copy is older than refreshMinutes (5): at most one download of about 130 KB per period, none while nobody visits, and visits that arrive during a download share it. It keeps the 15 newest items of the Forever category, strips the markup of the summary and keeps only http and https links; the XML parser accepts no DOCTYPE and loads nothing external. If Wowhead fails or takes more than 3 seconds, the last good news keep being served and Wowhead is not asked again until the period ends (503 only while no read has worked). A new item shows up within about five and a half minutes: the 5 minutes of the copy plus the 30 seconds Wowhead caches its own feed. Pictures load straight from Wowhead, so they cost the site no bandwidth. The panel shows the newest item with a large 16:9 picture and the rest as a list, each with its relative and absolute date in Spanish (Europe/Madrid), and opens the article on Wowhead in a new tab.</w:t>
       </w:r>
     </w:p>
     <w:p>
@@ -34063,7 +34364,7 @@
                 <w:sz w:val="19"/>
                 <w:szCs w:val="19"/>
               </w:rPr>
-              <w:t xml:space="preserve">Launcher news: id, title, optional date and image (today static placeholders)</w:t>
+              <w:t xml:space="preserve">Launcher news feed: feedUrl (Wowhead RSS), category (Forever), limit (15), refreshMinutes (5), source and sourceUrl of the credit</w:t>
             </w:r>
           </w:p>
         </w:tc>
@@ -36369,6 +36670,45 @@
           <w:szCs w:val="21"/>
         </w:rPr>
         <w:t xml:space="preserve"> records the licence of the file.</w:t>
+      </w:r>
+    </w:p>
+    <w:p>
+      <w:pPr>
+        <w:pStyle w:val="ListParagraph"/>
+        <w:numPr>
+          <w:ilvl w:val="0"/>
+          <w:numId w:val="3"/>
+        </w:numPr>
+        <w:spacing w:after="70" w:line="264"/>
+        <w:ind w:left="1080" w:hanging="300"/>
+      </w:pPr>
+      <w:r>
+        <w:rPr>
+          <w:rFonts w:ascii="Calibri" w:cs="Calibri" w:eastAsia="Calibri" w:hAnsi="Calibri"/>
+          <w:color w:val="1F2937"/>
+          <w:sz w:val="21"/>
+          <w:szCs w:val="21"/>
+        </w:rPr>
+        <w:t xml:space="preserve">Keep "Fuente: Wowhead" under the news panel and the link of every item to its article: only titles, summaries, dates and pictures are shown, never the articles. LICENSE records this use.</w:t>
+      </w:r>
+      <w:r>
+        <w:rPr>
+          <w:rFonts w:ascii="Courier New" w:cs="Courier New" w:eastAsia="Courier New" w:hAnsi="Courier New"/>
+          <w:color w:val="1F2937"/>
+          <w:sz w:val="18"/>
+          <w:szCs w:val="18"/>
+          <w:shd w:fill="EEF1F6" w:color="auto" w:val="clear"/>
+        </w:rPr>
+        <w:t xml:space="preserve"/>
+      </w:r>
+      <w:r>
+        <w:rPr>
+          <w:rFonts w:ascii="Calibri" w:cs="Calibri" w:eastAsia="Calibri" w:hAnsi="Calibri"/>
+          <w:color w:val="1F2937"/>
+          <w:sz w:val="21"/>
+          <w:szCs w:val="21"/>
+        </w:rPr>
+        <w:t xml:space="preserve"/>
       </w:r>
     </w:p>
     <w:p>
@@ -45059,7 +45399,7 @@
           <w:sz w:val="21"/>
           <w:szCs w:val="21"/>
         </w:rPr>
-        <w:t xml:space="preserve">Ticked Legacy challenges live in each browser; Dungeons y loot is not built; the launcher news are placeholders.</w:t>
+        <w:t xml:space="preserve">Ticked Legacy challenges live in each browser; Dungeons y loot is not built; the launcher news are in English, as Wowhead publishes them.</w:t>
       </w:r>
     </w:p>
     <w:p>
@@ -45203,6 +45543,104 @@
                 <w:szCs w:val="19"/>
               </w:rPr>
               <w:t xml:space="preserve">Change</w:t>
+            </w:r>
+          </w:p>
+        </w:tc>
+      </w:tr>
+      <w:tr>
+        <w:trPr>
+          <w:cantSplit/>
+        </w:trPr>
+        <w:tc>
+          <w:tcPr>
+            <w:tcW w:type="dxa" w:w="955"/>
+            <w:tcBorders>
+              <w:top w:val="single" w:color="C9D3E3" w:sz="4"/>
+              <w:left w:val="single" w:color="C9D3E3" w:sz="4"/>
+              <w:bottom w:val="single" w:color="C9D3E3" w:sz="4"/>
+              <w:right w:val="single" w:color="C9D3E3" w:sz="4"/>
+            </w:tcBorders>
+            <w:tcMar>
+              <w:top w:type="dxa" w:w="60"/>
+              <w:left w:type="dxa" w:w="100"/>
+              <w:bottom w:type="dxa" w:w="60"/>
+              <w:right w:type="dxa" w:w="100"/>
+            </w:tcMar>
+          </w:tcPr>
+          <w:p>
+            <w:pPr>
+              <w:spacing w:after="30" w:line="250"/>
+            </w:pPr>
+            <w:r>
+              <w:rPr>
+                <w:rFonts w:ascii="Calibri" w:cs="Calibri" w:eastAsia="Calibri" w:hAnsi="Calibri"/>
+                <w:color w:val="1F2937"/>
+                <w:sz w:val="21"/>
+                <w:szCs w:val="21"/>
+              </w:rPr>
+              <w:t xml:space="preserve">2.3</w:t>
+            </w:r>
+          </w:p>
+        </w:tc>
+        <w:tc>
+          <w:tcPr>
+            <w:tcW w:type="dxa" w:w="1337"/>
+            <w:tcBorders>
+              <w:top w:val="single" w:color="C9D3E3" w:sz="4"/>
+              <w:left w:val="single" w:color="C9D3E3" w:sz="4"/>
+              <w:bottom w:val="single" w:color="C9D3E3" w:sz="4"/>
+              <w:right w:val="single" w:color="C9D3E3" w:sz="4"/>
+            </w:tcBorders>
+            <w:tcMar>
+              <w:top w:type="dxa" w:w="60"/>
+              <w:left w:type="dxa" w:w="100"/>
+              <w:bottom w:type="dxa" w:w="60"/>
+              <w:right w:type="dxa" w:w="100"/>
+            </w:tcMar>
+          </w:tcPr>
+          <w:p>
+            <w:pPr>
+              <w:spacing w:after="30" w:line="250"/>
+            </w:pPr>
+            <w:r>
+              <w:rPr>
+                <w:rFonts w:ascii="Calibri" w:cs="Calibri" w:eastAsia="Calibri" w:hAnsi="Calibri"/>
+                <w:color w:val="1F2937"/>
+                <w:sz w:val="21"/>
+                <w:szCs w:val="21"/>
+              </w:rPr>
+              <w:t xml:space="preserve">2026-10-29</w:t>
+            </w:r>
+          </w:p>
+        </w:tc>
+        <w:tc>
+          <w:tcPr>
+            <w:tcW w:type="dxa" w:w="6308"/>
+            <w:tcBorders>
+              <w:top w:val="single" w:color="C9D3E3" w:sz="4"/>
+              <w:left w:val="single" w:color="C9D3E3" w:sz="4"/>
+              <w:bottom w:val="single" w:color="C9D3E3" w:sz="4"/>
+              <w:right w:val="single" w:color="C9D3E3" w:sz="4"/>
+            </w:tcBorders>
+            <w:tcMar>
+              <w:top w:type="dxa" w:w="60"/>
+              <w:left w:type="dxa" w:w="100"/>
+              <w:bottom w:type="dxa" w:w="60"/>
+              <w:right w:type="dxa" w:w="100"/>
+            </w:tcMar>
+          </w:tcPr>
+          <w:p>
+            <w:pPr>
+              <w:spacing w:after="30" w:line="250"/>
+            </w:pPr>
+            <w:r>
+              <w:rPr>
+                <w:rFonts w:ascii="Calibri" w:cs="Calibri" w:eastAsia="Calibri" w:hAnsi="Calibri"/>
+                <w:color w:val="1F2937"/>
+                <w:sz w:val="21"/>
+                <w:szCs w:val="21"/>
+              </w:rPr>
+              <w:t xml:space="preserve">WoW Forever launcher news from the Wowhead RSS feed (GET /wow-forever/news: on-demand copy of 5 minutes, last good news when Wowhead fails), news panel redesigned with relative and absolute dates in Spanish, placeholder news removed from config.json, LICENSE credits Wowhead</w:t>
             </w:r>
           </w:p>
         </w:tc>
@@ -46354,7 +46792,7 @@
         <w:szCs w:val="16"/>
       </w:rPr>
       <w:tab/>
-      <w:t xml:space="preserve">Version 2.2</w:t>
+      <w:t xml:space="preserve">Version 2.3</w:t>
     </w:r>
   </w:p>
 </w:hdr>

</xml_diff>

<commit_message>
feat(wow-forever): launcher redesigned for small screens
- Desktop: "Versión del juego" shows the build as text and the large button switches the
  faction background, reading the faction it switches to.
- Below the tablet breakpoint: shorter header with the NTG button centred above the rivets,
  no faction background or switch, news on top with their own scroll, build and tools in the
  thumb zone (three columns on tablets, two on phones) and the legal notice below the fold.
  The launcher scrolls inside itself because html and body never scroll.
- WowButton: block variant that fills its cell below the tablet breakpoint, and an
  accessible label.
- Technical manual 2.3: launcher layout and responsive pattern.

Co-Authored-By: Claude Opus 5.5 <noreply@anthropic.com>
</commit_message>
<xml_diff>
--- a/docs/NTG — Technical Manual.docx
+++ b/docs/NTG — Technical Manual.docx
@@ -15916,6 +15916,73 @@
               <w:bottom w:val="single" w:color="C9D3E3" w:sz="4"/>
               <w:right w:val="single" w:color="C9D3E3" w:sz="4"/>
             </w:tcBorders>
+            <w:tcMar>
+              <w:top w:type="dxa" w:w="60"/>
+              <w:left w:type="dxa" w:w="100"/>
+              <w:bottom w:type="dxa" w:w="60"/>
+              <w:right w:type="dxa" w:w="100"/>
+            </w:tcMar>
+          </w:tcPr>
+          <w:p>
+            <w:pPr>
+              <w:spacing w:after="30" w:line="250"/>
+            </w:pPr>
+            <w:r>
+              <w:rPr>
+                <w:rFonts w:ascii="Calibri" w:cs="Calibri" w:eastAsia="Calibri" w:hAnsi="Calibri"/>
+                <w:color w:val="1F2937"/>
+                <w:sz w:val="19"/>
+                <w:szCs w:val="19"/>
+              </w:rPr>
+              <w:t xml:space="preserve">News on top with their own scroll, build and tools in the thumb zone below, legal notice below the fold; faction background and its button on desktop only</w:t>
+            </w:r>
+          </w:p>
+        </w:tc>
+        <w:tc>
+          <w:tcPr>
+            <w:tcW w:type="dxa" w:w="2747"/>
+            <w:tcBorders>
+              <w:top w:val="single" w:color="C9D3E3" w:sz="4"/>
+              <w:left w:val="single" w:color="C9D3E3" w:sz="4"/>
+              <w:bottom w:val="single" w:color="C9D3E3" w:sz="4"/>
+              <w:right w:val="single" w:color="C9D3E3" w:sz="4"/>
+            </w:tcBorders>
+            <w:tcMar>
+              <w:top w:type="dxa" w:w="60"/>
+              <w:left w:type="dxa" w:w="100"/>
+              <w:bottom w:type="dxa" w:w="60"/>
+              <w:right w:type="dxa" w:w="100"/>
+            </w:tcMar>
+          </w:tcPr>
+          <w:p>
+            <w:pPr>
+              <w:spacing w:after="30" w:line="250"/>
+            </w:pPr>
+            <w:r>
+              <w:rPr>
+                <w:rFonts w:ascii="Calibri" w:cs="Calibri" w:eastAsia="Calibri" w:hAnsi="Calibri"/>
+                <w:color w:val="1F2937"/>
+                <w:sz w:val="19"/>
+                <w:szCs w:val="19"/>
+              </w:rPr>
+              <w:t xml:space="preserve">WoW Forever launcher</w:t>
+            </w:r>
+          </w:p>
+        </w:tc>
+      </w:tr>
+      <w:tr>
+        <w:trPr>
+          <w:cantSplit/>
+        </w:trPr>
+        <w:tc>
+          <w:tcPr>
+            <w:tcW w:type="dxa" w:w="5493"/>
+            <w:tcBorders>
+              <w:top w:val="single" w:color="C9D3E3" w:sz="4"/>
+              <w:left w:val="single" w:color="C9D3E3" w:sz="4"/>
+              <w:bottom w:val="single" w:color="C9D3E3" w:sz="4"/>
+              <w:right w:val="single" w:color="C9D3E3" w:sz="4"/>
+            </w:tcBorders>
             <w:shd w:fill="F3F6FC" w:color="auto" w:val="clear"/>
             <w:tcMar>
               <w:top w:type="dxa" w:w="60"/>
@@ -31507,7 +31574,7 @@
                 <w:sz w:val="19"/>
                 <w:szCs w:val="19"/>
               </w:rPr>
-              <w:t xml:space="preserve">Credit (with the game build, shown on the launcher button), classes, tools of the home, faction names, the levels that give a talent point</w:t>
+              <w:t xml:space="preserve">Credit (with the game build, shown as Versión del juego on the launcher), classes, tools of the home, faction names, the levels that give a talent point</w:t>
             </w:r>
           </w:p>
         </w:tc>
@@ -32171,6 +32238,21 @@
           <w:szCs w:val="21"/>
         </w:rPr>
         <w:t xml:space="preserve">Launcher news. NewsService reads the RSS feed named in config.json only when someone opens the launcher and its copy is older than refreshMinutes (5): at most one download of about 130 KB per period, none while nobody visits, and visits that arrive during a download share it. It keeps the 15 newest items of the Forever category, strips the markup of the summary and keeps only http and https links; the XML parser accepts no DOCTYPE and loads nothing external. If Wowhead fails or takes more than 3 seconds, the last good news keep being served and Wowhead is not asked again until the period ends (503 only while no read has worked). A new item shows up within about five and a half minutes: the 5 minutes of the copy plus the 30 seconds Wowhead caches its own feed. Pictures load straight from Wowhead, so they cost the site no bandwidth. The panel shows the newest item with a large 16:9 picture and the rest as a list, each with its relative and absolute date in Spanish (Europe/Madrid), and opens the article on Wowhead in a new tab.</w:t>
+      </w:r>
+    </w:p>
+    <w:p>
+      <w:pPr>
+        <w:spacing w:after="120" w:line="264"/>
+        <w:ind w:left="720"/>
+      </w:pPr>
+      <w:r>
+        <w:rPr>
+          <w:rFonts w:ascii="Calibri" w:cs="Calibri" w:eastAsia="Calibri" w:hAnsi="Calibri"/>
+          <w:color w:val="1F2937"/>
+          <w:sz w:val="21"/>
+          <w:szCs w:val="21"/>
+        </w:rPr>
+        <w:t xml:space="preserve">Launcher. On desktop the bottom bar shows Versión del juego with the build, the tools and a large button that switches the faction background; it reads the faction it switches to. Below the tablet breakpoint the background and that button are hidden and the header is shorter: the news fill the screen with their own scroll, the build and the tools sit at the bottom (three columns on tablets, two on phones, long names on two lines) and the legal notice stays below the fold. html and body never scroll in this app, so the launcher scrolls inside itself, and reaching the end of the news carries on to the page.</w:t>
       </w:r>
     </w:p>
     <w:p>
@@ -33595,7 +33677,7 @@
                 <w:sz w:val="19"/>
                 <w:szCs w:val="19"/>
               </w:rPr>
-              <w:t xml:space="preserve">1.60.1.70630, read from the source line of each class (the launcher button shows the first one found)</w:t>
+              <w:t xml:space="preserve">1.60.1.70630, read from the source line of each class (the launcher shows the first one found under Versión del juego)</w:t>
             </w:r>
           </w:p>
         </w:tc>
@@ -35176,7 +35258,7 @@
                 <w:sz w:val="19"/>
                 <w:szCs w:val="19"/>
               </w:rPr>
-              <w:t xml:space="preserve">Launcher background, switched by the faction selector</w:t>
+              <w:t xml:space="preserve">Launcher background, desktop only, switched by the large launcher button</w:t>
             </w:r>
           </w:p>
         </w:tc>
@@ -36140,7 +36222,7 @@
           <w:sz w:val="21"/>
           <w:szCs w:val="21"/>
         </w:rPr>
-        <w:t xml:space="preserve"> (the game data tests use the real file), start the backend, open every tool as an admin and check the credit line and the launcher button show the new build. Then commit and push: Render rebuilds the image with the new file. Browsers check the ETag on every request, so players see the new data on their next visit or reload. Update the content table above and the changelog. To go back, restore the previous file from Git and redeploy.</w:t>
+        <w:t xml:space="preserve"> (the game data tests use the real file), start the backend, open every tool as an admin and check the credit line and Versión del juego on the launcher show the new build. Then commit and push: Render rebuilds the image with the new file. Browsers check the ETag on every request, so players see the new data on their next visit or reload. Update the content table above and the changelog. To go back, restore the previous file from Git and redeploy.</w:t>
       </w:r>
     </w:p>
     <w:p>
@@ -45640,7 +45722,7 @@
                 <w:sz w:val="21"/>
                 <w:szCs w:val="21"/>
               </w:rPr>
-              <w:t xml:space="preserve">WoW Forever launcher news from the Wowhead RSS feed (GET /wow-forever/news: on-demand copy of 5 minutes, last good news when Wowhead fails), news panel redesigned with relative and absolute dates in Spanish, placeholder news removed from config.json, LICENSE credits Wowhead</w:t>
+              <w:t xml:space="preserve">WoW Forever launcher news from the Wowhead RSS feed (GET /wow-forever/news: on-demand copy of 5 minutes, last good news when Wowhead fails), news panel redesigned with relative and absolute dates in Spanish, placeholder news removed from config.json, LICENSE credits Wowhead; launcher redesigned: the build shown as Versión del juego, the large button switches the faction background (desktop only), and small screens put the news on top, the tools at the bottom and the legal notice below the fold</w:t>
             </w:r>
           </w:p>
         </w:tc>

</xml_diff>

<commit_message>
feat(wow-forever): talent calculator fixes and common navigation menu
- Talent calculator: "Nivel necesario" next to the point counters (10 with no points), and
  counters centred on small screens with the required level on its own line.
- The hint no longer moves when a talent tooltip opens: the tooltip host takes no room.
- No browser tooltip with the page title: the WowPage input is renamed heading.
- Common WowNavMenu: below the tablet breakpoint the way back to the launcher and NTG moves
  into a menu at the left of the header (WowPage compactNav, only the calculator so far).
- Launcher logo centred above the rivets.
- Technical manual 2.4.

Co-Authored-By: Claude Opus 5.5 <noreply@anthropic.com>
</commit_message>
<xml_diff>
--- a/docs/NTG — Technical Manual.docx
+++ b/docs/NTG — Technical Manual.docx
@@ -119,7 +119,7 @@
           <w:sz w:val="22"/>
           <w:szCs w:val="22"/>
         </w:rPr>
-        <w:t xml:space="preserve">Version 2.3  ·  Oct 29, 2026</w:t>
+        <w:t xml:space="preserve">Version 2.4  ·  Oct 29, 2026</w:t>
       </w:r>
     </w:p>
     <w:p>
@@ -15849,6 +15849,75 @@
               <w:bottom w:val="single" w:color="C9D3E3" w:sz="4"/>
               <w:right w:val="single" w:color="C9D3E3" w:sz="4"/>
             </w:tcBorders>
+            <w:shd w:fill="F3F6FC" w:color="auto" w:val="clear"/>
+            <w:tcMar>
+              <w:top w:type="dxa" w:w="60"/>
+              <w:left w:type="dxa" w:w="100"/>
+              <w:bottom w:type="dxa" w:w="60"/>
+              <w:right w:type="dxa" w:w="100"/>
+            </w:tcMar>
+          </w:tcPr>
+          <w:p>
+            <w:pPr>
+              <w:spacing w:after="30" w:line="250"/>
+            </w:pPr>
+            <w:r>
+              <w:rPr>
+                <w:rFonts w:ascii="Calibri" w:cs="Calibri" w:eastAsia="Calibri" w:hAnsi="Calibri"/>
+                <w:color w:val="1F2937"/>
+                <w:sz w:val="19"/>
+                <w:szCs w:val="19"/>
+              </w:rPr>
+              <w:t xml:space="preserve">Way back to the launcher and to NTG in a menu at the left of the header (WowPage compactNav; only the talent calculator uses it so far)</w:t>
+            </w:r>
+          </w:p>
+        </w:tc>
+        <w:tc>
+          <w:tcPr>
+            <w:tcW w:type="dxa" w:w="2747"/>
+            <w:tcBorders>
+              <w:top w:val="single" w:color="C9D3E3" w:sz="4"/>
+              <w:left w:val="single" w:color="C9D3E3" w:sz="4"/>
+              <w:bottom w:val="single" w:color="C9D3E3" w:sz="4"/>
+              <w:right w:val="single" w:color="C9D3E3" w:sz="4"/>
+            </w:tcBorders>
+            <w:shd w:fill="F3F6FC" w:color="auto" w:val="clear"/>
+            <w:tcMar>
+              <w:top w:type="dxa" w:w="60"/>
+              <w:left w:type="dxa" w:w="100"/>
+              <w:bottom w:type="dxa" w:w="60"/>
+              <w:right w:type="dxa" w:w="100"/>
+            </w:tcMar>
+          </w:tcPr>
+          <w:p>
+            <w:pPr>
+              <w:spacing w:after="30" w:line="250"/>
+            </w:pPr>
+            <w:r>
+              <w:rPr>
+                <w:rFonts w:ascii="Calibri" w:cs="Calibri" w:eastAsia="Calibri" w:hAnsi="Calibri"/>
+                <w:color w:val="1F2937"/>
+                <w:sz w:val="19"/>
+                <w:szCs w:val="19"/>
+              </w:rPr>
+              <w:t xml:space="preserve">WoW talent calculator</w:t>
+            </w:r>
+          </w:p>
+        </w:tc>
+      </w:tr>
+      <w:tr>
+        <w:trPr>
+          <w:cantSplit/>
+        </w:trPr>
+        <w:tc>
+          <w:tcPr>
+            <w:tcW w:type="dxa" w:w="5493"/>
+            <w:tcBorders>
+              <w:top w:val="single" w:color="C9D3E3" w:sz="4"/>
+              <w:left w:val="single" w:color="C9D3E3" w:sz="4"/>
+              <w:bottom w:val="single" w:color="C9D3E3" w:sz="4"/>
+              <w:right w:val="single" w:color="C9D3E3" w:sz="4"/>
+            </w:tcBorders>
             <w:tcMar>
               <w:top w:type="dxa" w:w="60"/>
               <w:left w:type="dxa" w:w="100"/>
@@ -31105,7 +31174,7 @@
           <w:sz w:val="17"/>
           <w:szCs w:val="17"/>
         </w:rPr>
-        <w:t xml:space="preserve">├── ui/                       wow-page, class-picker, wow-button, wow-frame, legal-notice</w:t>
+        <w:t xml:space="preserve">├── ui/                       wow-page, wow-nav-menu, class-picker, wow-button, wow-frame, legal-notice</w:t>
       </w:r>
     </w:p>
     <w:p>
@@ -34816,7 +34885,7 @@
           <w:sz w:val="21"/>
           <w:szCs w:val="21"/>
         </w:rPr>
-        <w:t xml:space="preserve">Click adds a point; right click, a long press (450 ms) or Backspace/Delete removes one if the rest of the build stays valid. The level cannot go below what the spent points need.</w:t>
+        <w:t xml:space="preserve">Click adds a point; right click, a long press (450 ms) or Backspace/Delete removes one if the rest of the build stays valid. The level cannot go below what the spent points need; Nivel necesario, next to the point counters, shows that level (10 with no points).</w:t>
       </w:r>
     </w:p>
     <w:p>
@@ -45625,6 +45694,104 @@
                 <w:szCs w:val="19"/>
               </w:rPr>
               <w:t xml:space="preserve">Change</w:t>
+            </w:r>
+          </w:p>
+        </w:tc>
+      </w:tr>
+      <w:tr>
+        <w:trPr>
+          <w:cantSplit/>
+        </w:trPr>
+        <w:tc>
+          <w:tcPr>
+            <w:tcW w:type="dxa" w:w="955"/>
+            <w:tcBorders>
+              <w:top w:val="single" w:color="C9D3E3" w:sz="4"/>
+              <w:left w:val="single" w:color="C9D3E3" w:sz="4"/>
+              <w:bottom w:val="single" w:color="C9D3E3" w:sz="4"/>
+              <w:right w:val="single" w:color="C9D3E3" w:sz="4"/>
+            </w:tcBorders>
+            <w:tcMar>
+              <w:top w:type="dxa" w:w="60"/>
+              <w:left w:type="dxa" w:w="100"/>
+              <w:bottom w:type="dxa" w:w="60"/>
+              <w:right w:type="dxa" w:w="100"/>
+            </w:tcMar>
+          </w:tcPr>
+          <w:p>
+            <w:pPr>
+              <w:spacing w:after="30" w:line="250"/>
+            </w:pPr>
+            <w:r>
+              <w:rPr>
+                <w:rFonts w:ascii="Calibri" w:cs="Calibri" w:eastAsia="Calibri" w:hAnsi="Calibri"/>
+                <w:color w:val="1F2937"/>
+                <w:sz w:val="21"/>
+                <w:szCs w:val="21"/>
+              </w:rPr>
+              <w:t xml:space="preserve">2.4</w:t>
+            </w:r>
+          </w:p>
+        </w:tc>
+        <w:tc>
+          <w:tcPr>
+            <w:tcW w:type="dxa" w:w="1337"/>
+            <w:tcBorders>
+              <w:top w:val="single" w:color="C9D3E3" w:sz="4"/>
+              <w:left w:val="single" w:color="C9D3E3" w:sz="4"/>
+              <w:bottom w:val="single" w:color="C9D3E3" w:sz="4"/>
+              <w:right w:val="single" w:color="C9D3E3" w:sz="4"/>
+            </w:tcBorders>
+            <w:tcMar>
+              <w:top w:type="dxa" w:w="60"/>
+              <w:left w:type="dxa" w:w="100"/>
+              <w:bottom w:type="dxa" w:w="60"/>
+              <w:right w:type="dxa" w:w="100"/>
+            </w:tcMar>
+          </w:tcPr>
+          <w:p>
+            <w:pPr>
+              <w:spacing w:after="30" w:line="250"/>
+            </w:pPr>
+            <w:r>
+              <w:rPr>
+                <w:rFonts w:ascii="Calibri" w:cs="Calibri" w:eastAsia="Calibri" w:hAnsi="Calibri"/>
+                <w:color w:val="1F2937"/>
+                <w:sz w:val="21"/>
+                <w:szCs w:val="21"/>
+              </w:rPr>
+              <w:t xml:space="preserve">2026-10-29</w:t>
+            </w:r>
+          </w:p>
+        </w:tc>
+        <w:tc>
+          <w:tcPr>
+            <w:tcW w:type="dxa" w:w="6308"/>
+            <w:tcBorders>
+              <w:top w:val="single" w:color="C9D3E3" w:sz="4"/>
+              <w:left w:val="single" w:color="C9D3E3" w:sz="4"/>
+              <w:bottom w:val="single" w:color="C9D3E3" w:sz="4"/>
+              <w:right w:val="single" w:color="C9D3E3" w:sz="4"/>
+            </w:tcBorders>
+            <w:tcMar>
+              <w:top w:type="dxa" w:w="60"/>
+              <w:left w:type="dxa" w:w="100"/>
+              <w:bottom w:type="dxa" w:w="60"/>
+              <w:right w:type="dxa" w:w="100"/>
+            </w:tcMar>
+          </w:tcPr>
+          <w:p>
+            <w:pPr>
+              <w:spacing w:after="30" w:line="250"/>
+            </w:pPr>
+            <w:r>
+              <w:rPr>
+                <w:rFonts w:ascii="Calibri" w:cs="Calibri" w:eastAsia="Calibri" w:hAnsi="Calibri"/>
+                <w:color w:val="1F2937"/>
+                <w:sz w:val="21"/>
+                <w:szCs w:val="21"/>
+              </w:rPr>
+              <w:t xml:space="preserve">WoW Forever talent calculator: Nivel necesario next to the point counters, counters centred on small screens, the way back to the launcher and NTG in a common menu below the tablet breakpoint (WowPage compactNav, only the calculator so far), the hint no longer moves when a tooltip opens and the browser no longer shows the page title as a tooltip (WowPage input renamed heading); launcher logo centred above the rivets</w:t>
             </w:r>
           </w:p>
         </w:tc>
@@ -46874,7 +47041,7 @@
         <w:szCs w:val="16"/>
       </w:rPr>
       <w:tab/>
-      <w:t xml:space="preserve">Version 2.3</w:t>
+      <w:t xml:space="preserve">Version 2.4</w:t>
     </w:r>
   </w:p>
 </w:hdr>

</xml_diff>

<commit_message>
docs(wow-forever): game data read from the game client (manual 2.5, README, LICENSE)
Co-Authored-By: Claude Opus 5.5 <noreply@anthropic.com>
</commit_message>
<xml_diff>
--- a/docs/NTG — Technical Manual.docx
+++ b/docs/NTG — Technical Manual.docx
@@ -119,7 +119,7 @@
           <w:sz w:val="22"/>
           <w:szCs w:val="22"/>
         </w:rPr>
-        <w:t xml:space="preserve">Version 2.4  ·  Oct 29, 2026</w:t>
+        <w:t xml:space="preserve">Version 2.5  ·  Oct 29, 2026</w:t>
       </w:r>
     </w:p>
     <w:p>
@@ -1306,7 +1306,7 @@
         <w:r>
           <w:t>8.5</w:t>
           <w:tab/>
-          <w:t xml:space="preserve">The data file (data.json)</w:t>
+          <w:t xml:space="preserve">The game data (from the game client)</w:t>
           <w:tab/>
           <w:fldChar w:fldCharType="begin"/>
           <w:instrText xml:space="preserve"> PAGEREF sec_wow_data \h </w:instrText>
@@ -1394,7 +1394,7 @@
         <w:r>
           <w:t>8.9</w:t>
           <w:tab/>
-          <w:t xml:space="preserve">Updating the game data</w:t>
+          <w:t xml:space="preserve">How the game data stays up to date</w:t>
           <w:tab/>
           <w:fldChar w:fldCharType="begin"/>
           <w:instrText xml:space="preserve"> PAGEREF sec_wow_update \h </w:instrText>
@@ -2619,8 +2619,31 @@
                 <w:sz w:val="19"/>
                 <w:szCs w:val="19"/>
               </w:rPr>
-              <w:t xml:space="preserve">Module </w:t>
-            </w:r>
+              <w:t xml:space="preserve">Module games/wow-forever, no tables; one private bucket for its data</w:t>
+            </w:r>
+          </w:p>
+        </w:tc>
+        <w:tc>
+          <w:tcPr>
+            <w:tcW w:type="dxa" w:w="1376"/>
+            <w:tcBorders>
+              <w:top w:val="single" w:color="C9D3E3" w:sz="4"/>
+              <w:left w:val="single" w:color="C9D3E3" w:sz="4"/>
+              <w:bottom w:val="single" w:color="C9D3E3" w:sz="4"/>
+              <w:right w:val="single" w:color="C9D3E3" w:sz="4"/>
+            </w:tcBorders>
+            <w:shd w:fill="F3F6FC" w:color="auto" w:val="clear"/>
+            <w:tcMar>
+              <w:top w:type="dxa" w:w="60"/>
+              <w:left w:type="dxa" w:w="100"/>
+              <w:bottom w:type="dxa" w:w="60"/>
+              <w:right w:type="dxa" w:w="100"/>
+            </w:tcMar>
+          </w:tcPr>
+          <w:p>
+            <w:pPr>
+              <w:spacing w:after="30" w:line="250"/>
+            </w:pPr>
             <w:r>
               <w:rPr>
                 <w:rFonts w:ascii="Courier New" w:cs="Courier New" w:eastAsia="Courier New" w:hAnsi="Courier New"/>
@@ -2631,20 +2654,11 @@
               </w:rPr>
               <w:t xml:space="preserve">games/wow-forever</w:t>
             </w:r>
-            <w:r>
-              <w:rPr>
-                <w:rFonts w:ascii="Calibri" w:cs="Calibri" w:eastAsia="Calibri" w:hAnsi="Calibri"/>
-                <w:color w:val="1F2937"/>
-                <w:sz w:val="19"/>
-                <w:szCs w:val="19"/>
-              </w:rPr>
-              <w:t xml:space="preserve">, no tables</w:t>
-            </w:r>
-          </w:p>
-        </w:tc>
-        <w:tc>
-          <w:tcPr>
-            <w:tcW w:type="dxa" w:w="1376"/>
+          </w:p>
+        </w:tc>
+        <w:tc>
+          <w:tcPr>
+            <w:tcW w:type="dxa" w:w="3612"/>
             <w:tcBorders>
               <w:top w:val="single" w:color="C9D3E3" w:sz="4"/>
               <w:left w:val="single" w:color="C9D3E3" w:sz="4"/>
@@ -2665,58 +2679,13 @@
             </w:pPr>
             <w:r>
               <w:rPr>
-                <w:rFonts w:ascii="Courier New" w:cs="Courier New" w:eastAsia="Courier New" w:hAnsi="Courier New"/>
-                <w:color w:val="1F2937"/>
-                <w:sz w:val="16"/>
-                <w:szCs w:val="16"/>
-                <w:shd w:fill="EEF1F6" w:color="auto" w:val="clear"/>
-              </w:rPr>
-              <w:t xml:space="preserve">games/wow-forever</w:t>
-            </w:r>
-          </w:p>
-        </w:tc>
-        <w:tc>
-          <w:tcPr>
-            <w:tcW w:type="dxa" w:w="3612"/>
-            <w:tcBorders>
-              <w:top w:val="single" w:color="C9D3E3" w:sz="4"/>
-              <w:left w:val="single" w:color="C9D3E3" w:sz="4"/>
-              <w:bottom w:val="single" w:color="C9D3E3" w:sz="4"/>
-              <w:right w:val="single" w:color="C9D3E3" w:sz="4"/>
-            </w:tcBorders>
-            <w:shd w:fill="F3F6FC" w:color="auto" w:val="clear"/>
-            <w:tcMar>
-              <w:top w:type="dxa" w:w="60"/>
-              <w:left w:type="dxa" w:w="100"/>
-              <w:bottom w:type="dxa" w:w="60"/>
-              <w:right w:type="dxa" w:w="100"/>
-            </w:tcMar>
-          </w:tcPr>
-          <w:p>
-            <w:pPr>
-              <w:spacing w:after="30" w:line="250"/>
-            </w:pPr>
-            <w:r>
-              <w:rPr>
-                <w:rFonts w:ascii="Calibri" w:cs="Calibri" w:eastAsia="Calibri" w:hAnsi="Calibri"/>
-                <w:color w:val="1F2937"/>
-                <w:sz w:val="19"/>
-                <w:szCs w:val="19"/>
-              </w:rPr>
-              <w:t xml:space="preserve">Talent calculator, spellbook, Legacy System, races and racials, from a data file. See </w:t>
-            </w:r>
-            <w:hyperlink w:history="1" w:anchor="ch_wow">
-              <w:r>
-                <w:rPr>
-                  <w:rFonts w:ascii="Calibri" w:cs="Calibri" w:eastAsia="Calibri" w:hAnsi="Calibri"/>
-                  <w:color w:val="1F6FD1"/>
-                  <w:sz w:val="19"/>
-                  <w:szCs w:val="19"/>
-                  <w:u w:val="single"/>
-                </w:rPr>
-                <w:t xml:space="preserve">chapter 8</w:t>
-              </w:r>
-            </w:hyperlink>
+                <w:rFonts w:ascii="Calibri" w:cs="Calibri" w:eastAsia="Calibri" w:hAnsi="Calibri"/>
+                <w:color w:val="1F2937"/>
+                <w:sz w:val="19"/>
+                <w:szCs w:val="19"/>
+              </w:rPr>
+              <w:t xml:space="preserve">Talent calculator, spellbook, Legacy System, races and racials, read from the game client on every new build. See chapter 8</w:t>
+            </w:r>
           </w:p>
         </w:tc>
       </w:tr>
@@ -3606,7 +3575,7 @@
                 <w:sz w:val="19"/>
                 <w:szCs w:val="19"/>
               </w:rPr>
-              <w:t xml:space="preserve">Everything about WoW Forever: data files, endpoints, tools, pictures, updating the data</w:t>
+              <w:t xml:space="preserve">Everything about WoW Forever: game data, endpoints, tools, pictures, how the data stays up to date</w:t>
             </w:r>
           </w:p>
         </w:tc>
@@ -4737,7 +4706,7 @@
                 <w:sz w:val="19"/>
                 <w:szCs w:val="19"/>
               </w:rPr>
-              <w:t xml:space="preserve">Public pictures (covers, game artwork) and private ones (Pokémon teams)</w:t>
+              <w:t xml:space="preserve">Public pictures (covers, game artwork) and private files (Pokémon teams, WoW Forever game data)</w:t>
             </w:r>
           </w:p>
         </w:tc>
@@ -5177,7 +5146,7 @@
           <w:sz w:val="17"/>
           <w:szCs w:val="17"/>
         </w:rPr>
-        <w:t xml:space="preserve">│   ├── games/wow-forever/        WoW Forever (data.json, config.json)</w:t>
+        <w:t xml:space="preserve">│   ├── games/wow-forever/        WoW Forever (config.json, sql/wow-forever.sql)</w:t>
       </w:r>
     </w:p>
     <w:p>
@@ -19570,6 +19539,140 @@
           </w:p>
         </w:tc>
       </w:tr>
+      <w:tr>
+        <w:trPr>
+          <w:cantSplit/>
+        </w:trPr>
+        <w:tc>
+          <w:tcPr>
+            <w:tcW w:type="dxa" w:w="1528"/>
+            <w:tcBorders>
+              <w:top w:val="single" w:color="C9D3E3" w:sz="4"/>
+              <w:left w:val="single" w:color="C9D3E3" w:sz="4"/>
+              <w:bottom w:val="single" w:color="C9D3E3" w:sz="4"/>
+              <w:right w:val="single" w:color="C9D3E3" w:sz="4"/>
+            </w:tcBorders>
+            <w:shd w:fill="F3F6FC" w:color="auto" w:val="clear"/>
+            <w:tcMar>
+              <w:top w:type="dxa" w:w="60"/>
+              <w:left w:type="dxa" w:w="100"/>
+              <w:bottom w:type="dxa" w:w="60"/>
+              <w:right w:type="dxa" w:w="100"/>
+            </w:tcMar>
+          </w:tcPr>
+          <w:p>
+            <w:pPr>
+              <w:spacing w:after="30" w:line="250"/>
+            </w:pPr>
+            <w:r>
+              <w:rPr>
+                <w:rFonts w:ascii="Courier New" w:cs="Courier New" w:eastAsia="Courier New" w:hAnsi="Courier New"/>
+                <w:color w:val="1F2937"/>
+                <w:sz w:val="16"/>
+                <w:szCs w:val="16"/>
+                <w:shd w:fill="EEF1F6" w:color="auto" w:val="clear"/>
+              </w:rPr>
+              <w:t xml:space="preserve">wow-forever-data</w:t>
+            </w:r>
+          </w:p>
+        </w:tc>
+        <w:tc>
+          <w:tcPr>
+            <w:tcW w:type="dxa" w:w="2675"/>
+            <w:tcBorders>
+              <w:top w:val="single" w:color="C9D3E3" w:sz="4"/>
+              <w:left w:val="single" w:color="C9D3E3" w:sz="4"/>
+              <w:bottom w:val="single" w:color="C9D3E3" w:sz="4"/>
+              <w:right w:val="single" w:color="C9D3E3" w:sz="4"/>
+            </w:tcBorders>
+            <w:shd w:fill="F3F6FC" w:color="auto" w:val="clear"/>
+            <w:tcMar>
+              <w:top w:type="dxa" w:w="60"/>
+              <w:left w:type="dxa" w:w="100"/>
+              <w:bottom w:type="dxa" w:w="60"/>
+              <w:right w:type="dxa" w:w="100"/>
+            </w:tcMar>
+          </w:tcPr>
+          <w:p>
+            <w:pPr>
+              <w:spacing w:after="30" w:line="250"/>
+            </w:pPr>
+            <w:r>
+              <w:rPr>
+                <w:rFonts w:ascii="Calibri" w:cs="Calibri" w:eastAsia="Calibri" w:hAnsi="Calibri"/>
+                <w:color w:val="1F2937"/>
+                <w:sz w:val="19"/>
+                <w:szCs w:val="19"/>
+              </w:rPr>
+              <w:t xml:space="preserve">Private; only the backend</w:t>
+            </w:r>
+          </w:p>
+        </w:tc>
+        <w:tc>
+          <w:tcPr>
+            <w:tcW w:type="dxa" w:w="1720"/>
+            <w:tcBorders>
+              <w:top w:val="single" w:color="C9D3E3" w:sz="4"/>
+              <w:left w:val="single" w:color="C9D3E3" w:sz="4"/>
+              <w:bottom w:val="single" w:color="C9D3E3" w:sz="4"/>
+              <w:right w:val="single" w:color="C9D3E3" w:sz="4"/>
+            </w:tcBorders>
+            <w:shd w:fill="F3F6FC" w:color="auto" w:val="clear"/>
+            <w:tcMar>
+              <w:top w:type="dxa" w:w="60"/>
+              <w:left w:type="dxa" w:w="100"/>
+              <w:bottom w:type="dxa" w:w="60"/>
+              <w:right w:type="dxa" w:w="100"/>
+            </w:tcMar>
+          </w:tcPr>
+          <w:p>
+            <w:pPr>
+              <w:spacing w:after="30" w:line="250"/>
+            </w:pPr>
+            <w:r>
+              <w:rPr>
+                <w:rFonts w:ascii="Calibri" w:cs="Calibri" w:eastAsia="Calibri" w:hAnsi="Calibri"/>
+                <w:color w:val="1F2937"/>
+                <w:sz w:val="19"/>
+                <w:szCs w:val="19"/>
+              </w:rPr>
+              <w:t xml:space="preserve">5 MB, gzip</w:t>
+            </w:r>
+          </w:p>
+        </w:tc>
+        <w:tc>
+          <w:tcPr>
+            <w:tcW w:type="dxa" w:w="2677"/>
+            <w:tcBorders>
+              <w:top w:val="single" w:color="C9D3E3" w:sz="4"/>
+              <w:left w:val="single" w:color="C9D3E3" w:sz="4"/>
+              <w:bottom w:val="single" w:color="C9D3E3" w:sz="4"/>
+              <w:right w:val="single" w:color="C9D3E3" w:sz="4"/>
+            </w:tcBorders>
+            <w:shd w:fill="F3F6FC" w:color="auto" w:val="clear"/>
+            <w:tcMar>
+              <w:top w:type="dxa" w:w="60"/>
+              <w:left w:type="dxa" w:w="100"/>
+              <w:bottom w:type="dxa" w:w="60"/>
+              <w:right w:type="dxa" w:w="100"/>
+            </w:tcMar>
+          </w:tcPr>
+          <w:p>
+            <w:pPr>
+              <w:spacing w:after="30" w:line="250"/>
+            </w:pPr>
+            <w:r>
+              <w:rPr>
+                <w:rFonts w:ascii="Calibri" w:cs="Calibri" w:eastAsia="Calibri" w:hAnsi="Calibri"/>
+                <w:color w:val="1F2937"/>
+                <w:sz w:val="19"/>
+                <w:szCs w:val="19"/>
+              </w:rPr>
+              <w:t xml:space="preserve">The last good WoW Forever game data, data.json.gz</w:t>
+            </w:r>
+          </w:p>
+        </w:tc>
+      </w:tr>
     </w:tbl>
     <w:p>
       <w:pPr>
@@ -29273,7 +29376,7 @@
           <w:sz w:val="21"/>
           <w:szCs w:val="21"/>
         </w:rPr>
-        <w:t xml:space="preserve">WoW Forever is a set of companion tools for World of Warcraft: Forever, built as an unofficial fan project, with a launcher-style home from which each tool opens. It has no database tables and no management area: its data lives in two files inside the backend module, and its pictures are managed in the platform Pictures screen.</w:t>
+        <w:t xml:space="preserve">WoW Forever is a set of companion tools for World of Warcraft: Forever, built as an unofficial fan project, with a launcher-style home from which each tool opens. It has no database tables and no management area: the backend reads its game data from the game client on every new build, its texts and rules live in config.json, and its pictures are managed in the platform Pictures screen.</w:t>
       </w:r>
     </w:p>
     <w:p>
@@ -30104,7 +30207,7 @@
                 <w:sz w:val="19"/>
                 <w:szCs w:val="19"/>
               </w:rPr>
-              <w:t xml:space="preserve">Talents, spellbooks and spell texts, racials, class highlights, Legacy perks and challenges, classes and races</w:t>
+              <w:t xml:space="preserve">Talents, spellbooks and spell texts, the comparison with Classic, racials, Legacy perks and challenges, classes and races</w:t>
             </w:r>
           </w:p>
         </w:tc>
@@ -30130,22 +30233,12 @@
             </w:pPr>
             <w:r>
               <w:rPr>
-                <w:rFonts w:ascii="Courier New" w:cs="Courier New" w:eastAsia="Courier New" w:hAnsi="Courier New"/>
-                <w:color w:val="1F2937"/>
-                <w:sz w:val="16"/>
-                <w:szCs w:val="16"/>
-                <w:shd w:fill="EEF1F6" w:color="auto" w:val="clear"/>
-              </w:rPr>
-              <w:t xml:space="preserve">data.json</w:t>
-            </w:r>
-            <w:r>
-              <w:rPr>
-                <w:rFonts w:ascii="Calibri" w:cs="Calibri" w:eastAsia="Calibri" w:hAnsi="Calibri"/>
-                <w:color w:val="1F2937"/>
-                <w:sz w:val="19"/>
-                <w:szCs w:val="19"/>
-              </w:rPr>
-              <w:t xml:space="preserve"> in the backend module</w:t>
+                <w:rFonts w:ascii="Calibri" w:cs="Calibri" w:eastAsia="Calibri" w:hAnsi="Calibri"/>
+                <w:color w:val="1F2937"/>
+                <w:sz w:val="19"/>
+                <w:szCs w:val="19"/>
+              </w:rPr>
+              <w:t xml:space="preserve">Built by the backend from the game client (through wago.tools); the last good copy in the private bucket wow-forever-data</w:t>
             </w:r>
           </w:p>
         </w:tc>
@@ -30176,28 +30269,7 @@
                 <w:sz w:val="19"/>
                 <w:szCs w:val="19"/>
               </w:rPr>
-              <w:t xml:space="preserve">Replace or edit the file and redeploy the backend (</w:t>
-            </w:r>
-            <w:hyperlink w:history="1" w:anchor="sec_wow_update">
-              <w:r>
-                <w:rPr>
-                  <w:rFonts w:ascii="Calibri" w:cs="Calibri" w:eastAsia="Calibri" w:hAnsi="Calibri"/>
-                  <w:color w:val="1F6FD1"/>
-                  <w:sz w:val="19"/>
-                  <w:szCs w:val="19"/>
-                  <w:u w:val="single"/>
-                </w:rPr>
-                <w:t xml:space="preserve">Updating the game data</w:t>
-              </w:r>
-            </w:hyperlink>
-            <w:r>
-              <w:rPr>
-                <w:rFonts w:ascii="Calibri" w:cs="Calibri" w:eastAsia="Calibri" w:hAnsi="Calibri"/>
-                <w:color w:val="1F2937"/>
-                <w:sz w:val="19"/>
-                <w:szCs w:val="19"/>
-              </w:rPr>
-              <w:t xml:space="preserve">)</w:t>
+              <w:t xml:space="preserve">Nothing: a new game build is read on its own within an hour (How the game data stays up to date)</w:t>
             </w:r>
           </w:p>
         </w:tc>
@@ -30234,7 +30306,7 @@
                 <w:sz w:val="19"/>
                 <w:szCs w:val="19"/>
               </w:rPr>
-              <w:t xml:space="preserve">Texts in Spanish, faction names, tool list, news feed settings, talent rules, tree ids of share codes, icon host</w:t>
+              <w:t xml:space="preserve">Texts in Spanish, faction names, tool list, news feed settings, talent rules, tree ids of share codes, icon host, extra spellbook tabs, and where and how the game client is read</w:t>
             </w:r>
           </w:p>
         </w:tc>
@@ -30507,36 +30579,7 @@
                 <w:sz w:val="19"/>
                 <w:szCs w:val="19"/>
               </w:rPr>
-              <w:t xml:space="preserve">Change the icon name in </w:t>
-            </w:r>
-            <w:r>
-              <w:rPr>
-                <w:rFonts w:ascii="Courier New" w:cs="Courier New" w:eastAsia="Courier New" w:hAnsi="Courier New"/>
-                <w:color w:val="1F2937"/>
-                <w:sz w:val="16"/>
-                <w:szCs w:val="16"/>
-                <w:shd w:fill="EEF1F6" w:color="auto" w:val="clear"/>
-              </w:rPr>
-              <w:t xml:space="preserve">data.json</w:t>
-            </w:r>
-            <w:r>
-              <w:rPr>
-                <w:rFonts w:ascii="Calibri" w:cs="Calibri" w:eastAsia="Calibri" w:hAnsi="Calibri"/>
-                <w:color w:val="1F2937"/>
-                <w:sz w:val="19"/>
-                <w:szCs w:val="19"/>
-              </w:rPr>
-              <w:t xml:space="preserve"> or the host in </w:t>
-            </w:r>
-            <w:r>
-              <w:rPr>
-                <w:rFonts w:ascii="Courier New" w:cs="Courier New" w:eastAsia="Courier New" w:hAnsi="Courier New"/>
-                <w:color w:val="1F2937"/>
-                <w:sz w:val="16"/>
-                <w:szCs w:val="16"/>
-                <w:shd w:fill="EEF1F6" w:color="auto" w:val="clear"/>
-              </w:rPr>
-              <w:t xml:space="preserve">config.json</w:t>
+              <w:t xml:space="preserve">Icon names come from the client; change the host in config.json</w:t>
             </w:r>
           </w:p>
         </w:tc>
@@ -30922,7 +30965,7 @@
           <w:sz w:val="17"/>
           <w:szCs w:val="17"/>
         </w:rPr>
-        <w:t xml:space="preserve">│   └── application/service/  GameDataService, GameDataMapper, GameDataConfig, GameImagesService</w:t>
+        <w:t xml:space="preserve">│   ├── application/service/  GameDataService, GameDataSyncService, GameDataMapper, GameDataConfig, GameImagesService</w:t>
       </w:r>
     </w:p>
     <w:p>
@@ -30943,7 +30986,7 @@
           <w:sz w:val="17"/>
           <w:szCs w:val="17"/>
         </w:rPr>
-        <w:t xml:space="preserve">├── features/news/              NewsController, NewsResponses, NewsService, NewsFeedClient, NewsFeedParser</w:t>
+        <w:t xml:space="preserve">│   ├── application/service/export/  GameDataExporter and one exporter per section (talents, spellbook, racials, Legacy, Classic)</w:t>
       </w:r>
     </w:p>
     <w:p>
@@ -30964,7 +31007,7 @@
           <w:sz w:val="17"/>
           <w:szCs w:val="17"/>
         </w:rPr>
-        <w:t xml:space="preserve">└── resources/wow-forever/    data.json · config.json</w:t>
+        <w:t xml:space="preserve">│   ├── domain/               SpellTextResolver (tooltip tokens), TooltipFormat, TreeGrid (pure, with unit tests)</w:t>
       </w:r>
     </w:p>
     <w:p>
@@ -30985,7 +31028,7 @@
           <w:sz w:val="17"/>
           <w:szCs w:val="17"/>
         </w:rPr>
-        <w:t xml:space="preserve"> </w:t>
+        <w:t xml:space="preserve">│   └── infrastructure/       wago/ (WagoClient, Db2Table, CsvReader) · storage/ (GameDataStore)</w:t>
       </w:r>
     </w:p>
     <w:p>
@@ -31006,7 +31049,7 @@
           <w:sz w:val="17"/>
           <w:szCs w:val="17"/>
         </w:rPr>
-        <w:t xml:space="preserve">frontend/src/app/games/wow-forever/</w:t>
+        <w:t xml:space="preserve">├── features/news/              NewsController, NewsResponses, NewsService, NewsFeedClient, NewsFeedParser</w:t>
       </w:r>
     </w:p>
     <w:p>
@@ -31027,7 +31070,7 @@
           <w:sz w:val="17"/>
           <w:szCs w:val="17"/>
         </w:rPr>
-        <w:t xml:space="preserve">├── wow-forever.game.ts · wow-forever.routes.ts</w:t>
+        <w:t xml:space="preserve">├── resources/wow-forever/    config.json</w:t>
       </w:r>
     </w:p>
     <w:p>
@@ -31048,7 +31091,7 @@
           <w:sz w:val="17"/>
           <w:szCs w:val="17"/>
         </w:rPr>
-        <w:t xml:space="preserve">├── wow-forever-config.ts     Credit line and broken-icon helper</w:t>
+        <w:t xml:space="preserve">└── sql/wow-forever.sql        Private bucket wow-forever-data</w:t>
       </w:r>
     </w:p>
     <w:p>
@@ -31069,7 +31112,7 @@
           <w:sz w:val="17"/>
           <w:szCs w:val="17"/>
         </w:rPr>
-        <w:t xml:space="preserve">├── game-data/                GameDataApi (session cache), models, game-images (picture URLs)</w:t>
+        <w:t xml:space="preserve"> </w:t>
       </w:r>
     </w:p>
     <w:p>
@@ -31090,7 +31133,7 @@
           <w:sz w:val="17"/>
           <w:szCs w:val="17"/>
         </w:rPr>
-        <w:t xml:space="preserve">├── home/                     Launcher: home, launcher-header</w:t>
+        <w:t xml:space="preserve">frontend/src/app/games/wow-forever/</w:t>
       </w:r>
     </w:p>
     <w:p>
@@ -31111,7 +31154,7 @@
           <w:sz w:val="17"/>
           <w:szCs w:val="17"/>
         </w:rPr>
-        <w:t xml:space="preserve">├── news/                     NewsApi (no session cache), models, Spanish dates, news-panel</w:t>
+        <w:t xml:space="preserve">├── wow-forever.game.ts · wow-forever.routes.ts</w:t>
       </w:r>
     </w:p>
     <w:p>
@@ -31132,7 +31175,7 @@
           <w:sz w:val="17"/>
           <w:szCs w:val="17"/>
         </w:rPr>
-        <w:t xml:space="preserve">├── talents/                  Calculator, tree grid, tooltip, pure rules (talents-logic)</w:t>
+        <w:t xml:space="preserve">├── wow-forever-config.ts     Credit line and broken-icon helper</w:t>
       </w:r>
     </w:p>
     <w:p>
@@ -31153,7 +31196,7 @@
           <w:sz w:val="17"/>
           <w:szCs w:val="17"/>
         </w:rPr>
-        <w:t xml:space="preserve">├── spellbook/ · legacy/ · racials/</w:t>
+        <w:t xml:space="preserve">├── game-data/                GameDataApi (session cache), models, game-images (picture URLs)</w:t>
       </w:r>
     </w:p>
     <w:p>
@@ -31174,6 +31217,90 @@
           <w:sz w:val="17"/>
           <w:szCs w:val="17"/>
         </w:rPr>
+        <w:t xml:space="preserve">├── home/                     Launcher: home, launcher-header</w:t>
+      </w:r>
+    </w:p>
+    <w:p>
+      <w:pPr>
+        <w:keepNext/>
+        <w:keepLines/>
+        <w:pBdr>
+          <w:left w:val="single" w:color="1F6FD1" w:sz="18" w:space="6"/>
+        </w:pBdr>
+        <w:shd w:fill="F3F4F6" w:color="auto" w:val="clear"/>
+        <w:spacing w:after="0" w:before="0" w:line="252"/>
+        <w:ind w:left="840" w:right="60"/>
+      </w:pPr>
+      <w:r>
+        <w:rPr>
+          <w:rFonts w:ascii="Courier New" w:cs="Courier New" w:eastAsia="Courier New" w:hAnsi="Courier New"/>
+          <w:color w:val="1F2937"/>
+          <w:sz w:val="17"/>
+          <w:szCs w:val="17"/>
+        </w:rPr>
+        <w:t xml:space="preserve">├── news/                     NewsApi (no session cache), models, Spanish dates, news-panel</w:t>
+      </w:r>
+    </w:p>
+    <w:p>
+      <w:pPr>
+        <w:keepNext/>
+        <w:keepLines/>
+        <w:pBdr>
+          <w:left w:val="single" w:color="1F6FD1" w:sz="18" w:space="6"/>
+        </w:pBdr>
+        <w:shd w:fill="F3F4F6" w:color="auto" w:val="clear"/>
+        <w:spacing w:after="0" w:before="0" w:line="252"/>
+        <w:ind w:left="840" w:right="60"/>
+      </w:pPr>
+      <w:r>
+        <w:rPr>
+          <w:rFonts w:ascii="Courier New" w:cs="Courier New" w:eastAsia="Courier New" w:hAnsi="Courier New"/>
+          <w:color w:val="1F2937"/>
+          <w:sz w:val="17"/>
+          <w:szCs w:val="17"/>
+        </w:rPr>
+        <w:t xml:space="preserve">├── talents/                  Calculator, tree grid, tooltip, pure rules (talents-logic)</w:t>
+      </w:r>
+    </w:p>
+    <w:p>
+      <w:pPr>
+        <w:keepNext/>
+        <w:keepLines/>
+        <w:pBdr>
+          <w:left w:val="single" w:color="1F6FD1" w:sz="18" w:space="6"/>
+        </w:pBdr>
+        <w:shd w:fill="F3F4F6" w:color="auto" w:val="clear"/>
+        <w:spacing w:after="0" w:before="0" w:line="252"/>
+        <w:ind w:left="840" w:right="60"/>
+      </w:pPr>
+      <w:r>
+        <w:rPr>
+          <w:rFonts w:ascii="Courier New" w:cs="Courier New" w:eastAsia="Courier New" w:hAnsi="Courier New"/>
+          <w:color w:val="1F2937"/>
+          <w:sz w:val="17"/>
+          <w:szCs w:val="17"/>
+        </w:rPr>
+        <w:t xml:space="preserve">├── spellbook/ · legacy/ · racials/</w:t>
+      </w:r>
+    </w:p>
+    <w:p>
+      <w:pPr>
+        <w:keepNext/>
+        <w:keepLines/>
+        <w:pBdr>
+          <w:left w:val="single" w:color="1F6FD1" w:sz="18" w:space="6"/>
+        </w:pBdr>
+        <w:shd w:fill="F3F4F6" w:color="auto" w:val="clear"/>
+        <w:spacing w:after="0" w:before="0" w:line="252"/>
+        <w:ind w:left="840" w:right="60"/>
+      </w:pPr>
+      <w:r>
+        <w:rPr>
+          <w:rFonts w:ascii="Courier New" w:cs="Courier New" w:eastAsia="Courier New" w:hAnsi="Courier New"/>
+          <w:color w:val="1F2937"/>
+          <w:sz w:val="17"/>
+          <w:szCs w:val="17"/>
+        </w:rPr>
         <w:t xml:space="preserve">├── ui/                       wow-page, wow-nav-menu, class-picker, wow-button, wow-frame, legal-notice</w:t>
       </w:r>
     </w:p>
@@ -31223,13 +31350,22 @@
       </w:pPr>
       <w:r>
         <w:rPr>
+          <w:rFonts w:ascii="Calibri" w:cs="Calibri" w:eastAsia="Calibri" w:hAnsi="Calibri"/>
+          <w:color w:val="1F2937"/>
+          <w:sz w:val="21"/>
+          <w:szCs w:val="21"/>
+        </w:rPr>
+        <w:t xml:space="preserve">GameDataService serves the data file that GameDataSyncService publishes and reads </w:t>
+      </w:r>
+      <w:r>
+        <w:rPr>
           <w:rFonts w:ascii="Courier New" w:cs="Courier New" w:eastAsia="Courier New" w:hAnsi="Courier New"/>
           <w:color w:val="1F2937"/>
           <w:sz w:val="18"/>
           <w:szCs w:val="18"/>
           <w:shd w:fill="EEF1F6" w:color="auto" w:val="clear"/>
         </w:rPr>
-        <w:t xml:space="preserve">GameDataService</w:t>
+        <w:t xml:space="preserve">config.json</w:t>
       </w:r>
       <w:r>
         <w:rPr>
@@ -31238,7 +31374,7 @@
           <w:sz w:val="21"/>
           <w:szCs w:val="21"/>
         </w:rPr>
-        <w:t xml:space="preserve"> reads </w:t>
+        <w:t xml:space="preserve"> the first time it is needed. Every file is checked before it is served (every section, at least one class with talents and a spellbook, both factions, a Legacy tree) and replaces the previous one together with its serialized responses. GameDataMapper turns the sections into the API models (GameDataResponses): prerequisites resolved inside each tree, the game's own tree ids, Spanish texts from </w:t>
       </w:r>
       <w:r>
         <w:rPr>
@@ -31248,7 +31384,7 @@
           <w:szCs w:val="18"/>
           <w:shd w:fill="EEF1F6" w:color="auto" w:val="clear"/>
         </w:rPr>
-        <w:t xml:space="preserve">data.json</w:t>
+        <w:t xml:space="preserve">config.json</w:t>
       </w:r>
       <w:r>
         <w:rPr>
@@ -31257,235 +31393,7 @@
           <w:sz w:val="21"/>
           <w:szCs w:val="21"/>
         </w:rPr>
-        <w:t xml:space="preserve"> and </w:t>
-      </w:r>
-      <w:r>
-        <w:rPr>
-          <w:rFonts w:ascii="Courier New" w:cs="Courier New" w:eastAsia="Courier New" w:hAnsi="Courier New"/>
-          <w:color w:val="1F2937"/>
-          <w:sz w:val="18"/>
-          <w:szCs w:val="18"/>
-          <w:shd w:fill="EEF1F6" w:color="auto" w:val="clear"/>
-        </w:rPr>
-        <w:t xml:space="preserve">config.json</w:t>
-      </w:r>
-      <w:r>
-        <w:rPr>
-          <w:rFonts w:ascii="Calibri" w:cs="Calibri" w:eastAsia="Calibri" w:hAnsi="Calibri"/>
-          <w:color w:val="1F2937"/>
-          <w:sz w:val="21"/>
-          <w:szCs w:val="21"/>
-        </w:rPr>
-        <w:t xml:space="preserve"> the first time an endpoint is called, checks that </w:t>
-      </w:r>
-      <w:r>
-        <w:rPr>
-          <w:rFonts w:ascii="Courier New" w:cs="Courier New" w:eastAsia="Courier New" w:hAnsi="Courier New"/>
-          <w:color w:val="1F2937"/>
-          <w:sz w:val="18"/>
-          <w:szCs w:val="18"/>
-          <w:shd w:fill="EEF1F6" w:color="auto" w:val="clear"/>
-        </w:rPr>
-        <w:t xml:space="preserve">data.json</w:t>
-      </w:r>
-      <w:r>
-        <w:rPr>
-          <w:rFonts w:ascii="Calibri" w:cs="Calibri" w:eastAsia="Calibri" w:hAnsi="Calibri"/>
-          <w:color w:val="1F2937"/>
-          <w:sz w:val="21"/>
-          <w:szCs w:val="21"/>
-        </w:rPr>
-        <w:t xml:space="preserve"> has the sections </w:t>
-      </w:r>
-      <w:r>
-        <w:rPr>
-          <w:rFonts w:ascii="Courier New" w:cs="Courier New" w:eastAsia="Courier New" w:hAnsi="Courier New"/>
-          <w:color w:val="1F2937"/>
-          <w:sz w:val="18"/>
-          <w:szCs w:val="18"/>
-          <w:shd w:fill="EEF1F6" w:color="auto" w:val="clear"/>
-        </w:rPr>
-        <w:t xml:space="preserve">talents</w:t>
-      </w:r>
-      <w:r>
-        <w:rPr>
-          <w:rFonts w:ascii="Calibri" w:cs="Calibri" w:eastAsia="Calibri" w:hAnsi="Calibri"/>
-          <w:color w:val="1F2937"/>
-          <w:sz w:val="21"/>
-          <w:szCs w:val="21"/>
-        </w:rPr>
-        <w:t xml:space="preserve">, </w:t>
-      </w:r>
-      <w:r>
-        <w:rPr>
-          <w:rFonts w:ascii="Courier New" w:cs="Courier New" w:eastAsia="Courier New" w:hAnsi="Courier New"/>
-          <w:color w:val="1F2937"/>
-          <w:sz w:val="18"/>
-          <w:szCs w:val="18"/>
-          <w:shd w:fill="EEF1F6" w:color="auto" w:val="clear"/>
-        </w:rPr>
-        <w:t xml:space="preserve">spellbooks</w:t>
-      </w:r>
-      <w:r>
-        <w:rPr>
-          <w:rFonts w:ascii="Calibri" w:cs="Calibri" w:eastAsia="Calibri" w:hAnsi="Calibri"/>
-          <w:color w:val="1F2937"/>
-          <w:sz w:val="21"/>
-          <w:szCs w:val="21"/>
-        </w:rPr>
-        <w:t xml:space="preserve">, </w:t>
-      </w:r>
-      <w:r>
-        <w:rPr>
-          <w:rFonts w:ascii="Courier New" w:cs="Courier New" w:eastAsia="Courier New" w:hAnsi="Courier New"/>
-          <w:color w:val="1F2937"/>
-          <w:sz w:val="18"/>
-          <w:szCs w:val="18"/>
-          <w:shd w:fill="EEF1F6" w:color="auto" w:val="clear"/>
-        </w:rPr>
-        <w:t xml:space="preserve">spell_desc</w:t>
-      </w:r>
-      <w:r>
-        <w:rPr>
-          <w:rFonts w:ascii="Calibri" w:cs="Calibri" w:eastAsia="Calibri" w:hAnsi="Calibri"/>
-          <w:color w:val="1F2937"/>
-          <w:sz w:val="21"/>
-          <w:szCs w:val="21"/>
-        </w:rPr>
-        <w:t xml:space="preserve">, </w:t>
-      </w:r>
-      <w:r>
-        <w:rPr>
-          <w:rFonts w:ascii="Courier New" w:cs="Courier New" w:eastAsia="Courier New" w:hAnsi="Courier New"/>
-          <w:color w:val="1F2937"/>
-          <w:sz w:val="18"/>
-          <w:szCs w:val="18"/>
-          <w:shd w:fill="EEF1F6" w:color="auto" w:val="clear"/>
-        </w:rPr>
-        <w:t xml:space="preserve">racials</w:t>
-      </w:r>
-      <w:r>
-        <w:rPr>
-          <w:rFonts w:ascii="Calibri" w:cs="Calibri" w:eastAsia="Calibri" w:hAnsi="Calibri"/>
-          <w:color w:val="1F2937"/>
-          <w:sz w:val="21"/>
-          <w:szCs w:val="21"/>
-        </w:rPr>
-        <w:t xml:space="preserve">, </w:t>
-      </w:r>
-      <w:r>
-        <w:rPr>
-          <w:rFonts w:ascii="Courier New" w:cs="Courier New" w:eastAsia="Courier New" w:hAnsi="Courier New"/>
-          <w:color w:val="1F2937"/>
-          <w:sz w:val="18"/>
-          <w:szCs w:val="18"/>
-          <w:shd w:fill="EEF1F6" w:color="auto" w:val="clear"/>
-        </w:rPr>
-        <w:t xml:space="preserve">class_racials</w:t>
-      </w:r>
-      <w:r>
-        <w:rPr>
-          <w:rFonts w:ascii="Calibri" w:cs="Calibri" w:eastAsia="Calibri" w:hAnsi="Calibri"/>
-          <w:color w:val="1F2937"/>
-          <w:sz w:val="21"/>
-          <w:szCs w:val="21"/>
-        </w:rPr>
-        <w:t xml:space="preserve">, </w:t>
-      </w:r>
-      <w:r>
-        <w:rPr>
-          <w:rFonts w:ascii="Courier New" w:cs="Courier New" w:eastAsia="Courier New" w:hAnsi="Courier New"/>
-          <w:color w:val="1F2937"/>
-          <w:sz w:val="18"/>
-          <w:szCs w:val="18"/>
-          <w:shd w:fill="EEF1F6" w:color="auto" w:val="clear"/>
-        </w:rPr>
-        <w:t xml:space="preserve">class_abilities</w:t>
-      </w:r>
-      <w:r>
-        <w:rPr>
-          <w:rFonts w:ascii="Calibri" w:cs="Calibri" w:eastAsia="Calibri" w:hAnsi="Calibri"/>
-          <w:color w:val="1F2937"/>
-          <w:sz w:val="21"/>
-          <w:szCs w:val="21"/>
-        </w:rPr>
-        <w:t xml:space="preserve"> and </w:t>
-      </w:r>
-      <w:r>
-        <w:rPr>
-          <w:rFonts w:ascii="Courier New" w:cs="Courier New" w:eastAsia="Courier New" w:hAnsi="Courier New"/>
-          <w:color w:val="1F2937"/>
-          <w:sz w:val="18"/>
-          <w:szCs w:val="18"/>
-          <w:shd w:fill="EEF1F6" w:color="auto" w:val="clear"/>
-        </w:rPr>
-        <w:t xml:space="preserve">legacy</w:t>
-      </w:r>
-      <w:r>
-        <w:rPr>
-          <w:rFonts w:ascii="Calibri" w:cs="Calibri" w:eastAsia="Calibri" w:hAnsi="Calibri"/>
-          <w:color w:val="1F2937"/>
-          <w:sz w:val="21"/>
-          <w:szCs w:val="21"/>
-        </w:rPr>
-        <w:t xml:space="preserve">, and keeps both in memory. </w:t>
-      </w:r>
-      <w:r>
-        <w:rPr>
-          <w:rFonts w:ascii="Courier New" w:cs="Courier New" w:eastAsia="Courier New" w:hAnsi="Courier New"/>
-          <w:color w:val="1F2937"/>
-          <w:sz w:val="18"/>
-          <w:szCs w:val="18"/>
-          <w:shd w:fill="EEF1F6" w:color="auto" w:val="clear"/>
-        </w:rPr>
-        <w:t xml:space="preserve">GameDataMapper</w:t>
-      </w:r>
-      <w:r>
-        <w:rPr>
-          <w:rFonts w:ascii="Calibri" w:cs="Calibri" w:eastAsia="Calibri" w:hAnsi="Calibri"/>
-          <w:color w:val="1F2937"/>
-          <w:sz w:val="21"/>
-          <w:szCs w:val="21"/>
-        </w:rPr>
-        <w:t xml:space="preserve"> turns the sections into the API models (</w:t>
-      </w:r>
-      <w:r>
-        <w:rPr>
-          <w:rFonts w:ascii="Courier New" w:cs="Courier New" w:eastAsia="Courier New" w:hAnsi="Courier New"/>
-          <w:color w:val="1F2937"/>
-          <w:sz w:val="18"/>
-          <w:szCs w:val="18"/>
-          <w:shd w:fill="EEF1F6" w:color="auto" w:val="clear"/>
-        </w:rPr>
-        <w:t xml:space="preserve">GameDataResponses</w:t>
-      </w:r>
-      <w:r>
-        <w:rPr>
-          <w:rFonts w:ascii="Calibri" w:cs="Calibri" w:eastAsia="Calibri" w:hAnsi="Calibri"/>
-          <w:color w:val="1F2937"/>
-          <w:sz w:val="21"/>
-          <w:szCs w:val="21"/>
-        </w:rPr>
-        <w:t xml:space="preserve">): prerequisites resolved inside each tree, the game's own tree ids, Spanish texts from </w:t>
-      </w:r>
-      <w:r>
-        <w:rPr>
-          <w:rFonts w:ascii="Courier New" w:cs="Courier New" w:eastAsia="Courier New" w:hAnsi="Courier New"/>
-          <w:color w:val="1F2937"/>
-          <w:sz w:val="18"/>
-          <w:szCs w:val="18"/>
-          <w:shd w:fill="EEF1F6" w:color="auto" w:val="clear"/>
-        </w:rPr>
-        <w:t xml:space="preserve">config.json</w:t>
-      </w:r>
-      <w:r>
-        <w:rPr>
-          <w:rFonts w:ascii="Calibri" w:cs="Calibri" w:eastAsia="Calibri" w:hAnsi="Calibri"/>
-          <w:color w:val="1F2937"/>
-          <w:sz w:val="21"/>
-          <w:szCs w:val="21"/>
-        </w:rPr>
-        <w:t xml:space="preserve"> and full icon URLs. Each response is serialized once and kept.</w:t>
+        <w:t xml:space="preserve"> and full icon URLs.</w:t>
       </w:r>
     </w:p>
     <w:tbl>
@@ -31781,7 +31689,7 @@
                 <w:sz w:val="19"/>
                 <w:szCs w:val="19"/>
               </w:rPr>
-              <w:t xml:space="preserve">Tabs (General first), spells with every rank, highlights and removed spells</w:t>
+              <w:t xml:space="preserve">Tabs (one per talent tree, plus Pets, Poisons or Demons), spells with every rank and the spells Classic had that are gone</w:t>
             </w:r>
           </w:p>
         </w:tc>
@@ -32215,83 +32123,7 @@
           <w:sz w:val="21"/>
           <w:szCs w:val="21"/>
         </w:rPr>
-        <w:t xml:space="preserve"> and an </w:t>
-      </w:r>
-      <w:r>
-        <w:rPr>
-          <w:rFonts w:ascii="Courier New" w:cs="Courier New" w:eastAsia="Courier New" w:hAnsi="Courier New"/>
-          <w:color w:val="1F2937"/>
-          <w:sz w:val="18"/>
-          <w:szCs w:val="18"/>
-          <w:shd w:fill="EEF1F6" w:color="auto" w:val="clear"/>
-        </w:rPr>
-        <w:t xml:space="preserve">ETag</w:t>
-      </w:r>
-      <w:r>
-        <w:rPr>
-          <w:rFonts w:ascii="Calibri" w:cs="Calibri" w:eastAsia="Calibri" w:hAnsi="Calibri"/>
-          <w:color w:val="1F2937"/>
-          <w:sz w:val="21"/>
-          <w:szCs w:val="21"/>
-        </w:rPr>
-        <w:t xml:space="preserve">. The class slug is the class name in lowercase with every run of other characters turned into </w:t>
-      </w:r>
-      <w:r>
-        <w:rPr>
-          <w:rFonts w:ascii="Courier New" w:cs="Courier New" w:eastAsia="Courier New" w:hAnsi="Courier New"/>
-          <w:color w:val="1F2937"/>
-          <w:sz w:val="18"/>
-          <w:szCs w:val="18"/>
-          <w:shd w:fill="EEF1F6" w:color="auto" w:val="clear"/>
-        </w:rPr>
-        <w:t xml:space="preserve">-</w:t>
-      </w:r>
-      <w:r>
-        <w:rPr>
-          <w:rFonts w:ascii="Calibri" w:cs="Calibri" w:eastAsia="Calibri" w:hAnsi="Calibri"/>
-          <w:color w:val="1F2937"/>
-          <w:sz w:val="21"/>
-          <w:szCs w:val="21"/>
-        </w:rPr>
-        <w:t xml:space="preserve"> (Warrior gives </w:t>
-      </w:r>
-      <w:r>
-        <w:rPr>
-          <w:rFonts w:ascii="Courier New" w:cs="Courier New" w:eastAsia="Courier New" w:hAnsi="Courier New"/>
-          <w:color w:val="1F2937"/>
-          <w:sz w:val="18"/>
-          <w:szCs w:val="18"/>
-          <w:shd w:fill="EEF1F6" w:color="auto" w:val="clear"/>
-        </w:rPr>
-        <w:t xml:space="preserve">warrior</w:t>
-      </w:r>
-      <w:r>
-        <w:rPr>
-          <w:rFonts w:ascii="Calibri" w:cs="Calibri" w:eastAsia="Calibri" w:hAnsi="Calibri"/>
-          <w:color w:val="1F2937"/>
-          <w:sz w:val="21"/>
-          <w:szCs w:val="21"/>
-        </w:rPr>
-        <w:t xml:space="preserve">); an unknown slug answers </w:t>
-      </w:r>
-      <w:r>
-        <w:rPr>
-          <w:rFonts w:ascii="Courier New" w:cs="Courier New" w:eastAsia="Courier New" w:hAnsi="Courier New"/>
-          <w:color w:val="1F2937"/>
-          <w:sz w:val="18"/>
-          <w:szCs w:val="18"/>
-          <w:shd w:fill="EEF1F6" w:color="auto" w:val="clear"/>
-        </w:rPr>
-        <w:t xml:space="preserve">404</w:t>
-      </w:r>
-      <w:r>
-        <w:rPr>
-          <w:rFonts w:ascii="Calibri" w:cs="Calibri" w:eastAsia="Calibri" w:hAnsi="Calibri"/>
-          <w:color w:val="1F2937"/>
-          <w:sz w:val="21"/>
-          <w:szCs w:val="21"/>
-        </w:rPr>
-        <w:t xml:space="preserve">. The browser keeps each response but checks its ETag on every request (304 with no body while unchanged), so players see new data right after a deploy. The frontend asks for each response once per session.</w:t>
+        <w:t xml:space="preserve"> and an ETag. The class slug is the class name in lowercase with every run of other characters turned into - (Warrior gives warrior); an unknown slug answers 404. The browser keeps each response but checks its ETag on every request (304 with no body while unchanged), so players see a new game build on their next visit or reload. The frontend asks for each response once per session.</w:t>
       </w:r>
     </w:p>
     <w:p>
@@ -32352,7 +32184,7 @@
           <w:sz w:val="20"/>
           <w:szCs w:val="20"/>
         </w:rPr>
-        <w:t xml:space="preserve">If </w:t>
+        <w:t xml:space="preserve">Until a data file is served (first start without a kept copy and with wago.tools unreachable) only the game data endpoints answer 503; the news and the rest of the backend keep working. A file that fails the check is never served. Missing fields inside a section become empty values. GameDataServiceTest checks the responses built from a small file cut from a real export (test resource </w:t>
       </w:r>
       <w:r>
         <w:rPr>
@@ -32362,7 +32194,7 @@
           <w:szCs w:val="17"/>
           <w:shd w:fill="EEF1F6" w:color="auto" w:val="clear"/>
         </w:rPr>
-        <w:t xml:space="preserve">data.json</w:t>
+        <w:t xml:space="preserve">wow-forever/game-data.json</w:t>
       </w:r>
       <w:r>
         <w:rPr>
@@ -32371,83 +32203,7 @@
           <w:sz w:val="20"/>
           <w:szCs w:val="20"/>
         </w:rPr>
-        <w:t xml:space="preserve"> or </w:t>
-      </w:r>
-      <w:r>
-        <w:rPr>
-          <w:rFonts w:ascii="Courier New" w:cs="Courier New" w:eastAsia="Courier New" w:hAnsi="Courier New"/>
-          <w:color w:val="1F2937"/>
-          <w:sz w:val="17"/>
-          <w:szCs w:val="17"/>
-          <w:shd w:fill="EEF1F6" w:color="auto" w:val="clear"/>
-        </w:rPr>
-        <w:t xml:space="preserve">config.json</w:t>
-      </w:r>
-      <w:r>
-        <w:rPr>
-          <w:rFonts w:ascii="Calibri" w:cs="Calibri" w:eastAsia="Calibri" w:hAnsi="Calibri"/>
-          <w:color w:val="1F2937"/>
-          <w:sz w:val="20"/>
-          <w:szCs w:val="20"/>
-        </w:rPr>
-        <w:t xml:space="preserve"> is missing or invalid, or </w:t>
-      </w:r>
-      <w:r>
-        <w:rPr>
-          <w:rFonts w:ascii="Courier New" w:cs="Courier New" w:eastAsia="Courier New" w:hAnsi="Courier New"/>
-          <w:color w:val="1F2937"/>
-          <w:sz w:val="17"/>
-          <w:szCs w:val="17"/>
-          <w:shd w:fill="EEF1F6" w:color="auto" w:val="clear"/>
-        </w:rPr>
-        <w:t xml:space="preserve">data.json</w:t>
-      </w:r>
-      <w:r>
-        <w:rPr>
-          <w:rFonts w:ascii="Calibri" w:cs="Calibri" w:eastAsia="Calibri" w:hAnsi="Calibri"/>
-          <w:color w:val="1F2937"/>
-          <w:sz w:val="20"/>
-          <w:szCs w:val="20"/>
-        </w:rPr>
-        <w:t xml:space="preserve"> lacks a required section, only the game data endpoints answer </w:t>
-      </w:r>
-      <w:r>
-        <w:rPr>
-          <w:rFonts w:ascii="Courier New" w:cs="Courier New" w:eastAsia="Courier New" w:hAnsi="Courier New"/>
-          <w:color w:val="1F2937"/>
-          <w:sz w:val="17"/>
-          <w:szCs w:val="17"/>
-          <w:shd w:fill="EEF1F6" w:color="auto" w:val="clear"/>
-        </w:rPr>
-        <w:t xml:space="preserve">503</w:t>
-      </w:r>
-      <w:r>
-        <w:rPr>
-          <w:rFonts w:ascii="Calibri" w:cs="Calibri" w:eastAsia="Calibri" w:hAnsi="Calibri"/>
-          <w:color w:val="1F2937"/>
-          <w:sz w:val="20"/>
-          <w:szCs w:val="20"/>
-        </w:rPr>
-        <w:t xml:space="preserve">; the rest of the backend keeps working and the files are read again on the next request. Missing fields inside a section become empty values. </w:t>
-      </w:r>
-      <w:r>
-        <w:rPr>
-          <w:rFonts w:ascii="Courier New" w:cs="Courier New" w:eastAsia="Courier New" w:hAnsi="Courier New"/>
-          <w:color w:val="1F2937"/>
-          <w:sz w:val="17"/>
-          <w:szCs w:val="17"/>
-          <w:shd w:fill="EEF1F6" w:color="auto" w:val="clear"/>
-        </w:rPr>
-        <w:t xml:space="preserve">GameDataServiceTest</w:t>
-      </w:r>
-      <w:r>
-        <w:rPr>
-          <w:rFonts w:ascii="Calibri" w:cs="Calibri" w:eastAsia="Calibri" w:hAnsi="Calibri"/>
-          <w:color w:val="1F2937"/>
-          <w:sz w:val="20"/>
-          <w:szCs w:val="20"/>
-        </w:rPr>
-        <w:t xml:space="preserve"> checks the responses built from the real files.</w:t>
+        <w:t xml:space="preserve">).</w:t>
       </w:r>
     </w:p>
     <w:p>
@@ -32464,7 +32220,7 @@
         <w:rPr>
           <w:rFonts w:ascii="Calibri" w:cs="Calibri" w:eastAsia="Calibri" w:hAnsi="Calibri"/>
         </w:rPr>
-        <w:t xml:space="preserve">The data file (data.json)</w:t>
+        <w:t xml:space="preserve">The game data (from the game client)</w:t>
       </w:r>
       <w:bookmarkEnd w:id="1"/>
     </w:p>
@@ -32482,16 +32238,7 @@
           <w:sz w:val="21"/>
           <w:szCs w:val="21"/>
         </w:rPr>
-        <w:t xml:space="preserve">Source and licence.</w:t>
-      </w:r>
-      <w:r>
-        <w:rPr>
-          <w:rFonts w:ascii="Calibri" w:cs="Calibri" w:eastAsia="Calibri" w:hAnsi="Calibri"/>
-          <w:color w:val="1F2937"/>
-          <w:sz w:val="21"/>
-          <w:szCs w:val="21"/>
-        </w:rPr>
-        <w:t xml:space="preserve"> The export that talentsforever.com publishes at </w:t>
+        <w:t xml:space="preserve">Source. GameDataExporter reads the tables (DB2 files) of the newest WoW Forever client build as wago.tools publishes them (</w:t>
       </w:r>
       <w:r>
         <w:rPr>
@@ -32501,36 +32248,18 @@
           <w:szCs w:val="18"/>
           <w:shd w:fill="EEF1F6" w:color="auto" w:val="clear"/>
         </w:rPr>
-        <w:t xml:space="preserve">https://talentsforever.com/data.json</w:t>
-      </w:r>
-      <w:r>
-        <w:rPr>
-          <w:rFonts w:ascii="Calibri" w:cs="Calibri" w:eastAsia="Calibri" w:hAnsi="Calibri"/>
+        <w:t xml:space="preserve">https://wago.tools/db2/&lt;Table&gt;/csv?build=&lt;version&gt;</w:t>
+      </w:r>
+      <w:r>
+        <w:rPr>
+          <w:rFonts w:ascii="Calibri" w:cs="Calibri" w:eastAsia="Calibri" w:hAnsi="Calibri"/>
+          <w:b/>
+          <w:bCs/>
           <w:color w:val="1F2937"/>
           <w:sz w:val="21"/>
           <w:szCs w:val="21"/>
         </w:rPr>
-        <w:t xml:space="preserve">, read from the WoW Forever client (the General tab of each spellbook is kept by hand by the site). Licensed </w:t>
-      </w:r>
-      <w:r>
-        <w:rPr>
-          <w:rFonts w:ascii="Calibri" w:cs="Calibri" w:eastAsia="Calibri" w:hAnsi="Calibri"/>
-          <w:b/>
-          <w:bCs/>
-          <w:color w:val="1F2937"/>
-          <w:sz w:val="21"/>
-          <w:szCs w:val="21"/>
-        </w:rPr>
-        <w:t xml:space="preserve">CC BY 4.0</w:t>
-      </w:r>
-      <w:r>
-        <w:rPr>
-          <w:rFonts w:ascii="Calibri" w:cs="Calibri" w:eastAsia="Calibri" w:hAnsi="Calibri"/>
-          <w:color w:val="1F2937"/>
-          <w:sz w:val="21"/>
-          <w:szCs w:val="21"/>
-        </w:rPr>
-        <w:t xml:space="preserve">: it may be copied and adapted with credit and a link to talentsforever.com. Game names, icons and tooltip text belong to Blizzard Entertainment. Every tool page shows the credit line.</w:t>
+        <w:t xml:space="preserve">), in English, and compares them with the newest Classic Era build. Texts are resolved for a level 60 character with no gear. It writes the structure the backend always read, so the mapper and the web client did not change. Game names, icons and texts belong to Blizzard Entertainment; every tool page shows the credit line with the build.</w:t>
       </w:r>
     </w:p>
     <w:tbl>
@@ -32686,51 +32415,12 @@
             </w:pPr>
             <w:r>
               <w:rPr>
-                <w:rFonts w:ascii="Courier New" w:cs="Courier New" w:eastAsia="Courier New" w:hAnsi="Courier New"/>
-                <w:color w:val="1F2937"/>
-                <w:sz w:val="16"/>
-                <w:szCs w:val="16"/>
-                <w:shd w:fill="EEF1F6" w:color="auto" w:val="clear"/>
-              </w:rPr>
-              <w:t xml:space="preserve">license</w:t>
-            </w:r>
-            <w:r>
-              <w:rPr>
-                <w:rFonts w:ascii="Calibri" w:cs="Calibri" w:eastAsia="Calibri" w:hAnsi="Calibri"/>
-                <w:color w:val="1F2937"/>
-                <w:sz w:val="19"/>
-                <w:szCs w:val="19"/>
-              </w:rPr>
-              <w:t xml:space="preserve">, </w:t>
-            </w:r>
-            <w:r>
-              <w:rPr>
-                <w:rFonts w:ascii="Courier New" w:cs="Courier New" w:eastAsia="Courier New" w:hAnsi="Courier New"/>
-                <w:color w:val="1F2937"/>
-                <w:sz w:val="16"/>
-                <w:szCs w:val="16"/>
-                <w:shd w:fill="EEF1F6" w:color="auto" w:val="clear"/>
-              </w:rPr>
-              <w:t xml:space="preserve">attribution</w:t>
-            </w:r>
-            <w:r>
-              <w:rPr>
-                <w:rFonts w:ascii="Calibri" w:cs="Calibri" w:eastAsia="Calibri" w:hAnsi="Calibri"/>
-                <w:color w:val="1F2937"/>
-                <w:sz w:val="19"/>
-                <w:szCs w:val="19"/>
-              </w:rPr>
-              <w:t xml:space="preserve">, </w:t>
-            </w:r>
-            <w:r>
-              <w:rPr>
-                <w:rFonts w:ascii="Courier New" w:cs="Courier New" w:eastAsia="Courier New" w:hAnsi="Courier New"/>
-                <w:color w:val="1F2937"/>
-                <w:sz w:val="16"/>
-                <w:szCs w:val="16"/>
-                <w:shd w:fill="EEF1F6" w:color="auto" w:val="clear"/>
-              </w:rPr>
-              <w:t xml:space="preserve">generated</w:t>
+                <w:rFonts w:ascii="Calibri" w:cs="Calibri" w:eastAsia="Calibri" w:hAnsi="Calibri"/>
+                <w:color w:val="1F2937"/>
+                <w:sz w:val="19"/>
+                <w:szCs w:val="19"/>
+              </w:rPr>
+              <w:t xml:space="preserve">attribution, generated, build, classicBuild</w:t>
             </w:r>
           </w:p>
         </w:tc>
@@ -32761,7 +32451,7 @@
                 <w:sz w:val="19"/>
                 <w:szCs w:val="19"/>
               </w:rPr>
-              <w:t xml:space="preserve">Licence, credit line and export date</w:t>
+              <w:t xml:space="preserve">Credit line, export date and the builds read</w:t>
             </w:r>
           </w:p>
         </w:tc>
@@ -32862,7 +32552,7 @@
                 <w:sz w:val="19"/>
                 <w:szCs w:val="19"/>
               </w:rPr>
-              <w:t xml:space="preserve">Per class: icon, source (with the game build), trees with talents (name, max, row and col from 1, icon, desc per rank, req, cost, classic)</w:t>
+              <w:t xml:space="preserve">Per class: icon, source (with the game build), trees with talents (name, max, row and col from 1, icon, desc per rank, req, cost, classic: status and Classic's place and text)</w:t>
             </w:r>
           </w:p>
         </w:tc>
@@ -32962,7 +32652,7 @@
                 <w:sz w:val="19"/>
                 <w:szCs w:val="19"/>
               </w:rPr>
-              <w:t xml:space="preserve">Per class: general and tabs as [spell, rank], levels, talents, icons, gone, build</w:t>
+              <w:t xml:space="preserve">Per class: tabs as [spell, rank], levels, talents, icons, gone (spells Classic had), build; general stays empty</w:t>
             </w:r>
           </w:p>
         </w:tc>
@@ -33063,17 +32753,7 @@
                 <w:sz w:val="19"/>
                 <w:szCs w:val="19"/>
               </w:rPr>
-              <w:t xml:space="preserve">Tooltip of every rank, keyed </w:t>
-            </w:r>
-            <w:r>
-              <w:rPr>
-                <w:rFonts w:ascii="Courier New" w:cs="Courier New" w:eastAsia="Courier New" w:hAnsi="Courier New"/>
-                <w:color w:val="1F2937"/>
-                <w:sz w:val="16"/>
-                <w:szCs w:val="16"/>
-                <w:shd w:fill="EEF1F6" w:color="auto" w:val="clear"/>
-              </w:rPr>
-              <w:t xml:space="preserve">Class|Spell|Rank</w:t>
+              <w:t xml:space="preserve">Tooltip of every rank, keyed Class|Spell|Rank: lines, text, level, school, coefficient, Classic status (cs) and text (cd)</w:t>
             </w:r>
           </w:p>
         </w:tc>
@@ -33173,7 +32853,7 @@
                 <w:sz w:val="19"/>
                 <w:szCs w:val="19"/>
               </w:rPr>
-              <w:t xml:space="preserve">Per class: what changed, as [name, text, icon]</w:t>
+              <w:t xml:space="preserve">Empty: the client has no notes on what changed for each class</w:t>
             </w:r>
           </w:p>
         </w:tc>
@@ -33454,7 +33134,7 @@
           <w:sz w:val="20"/>
           <w:szCs w:val="20"/>
         </w:rPr>
-        <w:t xml:space="preserve">KEEP THE NAMES  </w:t>
+        <w:t xml:space="preserve">HOW THE CLIENT IS READ  </w:t>
       </w:r>
       <w:r>
         <w:rPr>
@@ -33463,64 +33143,7 @@
           <w:sz w:val="20"/>
           <w:szCs w:val="20"/>
         </w:rPr>
-        <w:t xml:space="preserve">The class list is the keys of </w:t>
-      </w:r>
-      <w:r>
-        <w:rPr>
-          <w:rFonts w:ascii="Courier New" w:cs="Courier New" w:eastAsia="Courier New" w:hAnsi="Courier New"/>
-          <w:color w:val="1F2937"/>
-          <w:sz w:val="17"/>
-          <w:szCs w:val="17"/>
-          <w:shd w:fill="EEF1F6" w:color="auto" w:val="clear"/>
-        </w:rPr>
-        <w:t xml:space="preserve">talents</w:t>
-      </w:r>
-      <w:r>
-        <w:rPr>
-          <w:rFonts w:ascii="Calibri" w:cs="Calibri" w:eastAsia="Calibri" w:hAnsi="Calibri"/>
-          <w:color w:val="1F2937"/>
-          <w:sz w:val="20"/>
-          <w:szCs w:val="20"/>
-        </w:rPr>
-        <w:t xml:space="preserve">, and every other section finds a class by that name; a race must be written the same in </w:t>
-      </w:r>
-      <w:r>
-        <w:rPr>
-          <w:rFonts w:ascii="Courier New" w:cs="Courier New" w:eastAsia="Courier New" w:hAnsi="Courier New"/>
-          <w:color w:val="1F2937"/>
-          <w:sz w:val="17"/>
-          <w:szCs w:val="17"/>
-          <w:shd w:fill="EEF1F6" w:color="auto" w:val="clear"/>
-        </w:rPr>
-        <w:t xml:space="preserve">racials</w:t>
-      </w:r>
-      <w:r>
-        <w:rPr>
-          <w:rFonts w:ascii="Calibri" w:cs="Calibri" w:eastAsia="Calibri" w:hAnsi="Calibri"/>
-          <w:color w:val="1F2937"/>
-          <w:sz w:val="20"/>
-          <w:szCs w:val="20"/>
-        </w:rPr>
-        <w:t xml:space="preserve"> and </w:t>
-      </w:r>
-      <w:r>
-        <w:rPr>
-          <w:rFonts w:ascii="Courier New" w:cs="Courier New" w:eastAsia="Courier New" w:hAnsi="Courier New"/>
-          <w:color w:val="1F2937"/>
-          <w:sz w:val="17"/>
-          <w:szCs w:val="17"/>
-          <w:shd w:fill="EEF1F6" w:color="auto" w:val="clear"/>
-        </w:rPr>
-        <w:t xml:space="preserve">class_racials</w:t>
-      </w:r>
-      <w:r>
-        <w:rPr>
-          <w:rFonts w:ascii="Calibri" w:cs="Calibri" w:eastAsia="Calibri" w:hAnsi="Calibri"/>
-          <w:color w:val="1F2937"/>
-          <w:sz w:val="20"/>
-          <w:szCs w:val="20"/>
-        </w:rPr>
-        <w:t xml:space="preserve">.</w:t>
+        <w:t xml:space="preserve">Talents and Legacy perks are trait trees (TraitNode, TraitDefinition; the value of each rank from TraitDefinitionEffectPoints and CurvePoint). The three trees of a class sit side by side in one trait tree and are split by their positions (TreeGrid). Spellbook tabs are the class skill lines named like each talent tree, without the abilities the client marks as not taught (AcquireMethod 3). Racials are the skill lines named "... Racial"; Legacy challenges are the achievements with flag 0x10000000. SpellTextResolver turns the tooltip tokens into text ($s1, ${...}, $?s123[...][...], $&lt;name&gt;, $@spelltooltip...).</w:t>
       </w:r>
     </w:p>
     <w:tbl>
@@ -33646,7 +33269,7 @@
                 <w:sz w:val="19"/>
                 <w:szCs w:val="19"/>
               </w:rPr>
-              <w:t xml:space="preserve">Export generated</w:t>
+              <w:t xml:space="preserve">Read on</w:t>
             </w:r>
           </w:p>
         </w:tc>
@@ -33677,7 +33300,7 @@
                 <w:sz w:val="19"/>
                 <w:szCs w:val="19"/>
               </w:rPr>
-              <w:t xml:space="preserve">2026-10-26</w:t>
+              <w:t xml:space="preserve">Every new build; the first one on 2026-10-29</w:t>
             </w:r>
           </w:p>
         </w:tc>
@@ -33746,7 +33369,7 @@
                 <w:sz w:val="19"/>
                 <w:szCs w:val="19"/>
               </w:rPr>
-              <w:t xml:space="preserve">1.60.1.70630, read from the source line of each class (the launcher shows the first one found under Versión del juego)</w:t>
+              <w:t xml:space="preserve">1.60.1.70685 (compared with Classic Era 1.15.9.70576); the launcher shows it under Versión del juego</w:t>
             </w:r>
           </w:p>
         </w:tc>
@@ -33882,7 +33505,7 @@
                 <w:sz w:val="19"/>
                 <w:szCs w:val="19"/>
               </w:rPr>
-              <w:t xml:space="preserve">9 spellbooks, 585 spells, 1,826 rank texts</w:t>
+              <w:t xml:space="preserve">9 spellbooks, 591 spells, 1,828 rank texts</w:t>
             </w:r>
           </w:p>
         </w:tc>
@@ -34085,7 +33708,7 @@
                 <w:sz w:val="19"/>
                 <w:szCs w:val="19"/>
               </w:rPr>
-              <w:t xml:space="preserve">24 of the 27 trees match wow-forever.gg exactly; Hunter Marksmanship, Mage Arcane and Mage Frost follow an older build</w:t>
+              <w:t xml:space="preserve">Tree ids of config.json; a build that moves talents inside a tree changes the codes made before</w:t>
             </w:r>
           </w:p>
         </w:tc>
@@ -34739,7 +34362,7 @@
                 <w:sz w:val="19"/>
                 <w:szCs w:val="19"/>
               </w:rPr>
-              <w:t xml:space="preserve">Name of the General tab and where each rank is learned, by trainer code</w:t>
+              <w:t xml:space="preserve">Name of the General tab, extra tabs (Pets, Poisons, Demons) with the client skill lines they hold, and where each rank is learned (the client does not say, so it stays empty)</w:t>
             </w:r>
           </w:p>
         </w:tc>
@@ -34807,7 +34430,75 @@
                 <w:sz w:val="19"/>
                 <w:szCs w:val="19"/>
               </w:rPr>
-              <w:t xml:space="preserve">Name of placeholder perks and Spanish names of the challenge groups</w:t>
+              <w:t xml:space="preserve">Name of placeholder perks and Spanish names of the challenge groups (Classes, Tradeskills, Dungeons, Raids, Player vs. Player, Adventure)</w:t>
+            </w:r>
+          </w:p>
+        </w:tc>
+      </w:tr>
+      <w:tr>
+        <w:trPr>
+          <w:cantSplit/>
+        </w:trPr>
+        <w:tc>
+          <w:tcPr>
+            <w:tcW w:type="dxa" w:w="2484"/>
+            <w:tcBorders>
+              <w:top w:val="single" w:color="C9D3E3" w:sz="4"/>
+              <w:left w:val="single" w:color="C9D3E3" w:sz="4"/>
+              <w:bottom w:val="single" w:color="C9D3E3" w:sz="4"/>
+              <w:right w:val="single" w:color="C9D3E3" w:sz="4"/>
+            </w:tcBorders>
+            <w:tcMar>
+              <w:top w:type="dxa" w:w="60"/>
+              <w:left w:type="dxa" w:w="100"/>
+              <w:bottom w:type="dxa" w:w="60"/>
+              <w:right w:type="dxa" w:w="100"/>
+            </w:tcMar>
+          </w:tcPr>
+          <w:p>
+            <w:pPr>
+              <w:spacing w:after="30" w:line="250"/>
+            </w:pPr>
+            <w:r>
+              <w:rPr>
+                <w:rFonts w:ascii="Courier New" w:cs="Courier New" w:eastAsia="Courier New" w:hAnsi="Courier New"/>
+                <w:color w:val="1F2937"/>
+                <w:sz w:val="16"/>
+                <w:szCs w:val="16"/>
+                <w:shd w:fill="EEF1F6" w:color="auto" w:val="clear"/>
+              </w:rPr>
+              <w:t xml:space="preserve">client</w:t>
+            </w:r>
+          </w:p>
+        </w:tc>
+        <w:tc>
+          <w:tcPr>
+            <w:tcW w:type="dxa" w:w="6116"/>
+            <w:tcBorders>
+              <w:top w:val="single" w:color="C9D3E3" w:sz="4"/>
+              <w:left w:val="single" w:color="C9D3E3" w:sz="4"/>
+              <w:bottom w:val="single" w:color="C9D3E3" w:sz="4"/>
+              <w:right w:val="single" w:color="C9D3E3" w:sz="4"/>
+            </w:tcBorders>
+            <w:tcMar>
+              <w:top w:type="dxa" w:w="60"/>
+              <w:left w:type="dxa" w:w="100"/>
+              <w:bottom w:type="dxa" w:w="60"/>
+              <w:right w:type="dxa" w:w="100"/>
+            </w:tcMar>
+          </w:tcPr>
+          <w:p>
+            <w:pPr>
+              <w:spacing w:after="30" w:line="250"/>
+            </w:pPr>
+            <w:r>
+              <w:rPr>
+                <w:rFonts w:ascii="Calibri" w:cs="Calibri" w:eastAsia="Calibri" w:hAnsi="Calibri"/>
+                <w:color w:val="1F2937"/>
+                <w:sz w:val="19"/>
+                <w:szCs w:val="19"/>
+              </w:rPr>
+              <w:t xml:space="preserve">How the game data is read: wago.tools products (wowf, and wow_classic_era for the comparison), checkMinutes (60), the credit line, the talent and Legacy currencies of the client, the flag and points of Legacy challenges, and the names and icons of the Legacy trees (the client names none)</w:t>
             </w:r>
           </w:p>
         </w:tc>
@@ -34989,7 +34680,7 @@
           <w:sz w:val="21"/>
           <w:szCs w:val="21"/>
         </w:rPr>
-        <w:t xml:space="preserve">Class picker, a folding panel with what changed for the class, one tab per spellbook tab, a search that ignores case and accents, and a level limit. Each spell shows its ranks, tooltip lines, school, coefficient, where it is learned, notes and the Classic text.</w:t>
+        <w:t xml:space="preserve">Class picker, a folding panel with what changed for the class (only when the data has notes), one tab per spellbook tab, a search that ignores case and accents, and a level limit. Each spell shows its ranks, tooltip lines, school, coefficient and the Classic text when it changed.</w:t>
       </w:r>
     </w:p>
     <w:p>
@@ -35395,26 +35086,7 @@
                 <w:sz w:val="19"/>
                 <w:szCs w:val="19"/>
               </w:rPr>
-              <w:t xml:space="preserve">Background of each tree; one slot per tree of </w:t>
-            </w:r>
-            <w:r>
-              <w:rPr>
-                <w:rFonts w:ascii="Courier New" w:cs="Courier New" w:eastAsia="Courier New" w:hAnsi="Courier New"/>
-                <w:color w:val="1F2937"/>
-                <w:sz w:val="16"/>
-                <w:szCs w:val="16"/>
-                <w:shd w:fill="EEF1F6" w:color="auto" w:val="clear"/>
-              </w:rPr>
-              <w:t xml:space="preserve">data.json</w:t>
-            </w:r>
-            <w:r>
-              <w:rPr>
-                <w:rFonts w:ascii="Calibri" w:cs="Calibri" w:eastAsia="Calibri" w:hAnsi="Calibri"/>
-                <w:color w:val="1F2937"/>
-                <w:sz w:val="19"/>
-                <w:szCs w:val="19"/>
-              </w:rPr>
-              <w:t xml:space="preserve"> (27 today)</w:t>
+              <w:t xml:space="preserve">Background of each tree; one slot per tree of the game data (27 today)</w:t>
             </w:r>
           </w:p>
         </w:tc>
@@ -35464,7 +35136,7 @@
         <w:rPr>
           <w:rFonts w:ascii="Calibri" w:cs="Calibri" w:eastAsia="Calibri" w:hAnsi="Calibri"/>
         </w:rPr>
-        <w:t xml:space="preserve">Updating the game data</w:t>
+        <w:t xml:space="preserve">How the game data stays up to date</w:t>
       </w:r>
       <w:bookmarkEnd w:id="1"/>
     </w:p>
@@ -35477,7 +35149,7 @@
         <w:rPr>
           <w:rFonts w:ascii="Calibri" w:cs="Calibri" w:eastAsia="Calibri" w:hAnsi="Calibri"/>
         </w:rPr>
-        <w:t xml:space="preserve">Step 1 · Get or edit the file</w:t>
+        <w:t xml:space="preserve">Every hour</w:t>
       </w:r>
     </w:p>
     <w:p>
@@ -35492,7 +35164,7 @@
           <w:sz w:val="21"/>
           <w:szCs w:val="21"/>
         </w:rPr>
-        <w:t xml:space="preserve">Download </w:t>
+        <w:t xml:space="preserve">GameDataSyncService asks wago.tools for the builds of </w:t>
       </w:r>
       <w:r>
         <w:rPr>
@@ -35502,7 +35174,7 @@
           <w:szCs w:val="18"/>
           <w:shd w:fill="EEF1F6" w:color="auto" w:val="clear"/>
         </w:rPr>
-        <w:t xml:space="preserve">https://talentsforever.com/data.json</w:t>
+        <w:t xml:space="preserve">wowf</w:t>
       </w:r>
       <w:r>
         <w:rPr>
@@ -35511,7 +35183,7 @@
           <w:sz w:val="21"/>
           <w:szCs w:val="21"/>
         </w:rPr>
-        <w:t xml:space="preserve"> and check that </w:t>
+        <w:t xml:space="preserve"> every </w:t>
       </w:r>
       <w:r>
         <w:rPr>
@@ -35521,7 +35193,7 @@
           <w:szCs w:val="18"/>
           <w:shd w:fill="EEF1F6" w:color="auto" w:val="clear"/>
         </w:rPr>
-        <w:t xml:space="preserve">generated</w:t>
+        <w:t xml:space="preserve">checkMinutes</w:t>
       </w:r>
       <w:r>
         <w:rPr>
@@ -35530,7 +35202,45 @@
           <w:sz w:val="21"/>
           <w:szCs w:val="21"/>
         </w:rPr>
-        <w:t xml:space="preserve"> is newer than in the table above, or edit the current file. Keep the indentation: diffs stay small.</w:t>
+        <w:t xml:space="preserve"> (60; about 130 KB, compressed). When the newest one is not the build being served, it reads the client tables of that build and of the newest Classic Era build (about 50 tables, some 20 seconds and at most 170 MB of memory), builds the file, checks it, serves it and keeps a gzip copy (about 200 KB) as </w:t>
+      </w:r>
+      <w:r>
+        <w:rPr>
+          <w:rFonts w:ascii="Courier New" w:cs="Courier New" w:eastAsia="Courier New" w:hAnsi="Courier New"/>
+          <w:color w:val="1F2937"/>
+          <w:sz w:val="18"/>
+          <w:szCs w:val="18"/>
+          <w:shd w:fill="EEF1F6" w:color="auto" w:val="clear"/>
+        </w:rPr>
+        <w:t xml:space="preserve">data.json.gz</w:t>
+      </w:r>
+      <w:r>
+        <w:rPr>
+          <w:rFonts w:ascii="Calibri" w:cs="Calibri" w:eastAsia="Calibri" w:hAnsi="Calibri"/>
+          <w:color w:val="1F2937"/>
+          <w:sz w:val="21"/>
+          <w:szCs w:val="21"/>
+        </w:rPr>
+        <w:t xml:space="preserve"> in the private bucket </w:t>
+      </w:r>
+      <w:r>
+        <w:rPr>
+          <w:rFonts w:ascii="Courier New" w:cs="Courier New" w:eastAsia="Courier New" w:hAnsi="Courier New"/>
+          <w:color w:val="1F2937"/>
+          <w:sz w:val="18"/>
+          <w:szCs w:val="18"/>
+          <w:shd w:fill="EEF1F6" w:color="auto" w:val="clear"/>
+        </w:rPr>
+        <w:t xml:space="preserve">wow-forever-data</w:t>
+      </w:r>
+      <w:r>
+        <w:rPr>
+          <w:rFonts w:ascii="Calibri" w:cs="Calibri" w:eastAsia="Calibri" w:hAnsi="Calibri"/>
+          <w:color w:val="1F2937"/>
+          <w:sz w:val="21"/>
+          <w:szCs w:val="21"/>
+        </w:rPr>
+        <w:t xml:space="preserve">. The log says which build is served and how long it took.</w:t>
       </w:r>
     </w:p>
     <w:p>
@@ -35542,7 +35252,7 @@
         <w:rPr>
           <w:rFonts w:ascii="Calibri" w:cs="Calibri" w:eastAsia="Calibri" w:hAnsi="Calibri"/>
         </w:rPr>
-        <w:t xml:space="preserve">Step 2 · Check it</w:t>
+        <w:t xml:space="preserve">When the backend starts</w:t>
       </w:r>
     </w:p>
     <w:p>
@@ -35563,70 +35273,7 @@
           <w:sz w:val="17"/>
           <w:szCs w:val="17"/>
         </w:rPr>
-        <w:t xml:space="preserve">node -e "const d=require('./data.json');console.log(d.generated,</w:t>
-      </w:r>
-    </w:p>
-    <w:p>
-      <w:pPr>
-        <w:keepNext/>
-        <w:keepLines/>
-        <w:pBdr>
-          <w:left w:val="single" w:color="1F6FD1" w:sz="18" w:space="6"/>
-        </w:pBdr>
-        <w:shd w:fill="F3F4F6" w:color="auto" w:val="clear"/>
-        <w:spacing w:after="0" w:before="0" w:line="252"/>
-        <w:ind w:left="1200" w:right="60"/>
-      </w:pPr>
-      <w:r>
-        <w:rPr>
-          <w:rFonts w:ascii="Courier New" w:cs="Courier New" w:eastAsia="Courier New" w:hAnsi="Courier New"/>
-          <w:color w:val="1F2937"/>
-          <w:sz w:val="17"/>
-          <w:szCs w:val="17"/>
-        </w:rPr>
-        <w:t xml:space="preserve">  Object.keys(d.talents).join(' '),</w:t>
-      </w:r>
-    </w:p>
-    <w:p>
-      <w:pPr>
-        <w:keepNext/>
-        <w:keepLines/>
-        <w:pBdr>
-          <w:left w:val="single" w:color="1F6FD1" w:sz="18" w:space="6"/>
-        </w:pBdr>
-        <w:shd w:fill="F3F4F6" w:color="auto" w:val="clear"/>
-        <w:spacing w:after="0" w:before="0" w:line="252"/>
-        <w:ind w:left="1200" w:right="60"/>
-      </w:pPr>
-      <w:r>
-        <w:rPr>
-          <w:rFonts w:ascii="Courier New" w:cs="Courier New" w:eastAsia="Courier New" w:hAnsi="Courier New"/>
-          <w:color w:val="1F2937"/>
-          <w:sz w:val="17"/>
-          <w:szCs w:val="17"/>
-        </w:rPr>
-        <w:t xml:space="preserve">  Object.keys(d.spell_desc).length+' spell texts',</w:t>
-      </w:r>
-    </w:p>
-    <w:p>
-      <w:pPr>
-        <w:keepNext w:val="false"/>
-        <w:keepLines/>
-        <w:pBdr>
-          <w:left w:val="single" w:color="1F6FD1" w:sz="18" w:space="6"/>
-        </w:pBdr>
-        <w:shd w:fill="F3F4F6" w:color="auto" w:val="clear"/>
-        <w:spacing w:after="160" w:before="0" w:line="252"/>
-        <w:ind w:left="1200" w:right="60"/>
-      </w:pPr>
-      <w:r>
-        <w:rPr>
-          <w:rFonts w:ascii="Courier New" w:cs="Courier New" w:eastAsia="Courier New" w:hAnsi="Courier New"/>
-          <w:color w:val="1F2937"/>
-          <w:sz w:val="17"/>
-          <w:szCs w:val="17"/>
-        </w:rPr>
-        <w:t xml:space="preserve">  d.legacy.challenges.length+' challenges')"</w:t>
+        <w:t xml:space="preserve">It serves the kept copy at once and then checks wago.tools. Without a kept copy (first deploy, or the bucket is missing) it builds the file from the client a few seconds after start. While nothing is served it tries again every 5 minutes.</w:t>
       </w:r>
     </w:p>
     <w:p>
@@ -35638,7 +35285,7 @@
         <w:rPr>
           <w:rFonts w:ascii="Calibri" w:cs="Calibri" w:eastAsia="Calibri" w:hAnsi="Calibri"/>
         </w:rPr>
-        <w:t xml:space="preserve">Step 3 · Replace it</w:t>
+        <w:t xml:space="preserve">If a check fails</w:t>
       </w:r>
     </w:p>
     <w:p>
@@ -35653,26 +35300,7 @@
           <w:sz w:val="21"/>
           <w:szCs w:val="21"/>
         </w:rPr>
-        <w:t xml:space="preserve">Copy it over </w:t>
-      </w:r>
-      <w:r>
-        <w:rPr>
-          <w:rFonts w:ascii="Courier New" w:cs="Courier New" w:eastAsia="Courier New" w:hAnsi="Courier New"/>
-          <w:color w:val="1F2937"/>
-          <w:sz w:val="18"/>
-          <w:szCs w:val="18"/>
-          <w:shd w:fill="EEF1F6" w:color="auto" w:val="clear"/>
-        </w:rPr>
-        <w:t xml:space="preserve">backend/games/wow-forever/src/main/resources/wow-forever/data.json</w:t>
-      </w:r>
-      <w:r>
-        <w:rPr>
-          <w:rFonts w:ascii="Calibri" w:cs="Calibri" w:eastAsia="Calibri" w:hAnsi="Calibri"/>
-          <w:color w:val="1F2937"/>
-          <w:sz w:val="21"/>
-          <w:szCs w:val="21"/>
-        </w:rPr>
-        <w:t xml:space="preserve">, same path and name.</w:t>
+        <w:t xml:space="preserve">wago.tools unreachable, a table without a column the export reads, or a file that fails the check: the data being served stays, the log shows a warning and the next check tries again. If Storage fails, the new data is served but not kept.</w:t>
       </w:r>
     </w:p>
     <w:p>
@@ -35684,7 +35312,7 @@
         <w:rPr>
           <w:rFonts w:ascii="Calibri" w:cs="Calibri" w:eastAsia="Calibri" w:hAnsi="Calibri"/>
         </w:rPr>
-        <w:t xml:space="preserve">Step 4 · Check what else it needs</w:t>
+        <w:t xml:space="preserve">When the game changes</w:t>
       </w:r>
     </w:p>
     <w:tbl>
@@ -35740,7 +35368,7 @@
                 <w:sz w:val="19"/>
                 <w:szCs w:val="19"/>
               </w:rPr>
-              <w:t xml:space="preserve">If the new file...</w:t>
+              <w:t xml:space="preserve">If a new build...</w:t>
             </w:r>
           </w:p>
         </w:tc>
@@ -35841,7 +35469,7 @@
                 <w:sz w:val="19"/>
                 <w:szCs w:val="19"/>
               </w:rPr>
-              <w:t xml:space="preserve">Nothing else</w:t>
+              <w:t xml:space="preserve">Nothing: it shows up on its own</w:t>
             </w:r>
           </w:p>
         </w:tc>
@@ -36131,25 +35759,26 @@
               <w:bottom w:val="single" w:color="C9D3E3" w:sz="4"/>
               <w:right w:val="single" w:color="C9D3E3" w:sz="4"/>
             </w:tcBorders>
-            <w:tcMar>
-              <w:top w:type="dxa" w:w="60"/>
-              <w:left w:type="dxa" w:w="100"/>
-              <w:bottom w:type="dxa" w:w="60"/>
-              <w:right w:type="dxa" w:w="100"/>
-            </w:tcMar>
-          </w:tcPr>
-          <w:p>
-            <w:pPr>
-              <w:spacing w:after="30" w:line="250"/>
-            </w:pPr>
-            <w:r>
-              <w:rPr>
-                <w:rFonts w:ascii="Calibri" w:cs="Calibri" w:eastAsia="Calibri" w:hAnsi="Calibri"/>
-                <w:color w:val="1F2937"/>
-                <w:sz w:val="19"/>
-                <w:szCs w:val="19"/>
-              </w:rPr>
-              <w:t xml:space="preserve">Changes its structure</w:t>
+            <w:shd w:fill="F3F6FC" w:color="auto" w:val="clear"/>
+            <w:tcMar>
+              <w:top w:type="dxa" w:w="60"/>
+              <w:left w:type="dxa" w:w="100"/>
+              <w:bottom w:type="dxa" w:w="60"/>
+              <w:right w:type="dxa" w:w="100"/>
+            </w:tcMar>
+          </w:tcPr>
+          <w:p>
+            <w:pPr>
+              <w:spacing w:after="30" w:line="250"/>
+            </w:pPr>
+            <w:r>
+              <w:rPr>
+                <w:rFonts w:ascii="Calibri" w:cs="Calibri" w:eastAsia="Calibri" w:hAnsi="Calibri"/>
+                <w:color w:val="1F2937"/>
+                <w:sz w:val="19"/>
+                <w:szCs w:val="19"/>
+              </w:rPr>
+              <w:t xml:space="preserve">Adds a spellbook tab besides the talent trees</w:t>
             </w:r>
           </w:p>
         </w:tc>
@@ -36162,82 +35791,93 @@
               <w:bottom w:val="single" w:color="C9D3E3" w:sz="4"/>
               <w:right w:val="single" w:color="C9D3E3" w:sz="4"/>
             </w:tcBorders>
-            <w:tcMar>
-              <w:top w:type="dxa" w:w="60"/>
-              <w:left w:type="dxa" w:w="100"/>
-              <w:bottom w:type="dxa" w:w="60"/>
-              <w:right w:type="dxa" w:w="100"/>
-            </w:tcMar>
-          </w:tcPr>
-          <w:p>
-            <w:pPr>
-              <w:spacing w:after="30" w:line="250"/>
-            </w:pPr>
-            <w:r>
-              <w:rPr>
-                <w:rFonts w:ascii="Calibri" w:cs="Calibri" w:eastAsia="Calibri" w:hAnsi="Calibri"/>
-                <w:color w:val="1F2937"/>
-                <w:sz w:val="19"/>
-                <w:szCs w:val="19"/>
-              </w:rPr>
-              <w:t xml:space="preserve">Adapt </w:t>
-            </w:r>
-            <w:r>
-              <w:rPr>
-                <w:rFonts w:ascii="Courier New" w:cs="Courier New" w:eastAsia="Courier New" w:hAnsi="Courier New"/>
-                <w:color w:val="1F2937"/>
-                <w:sz w:val="16"/>
-                <w:szCs w:val="16"/>
-                <w:shd w:fill="EEF1F6" w:color="auto" w:val="clear"/>
-              </w:rPr>
-              <w:t xml:space="preserve">GameDataMapper</w:t>
-            </w:r>
-            <w:r>
-              <w:rPr>
-                <w:rFonts w:ascii="Calibri" w:cs="Calibri" w:eastAsia="Calibri" w:hAnsi="Calibri"/>
-                <w:color w:val="1F2937"/>
-                <w:sz w:val="19"/>
-                <w:szCs w:val="19"/>
-              </w:rPr>
-              <w:t xml:space="preserve"> (and </w:t>
-            </w:r>
-            <w:r>
-              <w:rPr>
-                <w:rFonts w:ascii="Courier New" w:cs="Courier New" w:eastAsia="Courier New" w:hAnsi="Courier New"/>
-                <w:color w:val="1F2937"/>
-                <w:sz w:val="16"/>
-                <w:szCs w:val="16"/>
-                <w:shd w:fill="EEF1F6" w:color="auto" w:val="clear"/>
-              </w:rPr>
-              <w:t xml:space="preserve">GameDataResponses</w:t>
-            </w:r>
-            <w:r>
-              <w:rPr>
-                <w:rFonts w:ascii="Calibri" w:cs="Calibri" w:eastAsia="Calibri" w:hAnsi="Calibri"/>
-                <w:color w:val="1F2937"/>
-                <w:sz w:val="19"/>
-                <w:szCs w:val="19"/>
-              </w:rPr>
-              <w:t xml:space="preserve"> if the models change), and </w:t>
-            </w:r>
-            <w:r>
-              <w:rPr>
-                <w:rFonts w:ascii="Courier New" w:cs="Courier New" w:eastAsia="Courier New" w:hAnsi="Courier New"/>
-                <w:color w:val="1F2937"/>
-                <w:sz w:val="16"/>
-                <w:szCs w:val="16"/>
-                <w:shd w:fill="EEF1F6" w:color="auto" w:val="clear"/>
-              </w:rPr>
-              <w:t xml:space="preserve">REQUIRED_SECTIONS</w:t>
-            </w:r>
-            <w:r>
-              <w:rPr>
-                <w:rFonts w:ascii="Calibri" w:cs="Calibri" w:eastAsia="Calibri" w:hAnsi="Calibri"/>
-                <w:color w:val="1F2937"/>
-                <w:sz w:val="19"/>
-                <w:szCs w:val="19"/>
-              </w:rPr>
-              <w:t xml:space="preserve"> if a required section is renamed</w:t>
+            <w:shd w:fill="F3F6FC" w:color="auto" w:val="clear"/>
+            <w:tcMar>
+              <w:top w:type="dxa" w:w="60"/>
+              <w:left w:type="dxa" w:w="100"/>
+              <w:bottom w:type="dxa" w:w="60"/>
+              <w:right w:type="dxa" w:w="100"/>
+            </w:tcMar>
+          </w:tcPr>
+          <w:p>
+            <w:pPr>
+              <w:spacing w:after="30" w:line="250"/>
+            </w:pPr>
+            <w:r>
+              <w:rPr>
+                <w:rFonts w:ascii="Calibri" w:cs="Calibri" w:eastAsia="Calibri" w:hAnsi="Calibri"/>
+                <w:color w:val="1F2937"/>
+                <w:sz w:val="19"/>
+                <w:szCs w:val="19"/>
+              </w:rPr>
+              <w:t xml:space="preserve">Add it, with its client skill lines, to spellbook.extraTabs in config.json</w:t>
+            </w:r>
+          </w:p>
+        </w:tc>
+      </w:tr>
+      <w:tr>
+        <w:trPr>
+          <w:cantSplit/>
+        </w:trPr>
+        <w:tc>
+          <w:tcPr>
+            <w:tcW w:type="dxa" w:w="3112"/>
+            <w:tcBorders>
+              <w:top w:val="single" w:color="C9D3E3" w:sz="4"/>
+              <w:left w:val="single" w:color="C9D3E3" w:sz="4"/>
+              <w:bottom w:val="single" w:color="C9D3E3" w:sz="4"/>
+              <w:right w:val="single" w:color="C9D3E3" w:sz="4"/>
+            </w:tcBorders>
+            <w:tcMar>
+              <w:top w:type="dxa" w:w="60"/>
+              <w:left w:type="dxa" w:w="100"/>
+              <w:bottom w:type="dxa" w:w="60"/>
+              <w:right w:type="dxa" w:w="100"/>
+            </w:tcMar>
+          </w:tcPr>
+          <w:p>
+            <w:pPr>
+              <w:spacing w:after="30" w:line="250"/>
+            </w:pPr>
+            <w:r>
+              <w:rPr>
+                <w:rFonts w:ascii="Calibri" w:cs="Calibri" w:eastAsia="Calibri" w:hAnsi="Calibri"/>
+                <w:color w:val="1F2937"/>
+                <w:sz w:val="19"/>
+                <w:szCs w:val="19"/>
+              </w:rPr>
+              <w:t xml:space="preserve">Renames a client table or column (the log names it)</w:t>
+            </w:r>
+          </w:p>
+        </w:tc>
+        <w:tc>
+          <w:tcPr>
+            <w:tcW w:type="dxa" w:w="5128"/>
+            <w:tcBorders>
+              <w:top w:val="single" w:color="C9D3E3" w:sz="4"/>
+              <w:left w:val="single" w:color="C9D3E3" w:sz="4"/>
+              <w:bottom w:val="single" w:color="C9D3E3" w:sz="4"/>
+              <w:right w:val="single" w:color="C9D3E3" w:sz="4"/>
+            </w:tcBorders>
+            <w:tcMar>
+              <w:top w:type="dxa" w:w="60"/>
+              <w:left w:type="dxa" w:w="100"/>
+              <w:bottom w:type="dxa" w:w="60"/>
+              <w:right w:type="dxa" w:w="100"/>
+            </w:tcMar>
+          </w:tcPr>
+          <w:p>
+            <w:pPr>
+              <w:spacing w:after="30" w:line="250"/>
+            </w:pPr>
+            <w:r>
+              <w:rPr>
+                <w:rFonts w:ascii="Calibri" w:cs="Calibri" w:eastAsia="Calibri" w:hAnsi="Calibri"/>
+                <w:color w:val="1F2937"/>
+                <w:sz w:val="19"/>
+                <w:szCs w:val="19"/>
+              </w:rPr>
+              <w:t xml:space="preserve">Adapt ClientTable (a column marked ? may be missing) and the exporter that reads it; GameDataMapper only if the sections change</w:t>
             </w:r>
           </w:p>
         </w:tc>
@@ -36257,7 +35897,7 @@
         <w:rPr>
           <w:rFonts w:ascii="Calibri" w:cs="Calibri" w:eastAsia="Calibri" w:hAnsi="Calibri"/>
         </w:rPr>
-        <w:t xml:space="preserve">Step 5 · Test and deploy</w:t>
+        <w:t xml:space="preserve">Changing the code that reads the client</w:t>
       </w:r>
     </w:p>
     <w:p>
@@ -36291,7 +35931,7 @@
           <w:sz w:val="21"/>
           <w:szCs w:val="21"/>
         </w:rPr>
-        <w:t xml:space="preserve"> (the game data tests use the real file), start the backend, open every tool as an admin and check the credit line and Versión del juego on the launcher show the new build. Then commit and push: Render rebuilds the image with the new file. Browsers check the ETag on every request, so players see the new data on their next visit or reload. Update the content table above and the changelog. To go back, restore the previous file from Git and redeploy.</w:t>
+        <w:t xml:space="preserve"> (the pure parts of the export have unit tests and the game data tests use the test file), then start the backend locally: the log shows the build read and served within seconds. Commit and push; Render rebuilds the image and the new code reads the next build. To go back, revert the commit; the kept copy is replaced by the next build read. Update this chapter and the changelog.</w:t>
       </w:r>
     </w:p>
     <w:p>
@@ -36464,7 +36104,74 @@
                 <w:sz w:val="19"/>
                 <w:szCs w:val="19"/>
               </w:rPr>
-              <w:t xml:space="preserve">A file is missing or invalid, or a required section is missing; the log says which</w:t>
+              <w:t xml:space="preserve">Nothing is served yet (first start without a kept copy and wago.tools unreachable); the log says why</w:t>
+            </w:r>
+          </w:p>
+        </w:tc>
+      </w:tr>
+      <w:tr>
+        <w:trPr>
+          <w:cantSplit/>
+        </w:trPr>
+        <w:tc>
+          <w:tcPr>
+            <w:tcW w:type="dxa" w:w="3662"/>
+            <w:tcBorders>
+              <w:top w:val="single" w:color="C9D3E3" w:sz="4"/>
+              <w:left w:val="single" w:color="C9D3E3" w:sz="4"/>
+              <w:bottom w:val="single" w:color="C9D3E3" w:sz="4"/>
+              <w:right w:val="single" w:color="C9D3E3" w:sz="4"/>
+            </w:tcBorders>
+            <w:tcMar>
+              <w:top w:type="dxa" w:w="60"/>
+              <w:left w:type="dxa" w:w="100"/>
+              <w:bottom w:type="dxa" w:w="60"/>
+              <w:right w:type="dxa" w:w="100"/>
+            </w:tcMar>
+          </w:tcPr>
+          <w:p>
+            <w:pPr>
+              <w:spacing w:after="30" w:line="250"/>
+            </w:pPr>
+            <w:r>
+              <w:rPr>
+                <w:rFonts w:ascii="Calibri" w:cs="Calibri" w:eastAsia="Calibri" w:hAnsi="Calibri"/>
+                <w:color w:val="1F2937"/>
+                <w:sz w:val="19"/>
+                <w:szCs w:val="19"/>
+              </w:rPr>
+              <w:t xml:space="preserve">Versión del juego does not change after a new build</w:t>
+            </w:r>
+          </w:p>
+        </w:tc>
+        <w:tc>
+          <w:tcPr>
+            <w:tcW w:type="dxa" w:w="4578"/>
+            <w:tcBorders>
+              <w:top w:val="single" w:color="C9D3E3" w:sz="4"/>
+              <w:left w:val="single" w:color="C9D3E3" w:sz="4"/>
+              <w:bottom w:val="single" w:color="C9D3E3" w:sz="4"/>
+              <w:right w:val="single" w:color="C9D3E3" w:sz="4"/>
+            </w:tcBorders>
+            <w:tcMar>
+              <w:top w:type="dxa" w:w="60"/>
+              <w:left w:type="dxa" w:w="100"/>
+              <w:bottom w:type="dxa" w:w="60"/>
+              <w:right w:type="dxa" w:w="100"/>
+            </w:tcMar>
+          </w:tcPr>
+          <w:p>
+            <w:pPr>
+              <w:spacing w:after="30" w:line="250"/>
+            </w:pPr>
+            <w:r>
+              <w:rPr>
+                <w:rFonts w:ascii="Calibri" w:cs="Calibri" w:eastAsia="Calibri" w:hAnsi="Calibri"/>
+                <w:color w:val="1F2937"/>
+                <w:sz w:val="19"/>
+                <w:szCs w:val="19"/>
+              </w:rPr>
+              <w:t xml:space="preserve">The next check has not run yet (up to an hour), or reading that build failed; the log says which</w:t>
             </w:r>
           </w:p>
         </w:tc>
@@ -36801,26 +36508,7 @@
           <w:sz w:val="21"/>
           <w:szCs w:val="21"/>
         </w:rPr>
-        <w:t xml:space="preserve">Keep the credit line on every tool page: CC BY 4.0 requires attribution with a link to talentsforever.com. </w:t>
-      </w:r>
-      <w:r>
-        <w:rPr>
-          <w:rFonts w:ascii="Courier New" w:cs="Courier New" w:eastAsia="Courier New" w:hAnsi="Courier New"/>
-          <w:color w:val="1F2937"/>
-          <w:sz w:val="18"/>
-          <w:szCs w:val="18"/>
-          <w:shd w:fill="EEF1F6" w:color="auto" w:val="clear"/>
-        </w:rPr>
-        <w:t xml:space="preserve">LICENSE</w:t>
-      </w:r>
-      <w:r>
-        <w:rPr>
-          <w:rFonts w:ascii="Calibri" w:cs="Calibri" w:eastAsia="Calibri" w:hAnsi="Calibri"/>
-          <w:color w:val="1F2937"/>
-          <w:sz w:val="21"/>
-          <w:szCs w:val="21"/>
-        </w:rPr>
-        <w:t xml:space="preserve"> records the licence of the file.</w:t>
+        <w:t xml:space="preserve">Keep the credit line on every tool page: it names where the data comes from (the game client, through wago.tools). LICENSE records how the data is used.</w:t>
       </w:r>
     </w:p>
     <w:p>
@@ -39666,64 +39354,7 @@
           <w:sz w:val="20"/>
           <w:szCs w:val="20"/>
         </w:rPr>
-        <w:t xml:space="preserve">Data files of a module (</w:t>
-      </w:r>
-      <w:r>
-        <w:rPr>
-          <w:rFonts w:ascii="Courier New" w:cs="Courier New" w:eastAsia="Courier New" w:hAnsi="Courier New"/>
-          <w:color w:val="1F2937"/>
-          <w:sz w:val="17"/>
-          <w:szCs w:val="17"/>
-          <w:shd w:fill="EEF1F6" w:color="auto" w:val="clear"/>
-        </w:rPr>
-        <w:t xml:space="preserve">data.json</w:t>
-      </w:r>
-      <w:r>
-        <w:rPr>
-          <w:rFonts w:ascii="Calibri" w:cs="Calibri" w:eastAsia="Calibri" w:hAnsi="Calibri"/>
-          <w:color w:val="1F2937"/>
-          <w:sz w:val="20"/>
-          <w:szCs w:val="20"/>
-        </w:rPr>
-        <w:t xml:space="preserve">, </w:t>
-      </w:r>
-      <w:r>
-        <w:rPr>
-          <w:rFonts w:ascii="Courier New" w:cs="Courier New" w:eastAsia="Courier New" w:hAnsi="Courier New"/>
-          <w:color w:val="1F2937"/>
-          <w:sz w:val="17"/>
-          <w:szCs w:val="17"/>
-          <w:shd w:fill="EEF1F6" w:color="auto" w:val="clear"/>
-        </w:rPr>
-        <w:t xml:space="preserve">config.json</w:t>
-      </w:r>
-      <w:r>
-        <w:rPr>
-          <w:rFonts w:ascii="Calibri" w:cs="Calibri" w:eastAsia="Calibri" w:hAnsi="Calibri"/>
-          <w:color w:val="1F2937"/>
-          <w:sz w:val="20"/>
-          <w:szCs w:val="20"/>
-        </w:rPr>
-        <w:t xml:space="preserve">, </w:t>
-      </w:r>
-      <w:r>
-        <w:rPr>
-          <w:rFonts w:ascii="Courier New" w:cs="Courier New" w:eastAsia="Courier New" w:hAnsi="Courier New"/>
-          <w:color w:val="1F2937"/>
-          <w:sz w:val="17"/>
-          <w:szCs w:val="17"/>
-          <w:shd w:fill="EEF1F6" w:color="auto" w:val="clear"/>
-        </w:rPr>
-        <w:t xml:space="preserve">types.json</w:t>
-      </w:r>
-      <w:r>
-        <w:rPr>
-          <w:rFonts w:ascii="Calibri" w:cs="Calibri" w:eastAsia="Calibri" w:hAnsi="Calibri"/>
-          <w:color w:val="1F2937"/>
-          <w:sz w:val="20"/>
-          <w:szCs w:val="20"/>
-        </w:rPr>
-        <w:t xml:space="preserve">) reach production with a backend deploy. Pictures and the catalog change from the admin screens without any deploy. Structural SQL changes must run in Supabase before the code that needs them is deployed.</w:t>
+        <w:t xml:space="preserve">Data files of a module (config.json, types.json) reach production with a backend deploy. The WoW Forever game data needs none: the backend reads every new game build on its own. Pictures and the catalog change from the admin screens without any deploy. Structural SQL changes must run in Supabase before the code that needs them is deployed.</w:t>
       </w:r>
     </w:p>
     <w:p>
@@ -40590,7 +40221,7 @@
                 <w:sz w:val="19"/>
                 <w:szCs w:val="19"/>
               </w:rPr>
-              <w:t xml:space="preserve">A data file of the module is missing or invalid</w:t>
+              <w:t xml:space="preserve">A data file of the module is missing or invalid; for WoW, no game data is served yet (see chapter 8)</w:t>
             </w:r>
           </w:p>
         </w:tc>
@@ -45490,7 +45121,7 @@
           <w:sz w:val="21"/>
           <w:szCs w:val="21"/>
         </w:rPr>
-        <w:t xml:space="preserve">Updating the game data is manual (download or edit, replace, redeploy).</w:t>
+        <w:t xml:space="preserve">The game data follows the client: server-side changes show up when a build carries them; the client says nothing of trainers, the General tab or what changed for each class.</w:t>
       </w:r>
     </w:p>
     <w:p>
@@ -45510,7 +45141,7 @@
           <w:sz w:val="21"/>
           <w:szCs w:val="21"/>
         </w:rPr>
-        <w:t xml:space="preserve">Three trees are one build behind wow-forever.gg, so their share codes may differ from that site.</w:t>
+        <w:t xml:space="preserve">Share codes use the tree ids of config.json; a build that moves talents inside a tree changes the codes made before.</w:t>
       </w:r>
     </w:p>
     <w:p>
@@ -45694,6 +45325,104 @@
                 <w:szCs w:val="19"/>
               </w:rPr>
               <w:t xml:space="preserve">Change</w:t>
+            </w:r>
+          </w:p>
+        </w:tc>
+      </w:tr>
+      <w:tr>
+        <w:trPr>
+          <w:cantSplit/>
+        </w:trPr>
+        <w:tc>
+          <w:tcPr>
+            <w:tcW w:type="dxa" w:w="955"/>
+            <w:tcBorders>
+              <w:top w:val="single" w:color="C9D3E3" w:sz="4"/>
+              <w:left w:val="single" w:color="C9D3E3" w:sz="4"/>
+              <w:bottom w:val="single" w:color="C9D3E3" w:sz="4"/>
+              <w:right w:val="single" w:color="C9D3E3" w:sz="4"/>
+            </w:tcBorders>
+            <w:tcMar>
+              <w:top w:type="dxa" w:w="60"/>
+              <w:left w:type="dxa" w:w="100"/>
+              <w:bottom w:type="dxa" w:w="60"/>
+              <w:right w:type="dxa" w:w="100"/>
+            </w:tcMar>
+          </w:tcPr>
+          <w:p>
+            <w:pPr>
+              <w:spacing w:after="30" w:line="250"/>
+            </w:pPr>
+            <w:r>
+              <w:rPr>
+                <w:rFonts w:ascii="Calibri" w:cs="Calibri" w:eastAsia="Calibri" w:hAnsi="Calibri"/>
+                <w:color w:val="1F2937"/>
+                <w:sz w:val="21"/>
+                <w:szCs w:val="21"/>
+              </w:rPr>
+              <w:t xml:space="preserve">2.5</w:t>
+            </w:r>
+          </w:p>
+        </w:tc>
+        <w:tc>
+          <w:tcPr>
+            <w:tcW w:type="dxa" w:w="1337"/>
+            <w:tcBorders>
+              <w:top w:val="single" w:color="C9D3E3" w:sz="4"/>
+              <w:left w:val="single" w:color="C9D3E3" w:sz="4"/>
+              <w:bottom w:val="single" w:color="C9D3E3" w:sz="4"/>
+              <w:right w:val="single" w:color="C9D3E3" w:sz="4"/>
+            </w:tcBorders>
+            <w:tcMar>
+              <w:top w:type="dxa" w:w="60"/>
+              <w:left w:type="dxa" w:w="100"/>
+              <w:bottom w:type="dxa" w:w="60"/>
+              <w:right w:type="dxa" w:w="100"/>
+            </w:tcMar>
+          </w:tcPr>
+          <w:p>
+            <w:pPr>
+              <w:spacing w:after="30" w:line="250"/>
+            </w:pPr>
+            <w:r>
+              <w:rPr>
+                <w:rFonts w:ascii="Calibri" w:cs="Calibri" w:eastAsia="Calibri" w:hAnsi="Calibri"/>
+                <w:color w:val="1F2937"/>
+                <w:sz w:val="21"/>
+                <w:szCs w:val="21"/>
+              </w:rPr>
+              <w:t xml:space="preserve">2026-10-29</w:t>
+            </w:r>
+          </w:p>
+        </w:tc>
+        <w:tc>
+          <w:tcPr>
+            <w:tcW w:type="dxa" w:w="6308"/>
+            <w:tcBorders>
+              <w:top w:val="single" w:color="C9D3E3" w:sz="4"/>
+              <w:left w:val="single" w:color="C9D3E3" w:sz="4"/>
+              <w:bottom w:val="single" w:color="C9D3E3" w:sz="4"/>
+              <w:right w:val="single" w:color="C9D3E3" w:sz="4"/>
+            </w:tcBorders>
+            <w:tcMar>
+              <w:top w:type="dxa" w:w="60"/>
+              <w:left w:type="dxa" w:w="100"/>
+              <w:bottom w:type="dxa" w:w="60"/>
+              <w:right w:type="dxa" w:w="100"/>
+            </w:tcMar>
+          </w:tcPr>
+          <w:p>
+            <w:pPr>
+              <w:spacing w:after="30" w:line="250"/>
+            </w:pPr>
+            <w:r>
+              <w:rPr>
+                <w:rFonts w:ascii="Calibri" w:cs="Calibri" w:eastAsia="Calibri" w:hAnsi="Calibri"/>
+                <w:color w:val="1F2937"/>
+                <w:sz w:val="21"/>
+                <w:szCs w:val="21"/>
+              </w:rPr>
+              <w:t xml:space="preserve">WoW Forever game data built by the backend from the game client through wago.tools (talents, spellbooks with Pets, Poisons and Demons, racials, Legacy, comparison with Classic Era), checked every hour and kept in the private bucket wow-forever-data; data.json removed; ObjectStorage can download private objects.</w:t>
             </w:r>
           </w:p>
         </w:tc>

</xml_diff>

<commit_message>
feat(wow-forever): menu on every tool, folding Legacy challenges and redesigned race cards
- The way back to the launcher and NTG goes into the common menu below the tablet
  breakpoint also on Spellbook, Legacy System and races.
- Legacy System: challenges further from the perk trees, one folding section per group
  with its progress bar, completed and earned points; two columns read top to bottom.
- Races: cards all the same size (icon, name and faction; classes; racials as icon and
  name with the description as a tooltip; Solo Priest folded over the card). Shared
  tooltip placement (ui/tooltip-position) and a new AbilityTooltip.
- Active racials show their cooldown, read from the tooltip parts of the exported text.
- Race icons from Wowhead's icon host (raceIconBaseUrl): Blizzard's lacks those of Night
  Elves, Undead and the Skyborne.
- LICENSE and technical manual 2.6.

Co-Authored-By: Claude Opus 5.5 <noreply@anthropic.com>
</commit_message>
<xml_diff>
--- a/docs/NTG — Technical Manual.docx
+++ b/docs/NTG — Technical Manual.docx
@@ -119,7 +119,7 @@
           <w:sz w:val="22"/>
           <w:szCs w:val="22"/>
         </w:rPr>
-        <w:t xml:space="preserve">Version 2.5  ·  Oct 29, 2026</w:t>
+        <w:t xml:space="preserve">Version 2.6  ·  Oct 29, 2026</w:t>
       </w:r>
     </w:p>
     <w:p>
@@ -15837,7 +15837,7 @@
                 <w:sz w:val="19"/>
                 <w:szCs w:val="19"/>
               </w:rPr>
-              <w:t xml:space="preserve">Way back to the launcher and to NTG in a menu at the left of the header (WowPage compactNav; only the talent calculator uses it so far)</w:t>
+              <w:t xml:space="preserve">Way back to the launcher and to NTG in a menu at the left of the header (WowPage compactNav: talent calculator, Spellbook, Legacy System and races)</w:t>
             </w:r>
           </w:p>
         </w:tc>
@@ -15869,7 +15869,7 @@
                 <w:sz w:val="19"/>
                 <w:szCs w:val="19"/>
               </w:rPr>
-              <w:t xml:space="preserve">WoW talent calculator</w:t>
+              <w:t xml:space="preserve">WoW Forever tool pages</w:t>
             </w:r>
           </w:p>
         </w:tc>
@@ -30547,7 +30547,7 @@
                 <w:sz w:val="19"/>
                 <w:szCs w:val="19"/>
               </w:rPr>
-              <w:t xml:space="preserve">Not stored: Blizzard's icon host</w:t>
+              <w:t xml:space="preserve">Not stored: Blizzard's icon host; race icons from Wowhead's, which also has those of Night Elves, Undead and the Skyborne</w:t>
             </w:r>
           </w:p>
         </w:tc>
@@ -33880,7 +33880,7 @@
                 <w:szCs w:val="16"/>
                 <w:shd w:fill="EEF1F6" w:color="auto" w:val="clear"/>
               </w:rPr>
-              <w:t xml:space="preserve">fallbackIcon</w:t>
+              <w:t xml:space="preserve">raceIconBaseUrl, fallbackIcon</w:t>
             </w:r>
           </w:p>
         </w:tc>
@@ -33930,7 +33930,7 @@
                 <w:sz w:val="19"/>
                 <w:szCs w:val="19"/>
               </w:rPr>
-              <w:t xml:space="preserve">) and the question-mark icon for missing ones</w:t>
+              <w:t xml:space="preserve">) and the question-mark icon for missing ones; raceIconBaseUrl is the host of the race icons (wow.zamimg.com/images/wow/icons/large), because Blizzard's lacks some of them</w:t>
             </w:r>
           </w:p>
         </w:tc>
@@ -34707,7 +34707,7 @@
           <w:sz w:val="21"/>
           <w:szCs w:val="21"/>
         </w:rPr>
-        <w:t xml:space="preserve">The three perk trees reuse the talent grid, tooltip and rules; a perk gate counts every other point of its tree instead of the rows above. Placeholder perks show as "Próximamente". Challenges are listed by group with a checkbox each, kept in the browser (</w:t>
+        <w:t xml:space="preserve">The three perk trees reuse the talent grid, tooltip and rules; a perk gate counts every other point of its tree instead of the rows above. Placeholder perks show as "Próximamente". Challenges are listed in one folding section per group (closed at first) showing its progress bar, completed and earned points, with a checkbox each, kept in the browser (</w:t>
       </w:r>
       <w:r>
         <w:rPr>
@@ -34753,7 +34753,7 @@
           <w:sz w:val="21"/>
           <w:szCs w:val="21"/>
         </w:rPr>
-        <w:t xml:space="preserve">Faction tabs, one card per race with its classes, racials and the class abilities that change with it, and a race-class table.</w:t>
+        <w:t xml:space="preserve">Faction tabs, one card per race, all the same size: icon, name and faction; the classes it can play; its racials as icon and name, with the cooldown at the right of the active ones, and the description as a tooltip from the pointer (or below on focus); and, folded, the class abilities that change with the race (Solo Priest), which open over the card. Then a race-class table. The cooldown is read when the data is served from the tooltip parts the export writes before each text (Instant, 2 min cooldown.).</w:t>
       </w:r>
     </w:p>
     <w:p>
@@ -35119,7 +35119,7 @@
           <w:sz w:val="21"/>
           <w:szCs w:val="21"/>
         </w:rPr>
-        <w:t xml:space="preserve"> declares these slots, so a new class or tree asks for its picture on its own in the Pictures screen. Icons are not stored: they load from Blizzard's host; a missing image is hidden and the name next to it still identifies the item.</w:t>
+        <w:t xml:space="preserve"> declares these slots, so a new class or tree asks for its picture on its own in the Pictures screen. Icons are not stored: they load from Blizzard's host (race icons from Wowhead's); a missing image is hidden and the name next to it still identifies the item.</w:t>
       </w:r>
     </w:p>
     <w:p>
@@ -45325,6 +45325,104 @@
                 <w:szCs w:val="19"/>
               </w:rPr>
               <w:t xml:space="preserve">Change</w:t>
+            </w:r>
+          </w:p>
+        </w:tc>
+      </w:tr>
+      <w:tr>
+        <w:trPr>
+          <w:cantSplit/>
+        </w:trPr>
+        <w:tc>
+          <w:tcPr>
+            <w:tcW w:type="dxa" w:w="955"/>
+            <w:tcBorders>
+              <w:top w:val="single" w:color="C9D3E3" w:sz="4"/>
+              <w:left w:val="single" w:color="C9D3E3" w:sz="4"/>
+              <w:bottom w:val="single" w:color="C9D3E3" w:sz="4"/>
+              <w:right w:val="single" w:color="C9D3E3" w:sz="4"/>
+            </w:tcBorders>
+            <w:tcMar>
+              <w:top w:type="dxa" w:w="60"/>
+              <w:left w:type="dxa" w:w="100"/>
+              <w:bottom w:type="dxa" w:w="60"/>
+              <w:right w:type="dxa" w:w="100"/>
+            </w:tcMar>
+          </w:tcPr>
+          <w:p>
+            <w:pPr>
+              <w:spacing w:after="30" w:line="250"/>
+            </w:pPr>
+            <w:r>
+              <w:rPr>
+                <w:rFonts w:ascii="Calibri" w:cs="Calibri" w:eastAsia="Calibri" w:hAnsi="Calibri"/>
+                <w:color w:val="1F2937"/>
+                <w:sz w:val="21"/>
+                <w:szCs w:val="21"/>
+              </w:rPr>
+              <w:t xml:space="preserve">2.6</w:t>
+            </w:r>
+          </w:p>
+        </w:tc>
+        <w:tc>
+          <w:tcPr>
+            <w:tcW w:type="dxa" w:w="1337"/>
+            <w:tcBorders>
+              <w:top w:val="single" w:color="C9D3E3" w:sz="4"/>
+              <w:left w:val="single" w:color="C9D3E3" w:sz="4"/>
+              <w:bottom w:val="single" w:color="C9D3E3" w:sz="4"/>
+              <w:right w:val="single" w:color="C9D3E3" w:sz="4"/>
+            </w:tcBorders>
+            <w:tcMar>
+              <w:top w:type="dxa" w:w="60"/>
+              <w:left w:type="dxa" w:w="100"/>
+              <w:bottom w:type="dxa" w:w="60"/>
+              <w:right w:type="dxa" w:w="100"/>
+            </w:tcMar>
+          </w:tcPr>
+          <w:p>
+            <w:pPr>
+              <w:spacing w:after="30" w:line="250"/>
+            </w:pPr>
+            <w:r>
+              <w:rPr>
+                <w:rFonts w:ascii="Calibri" w:cs="Calibri" w:eastAsia="Calibri" w:hAnsi="Calibri"/>
+                <w:color w:val="1F2937"/>
+                <w:sz w:val="21"/>
+                <w:szCs w:val="21"/>
+              </w:rPr>
+              <w:t xml:space="preserve">2026-10-29</w:t>
+            </w:r>
+          </w:p>
+        </w:tc>
+        <w:tc>
+          <w:tcPr>
+            <w:tcW w:type="dxa" w:w="6308"/>
+            <w:tcBorders>
+              <w:top w:val="single" w:color="C9D3E3" w:sz="4"/>
+              <w:left w:val="single" w:color="C9D3E3" w:sz="4"/>
+              <w:bottom w:val="single" w:color="C9D3E3" w:sz="4"/>
+              <w:right w:val="single" w:color="C9D3E3" w:sz="4"/>
+            </w:tcBorders>
+            <w:tcMar>
+              <w:top w:type="dxa" w:w="60"/>
+              <w:left w:type="dxa" w:w="100"/>
+              <w:bottom w:type="dxa" w:w="60"/>
+              <w:right w:type="dxa" w:w="100"/>
+            </w:tcMar>
+          </w:tcPr>
+          <w:p>
+            <w:pPr>
+              <w:spacing w:after="30" w:line="250"/>
+            </w:pPr>
+            <w:r>
+              <w:rPr>
+                <w:rFonts w:ascii="Calibri" w:cs="Calibri" w:eastAsia="Calibri" w:hAnsi="Calibri"/>
+                <w:color w:val="1F2937"/>
+                <w:sz w:val="21"/>
+                <w:szCs w:val="21"/>
+              </w:rPr>
+              <w:t xml:space="preserve">WoW Forever: the way back to the launcher and NTG in the menu also on Spellbook, Legacy System and races; Legacy challenges as folding groups with their progress, further from the perk trees; race cards all the same size, racials with a tooltip and their cooldown, Solo Priest folded; race icons from Wowhead (raceIconBaseUrl), which has those of Night Elves, Undead and the Skyborne</w:t>
             </w:r>
           </w:p>
         </w:tc>
@@ -46770,7 +46868,7 @@
         <w:szCs w:val="16"/>
       </w:rPr>
       <w:tab/>
-      <w:t xml:space="preserve">Version 2.4</w:t>
+      <w:t xml:space="preserve">Version 2.6</w:t>
     </w:r>
   </w:p>
 </w:hdr>

</xml_diff>

<commit_message>
feat(wow-forever): spellbook as a book like the game's
- Frontend: the spells sit in an open book drawn with CSS (leather cover with the class
  portrait, two pages of six slots, arrows with the page number) and a side tab with the
  icon of each talent tree; on phones the tabs go on top and the pages stack. Each slot
  shows the highest rank learned by the level limit, or one slot per rank with
  "Mostrar todos los rangos", and the game-like tooltip of that rank (new SpellTooltip).
  Larger book on desktop.
- Backend: spellbook tabs carry an icon, the icon of the talent tree of the same name
  already in the data, or spellbook.tabIcons in config.json for General, Pets, Poisons
  and Demons; no export change.
- Technical manual 2.7.

Co-Authored-By: Claude Opus 5.5 <noreply@anthropic.com>
</commit_message>
<xml_diff>
--- a/docs/NTG — Technical Manual.docx
+++ b/docs/NTG — Technical Manual.docx
@@ -119,7 +119,7 @@
           <w:sz w:val="22"/>
           <w:szCs w:val="22"/>
         </w:rPr>
-        <w:t xml:space="preserve">Version 2.6  ·  Oct 29, 2026</w:t>
+        <w:t xml:space="preserve">Version 2.7  ·  Oct 29, 2026</w:t>
       </w:r>
     </w:p>
     <w:p>
@@ -29720,7 +29720,7 @@
                 <w:sz w:val="19"/>
                 <w:szCs w:val="19"/>
               </w:rPr>
-              <w:t xml:space="preserve">Every trainer spell of each class, rank by rank</w:t>
+              <w:t xml:space="preserve">Every trainer spell of each class in a book like the game's, rank by rank</w:t>
             </w:r>
           </w:p>
         </w:tc>
@@ -31689,7 +31689,7 @@
                 <w:sz w:val="19"/>
                 <w:szCs w:val="19"/>
               </w:rPr>
-              <w:t xml:space="preserve">Tabs (one per talent tree, plus Pets, Poisons or Demons), spells with every rank and the spells Classic had that are gone</w:t>
+              <w:t xml:space="preserve">Tabs (one per talent tree, plus Pets, Poisons or Demons) with their icon, spells with every rank and the spells Classic had that are gone</w:t>
             </w:r>
           </w:p>
         </w:tc>
@@ -34362,7 +34362,7 @@
                 <w:sz w:val="19"/>
                 <w:szCs w:val="19"/>
               </w:rPr>
-              <w:t xml:space="preserve">Name of the General tab, extra tabs (Pets, Poisons, Demons) with the client skill lines they hold, and where each rank is learned (the client does not say, so it stays empty)</w:t>
+              <w:t xml:space="preserve">Name of the General tab, extra tabs (Pets, Poisons, Demons) with the client skill lines they hold, tabIcons (the icon of the tabs that are not a talent tree; a tree tab shows the icon of its tree), and where each rank is learned (the client does not say, so it stays empty)</w:t>
             </w:r>
           </w:p>
         </w:tc>
@@ -34680,7 +34680,7 @@
           <w:sz w:val="21"/>
           <w:szCs w:val="21"/>
         </w:rPr>
-        <w:t xml:space="preserve">Class picker, a folding panel with what changed for the class (only when the data has notes), one tab per spellbook tab, a search that ignores case and accents, and a level limit. Each spell shows its ranks, tooltip lines, school, coefficient and the Classic text when it changed.</w:t>
+        <w:t xml:space="preserve">Class picker, a folding panel with what changed for the class (only when the data has notes), a search that ignores case and accents, a level limit and Mostrar todos los rangos. The spells sit in a book like the game's, drawn with CSS (no game interface files): a leather cover with the class portrait, two pages of six slots (twelve per spread, ordered by the level each spell is learned at), arrows with the page number and a tab at the side with the icon of each talent tree (the tabs that are not a tree take theirs from spellbook.tabIcons). A slot shows the highest rank learned by the level limit, or one slot per rank with Mostrar todos los rangos. Its tooltip, from the pointer or below on focus, shows the rank, the game tooltip lines and text, and then level, school, coefficient, where it is learned, notes, whether a talent gives it and how it compares with Classic. On phones the tabs go on top and the two pages one under the other.</w:t>
       </w:r>
     </w:p>
     <w:p>
@@ -35810,7 +35810,7 @@
                 <w:sz w:val="19"/>
                 <w:szCs w:val="19"/>
               </w:rPr>
-              <w:t xml:space="preserve">Add it, with its client skill lines, to spellbook.extraTabs in config.json</w:t>
+              <w:t xml:space="preserve">Add it, with its client skill lines, to spellbook.extraTabs in config.json, and its icon to spellbook.tabIcons</w:t>
             </w:r>
           </w:p>
         </w:tc>
@@ -45325,6 +45325,104 @@
                 <w:szCs w:val="19"/>
               </w:rPr>
               <w:t xml:space="preserve">Change</w:t>
+            </w:r>
+          </w:p>
+        </w:tc>
+      </w:tr>
+      <w:tr>
+        <w:trPr>
+          <w:cantSplit/>
+        </w:trPr>
+        <w:tc>
+          <w:tcPr>
+            <w:tcW w:type="dxa" w:w="955"/>
+            <w:tcBorders>
+              <w:top w:val="single" w:color="C9D3E3" w:sz="4"/>
+              <w:left w:val="single" w:color="C9D3E3" w:sz="4"/>
+              <w:bottom w:val="single" w:color="C9D3E3" w:sz="4"/>
+              <w:right w:val="single" w:color="C9D3E3" w:sz="4"/>
+            </w:tcBorders>
+            <w:tcMar>
+              <w:top w:type="dxa" w:w="60"/>
+              <w:left w:type="dxa" w:w="100"/>
+              <w:bottom w:type="dxa" w:w="60"/>
+              <w:right w:type="dxa" w:w="100"/>
+            </w:tcMar>
+          </w:tcPr>
+          <w:p>
+            <w:pPr>
+              <w:spacing w:after="30" w:line="250"/>
+            </w:pPr>
+            <w:r>
+              <w:rPr>
+                <w:rFonts w:ascii="Calibri" w:cs="Calibri" w:eastAsia="Calibri" w:hAnsi="Calibri"/>
+                <w:color w:val="1F2937"/>
+                <w:sz w:val="21"/>
+                <w:szCs w:val="21"/>
+              </w:rPr>
+              <w:t xml:space="preserve">2.7</w:t>
+            </w:r>
+          </w:p>
+        </w:tc>
+        <w:tc>
+          <w:tcPr>
+            <w:tcW w:type="dxa" w:w="1337"/>
+            <w:tcBorders>
+              <w:top w:val="single" w:color="C9D3E3" w:sz="4"/>
+              <w:left w:val="single" w:color="C9D3E3" w:sz="4"/>
+              <w:bottom w:val="single" w:color="C9D3E3" w:sz="4"/>
+              <w:right w:val="single" w:color="C9D3E3" w:sz="4"/>
+            </w:tcBorders>
+            <w:tcMar>
+              <w:top w:type="dxa" w:w="60"/>
+              <w:left w:type="dxa" w:w="100"/>
+              <w:bottom w:type="dxa" w:w="60"/>
+              <w:right w:type="dxa" w:w="100"/>
+            </w:tcMar>
+          </w:tcPr>
+          <w:p>
+            <w:pPr>
+              <w:spacing w:after="30" w:line="250"/>
+            </w:pPr>
+            <w:r>
+              <w:rPr>
+                <w:rFonts w:ascii="Calibri" w:cs="Calibri" w:eastAsia="Calibri" w:hAnsi="Calibri"/>
+                <w:color w:val="1F2937"/>
+                <w:sz w:val="21"/>
+                <w:szCs w:val="21"/>
+              </w:rPr>
+              <w:t xml:space="preserve">2026-10-29</w:t>
+            </w:r>
+          </w:p>
+        </w:tc>
+        <w:tc>
+          <w:tcPr>
+            <w:tcW w:type="dxa" w:w="6308"/>
+            <w:tcBorders>
+              <w:top w:val="single" w:color="C9D3E3" w:sz="4"/>
+              <w:left w:val="single" w:color="C9D3E3" w:sz="4"/>
+              <w:bottom w:val="single" w:color="C9D3E3" w:sz="4"/>
+              <w:right w:val="single" w:color="C9D3E3" w:sz="4"/>
+            </w:tcBorders>
+            <w:tcMar>
+              <w:top w:type="dxa" w:w="60"/>
+              <w:left w:type="dxa" w:w="100"/>
+              <w:bottom w:type="dxa" w:w="60"/>
+              <w:right w:type="dxa" w:w="100"/>
+            </w:tcMar>
+          </w:tcPr>
+          <w:p>
+            <w:pPr>
+              <w:spacing w:after="30" w:line="250"/>
+            </w:pPr>
+            <w:r>
+              <w:rPr>
+                <w:rFonts w:ascii="Calibri" w:cs="Calibri" w:eastAsia="Calibri" w:hAnsi="Calibri"/>
+                <w:color w:val="1F2937"/>
+                <w:sz w:val="21"/>
+                <w:szCs w:val="21"/>
+              </w:rPr>
+              <w:t xml:space="preserve">WoW Forever Spellbook as a book like the game's (two pages of six slots, side tabs with the icon of each talent tree, pages to turn, the tooltip of each rank, Mostrar todos los rangos); spellbook tabs carry an icon (spellbook.tabIcons for the tabs that are not a tree)</w:t>
             </w:r>
           </w:p>
         </w:tc>
@@ -46868,7 +46966,7 @@
         <w:szCs w:val="16"/>
       </w:rPr>
       <w:tab/>
-      <w:t xml:space="preserve">Version 2.6</w:t>
+      <w:t xml:space="preserve">Version 2.7</w:t>
     </w:r>
   </w:p>
 </w:hdr>

</xml_diff>

<commit_message>
feat(wow-forever): blue posts of the official forums on the launcher
The launcher news panel gets two tabs, Noticias and Blue posts. GET
/wow-forever/blue-posts serves the 20 newest posts of Blizzard employees
about WoW Forever, read page by page from the Blizzard tracker of the
official forums (on-demand copy of 10 minutes, cross-posted announcements
kept once, bluePosts section in config.json). The on-demand copy and the
HTML text cleaning are now shared by the news and the blue posts. The news
panel reaches the riveted bars and the frame on every screen size.
Manual 2.8 and LICENSE credit the Blizzard forums.

Co-Authored-By: Claude Opus 5.5 <noreply@anthropic.com>
</commit_message>
<xml_diff>
--- a/docs/NTG — Technical Manual.docx
+++ b/docs/NTG — Technical Manual.docx
@@ -119,7 +119,7 @@
           <w:sz w:val="22"/>
           <w:szCs w:val="22"/>
         </w:rPr>
-        <w:t xml:space="preserve">Version 2.7  ·  Oct 29, 2026</w:t>
+        <w:t xml:space="preserve">Version 2.8  ·  Oct 29, 2026</w:t>
       </w:r>
     </w:p>
     <w:p>
@@ -30306,7 +30306,7 @@
                 <w:sz w:val="19"/>
                 <w:szCs w:val="19"/>
               </w:rPr>
-              <w:t xml:space="preserve">Texts in Spanish, faction names, tool list, news feed settings, talent rules, tree ids of share codes, icon host, extra spellbook tabs, and where and how the game client is read</w:t>
+              <w:t xml:space="preserve">Texts in Spanish, faction names, tool list, news feed and blue tracker settings, talent rules, tree ids of share codes, icon host, extra spellbook tabs, and where and how the game client is read</w:t>
             </w:r>
           </w:p>
         </w:tc>
@@ -30814,6 +30814,123 @@
                 <w:szCs w:val="19"/>
               </w:rPr>
               <w:t xml:space="preserve">Nothing: new items show up on their own within about five minutes</w:t>
+            </w:r>
+          </w:p>
+        </w:tc>
+      </w:tr>
+      <w:tr>
+        <w:trPr>
+          <w:cantSplit/>
+        </w:trPr>
+        <w:tc>
+          <w:tcPr>
+            <w:tcW w:type="dxa" w:w="3248"/>
+            <w:tcBorders>
+              <w:top w:val="single" w:color="C9D3E3" w:sz="4"/>
+              <w:left w:val="single" w:color="C9D3E3" w:sz="4"/>
+              <w:bottom w:val="single" w:color="C9D3E3" w:sz="4"/>
+              <w:right w:val="single" w:color="C9D3E3" w:sz="4"/>
+            </w:tcBorders>
+            <w:tcMar>
+              <w:top w:type="dxa" w:w="60"/>
+              <w:left w:type="dxa" w:w="100"/>
+              <w:bottom w:type="dxa" w:w="60"/>
+              <w:right w:type="dxa" w:w="100"/>
+            </w:tcMar>
+          </w:tcPr>
+          <w:p>
+            <w:pPr>
+              <w:spacing w:after="30" w:line="250"/>
+            </w:pPr>
+            <w:r>
+              <w:rPr>
+                <w:rFonts w:ascii="Calibri" w:cs="Calibri" w:eastAsia="Calibri" w:hAnsi="Calibri"/>
+                <w:color w:val="1F2937"/>
+                <w:sz w:val="19"/>
+                <w:szCs w:val="19"/>
+              </w:rPr>
+              <w:t xml:space="preserve">Launcher blue posts</w:t>
+            </w:r>
+          </w:p>
+        </w:tc>
+        <w:tc>
+          <w:tcPr>
+            <w:tcW w:type="dxa" w:w="2484"/>
+            <w:tcBorders>
+              <w:top w:val="single" w:color="C9D3E3" w:sz="4"/>
+              <w:left w:val="single" w:color="C9D3E3" w:sz="4"/>
+              <w:bottom w:val="single" w:color="C9D3E3" w:sz="4"/>
+              <w:right w:val="single" w:color="C9D3E3" w:sz="4"/>
+            </w:tcBorders>
+            <w:tcMar>
+              <w:top w:type="dxa" w:w="60"/>
+              <w:left w:type="dxa" w:w="100"/>
+              <w:bottom w:type="dxa" w:w="60"/>
+              <w:right w:type="dxa" w:w="100"/>
+            </w:tcMar>
+          </w:tcPr>
+          <w:p>
+            <w:pPr>
+              <w:spacing w:after="30" w:line="250"/>
+            </w:pPr>
+            <w:r>
+              <w:rPr>
+                <w:rFonts w:ascii="Calibri" w:cs="Calibri" w:eastAsia="Calibri" w:hAnsi="Calibri"/>
+                <w:color w:val="1F2937"/>
+                <w:sz w:val="19"/>
+                <w:szCs w:val="19"/>
+              </w:rPr>
+              <w:t xml:space="preserve">Blizzard tracker of the official forums (JSON), read by the backend</w:t>
+            </w:r>
+            <w:r>
+              <w:rPr>
+                <w:rFonts w:ascii="Courier New" w:cs="Courier New" w:eastAsia="Courier New" w:hAnsi="Courier New"/>
+                <w:color w:val="1F2937"/>
+                <w:sz w:val="16"/>
+                <w:szCs w:val="16"/>
+                <w:shd w:fill="EEF1F6" w:color="auto" w:val="clear"/>
+              </w:rPr>
+              <w:t xml:space="preserve"/>
+            </w:r>
+            <w:r>
+              <w:rPr>
+                <w:rFonts w:ascii="Calibri" w:cs="Calibri" w:eastAsia="Calibri" w:hAnsi="Calibri"/>
+                <w:color w:val="1F2937"/>
+                <w:sz w:val="19"/>
+                <w:szCs w:val="19"/>
+              </w:rPr>
+              <w:t xml:space="preserve"/>
+            </w:r>
+          </w:p>
+        </w:tc>
+        <w:tc>
+          <w:tcPr>
+            <w:tcW w:type="dxa" w:w="2868"/>
+            <w:tcBorders>
+              <w:top w:val="single" w:color="C9D3E3" w:sz="4"/>
+              <w:left w:val="single" w:color="C9D3E3" w:sz="4"/>
+              <w:bottom w:val="single" w:color="C9D3E3" w:sz="4"/>
+              <w:right w:val="single" w:color="C9D3E3" w:sz="4"/>
+            </w:tcBorders>
+            <w:tcMar>
+              <w:top w:type="dxa" w:w="60"/>
+              <w:left w:type="dxa" w:w="100"/>
+              <w:bottom w:type="dxa" w:w="60"/>
+              <w:right w:type="dxa" w:w="100"/>
+            </w:tcMar>
+          </w:tcPr>
+          <w:p>
+            <w:pPr>
+              <w:spacing w:after="30" w:line="250"/>
+            </w:pPr>
+            <w:r>
+              <w:rPr>
+                <w:rFonts w:ascii="Calibri" w:cs="Calibri" w:eastAsia="Calibri" w:hAnsi="Calibri"/>
+                <w:color w:val="1F2937"/>
+                <w:sz w:val="19"/>
+                <w:szCs w:val="19"/>
+              </w:rPr>
+              <w:t xml:space="preserve">Nothing: new posts show up on their own within about ten minutes</w:t>
             </w:r>
           </w:p>
         </w:tc>
@@ -31049,7 +31166,7 @@
           <w:sz w:val="17"/>
           <w:szCs w:val="17"/>
         </w:rPr>
-        <w:t xml:space="preserve">├── features/news/              NewsController, NewsResponses, NewsService, NewsFeedClient, NewsFeedParser</w:t>
+        <w:t xml:space="preserve">├── features/news/              News/BluePosts controllers and services, feed client, parsers, OnDemandCopy</w:t>
       </w:r>
     </w:p>
     <w:p>
@@ -31238,7 +31355,7 @@
           <w:sz w:val="17"/>
           <w:szCs w:val="17"/>
         </w:rPr>
-        <w:t xml:space="preserve">├── news/                     NewsApi (no session cache), models, Spanish dates, news-panel</w:t>
+        <w:t xml:space="preserve">├── news/                     NewsApi (no session cache), models, Spanish dates, news-panel (two tabs)</w:t>
       </w:r>
     </w:p>
     <w:p>
@@ -32086,6 +32203,133 @@
           </w:p>
         </w:tc>
       </w:tr>
+      <w:tr>
+        <w:trPr>
+          <w:cantSplit/>
+        </w:trPr>
+        <w:tc>
+          <w:tcPr>
+            <w:tcW w:type="dxa" w:w="2866"/>
+            <w:tcBorders>
+              <w:top w:val="single" w:color="C9D3E3" w:sz="4"/>
+              <w:left w:val="single" w:color="C9D3E3" w:sz="4"/>
+              <w:bottom w:val="single" w:color="C9D3E3" w:sz="4"/>
+              <w:right w:val="single" w:color="C9D3E3" w:sz="4"/>
+            </w:tcBorders>
+            <w:shd w:fill="F3F6FC" w:color="auto" w:val="clear"/>
+            <w:tcMar>
+              <w:top w:type="dxa" w:w="60"/>
+              <w:left w:type="dxa" w:w="100"/>
+              <w:bottom w:type="dxa" w:w="60"/>
+              <w:right w:type="dxa" w:w="100"/>
+            </w:tcMar>
+          </w:tcPr>
+          <w:p>
+            <w:pPr>
+              <w:spacing w:after="30" w:line="250"/>
+            </w:pPr>
+            <w:r>
+              <w:rPr>
+                <w:rFonts w:ascii="Courier New" w:cs="Courier New" w:eastAsia="Courier New" w:hAnsi="Courier New"/>
+                <w:color w:val="1F2937"/>
+                <w:sz w:val="16"/>
+                <w:szCs w:val="16"/>
+                <w:shd w:fill="EEF1F6" w:color="auto" w:val="clear"/>
+              </w:rPr>
+              <w:t xml:space="preserve">GET /blue-posts</w:t>
+            </w:r>
+          </w:p>
+        </w:tc>
+        <w:tc>
+          <w:tcPr>
+            <w:tcW w:type="dxa" w:w="5734"/>
+            <w:tcBorders>
+              <w:top w:val="single" w:color="C9D3E3" w:sz="4"/>
+              <w:left w:val="single" w:color="C9D3E3" w:sz="4"/>
+              <w:bottom w:val="single" w:color="C9D3E3" w:sz="4"/>
+              <w:right w:val="single" w:color="C9D3E3" w:sz="4"/>
+            </w:tcBorders>
+            <w:shd w:fill="F3F6FC" w:color="auto" w:val="clear"/>
+            <w:tcMar>
+              <w:top w:type="dxa" w:w="60"/>
+              <w:left w:type="dxa" w:w="100"/>
+              <w:bottom w:type="dxa" w:w="60"/>
+              <w:right w:type="dxa" w:w="100"/>
+            </w:tcMar>
+          </w:tcPr>
+          <w:p>
+            <w:pPr>
+              <w:spacing w:after="30" w:line="250"/>
+            </w:pPr>
+            <w:r>
+              <w:rPr>
+                <w:rFonts w:ascii="Calibri" w:cs="Calibri" w:eastAsia="Calibri" w:hAnsi="Calibri"/>
+                <w:color w:val="1F2937"/>
+                <w:sz w:val="19"/>
+                <w:szCs w:val="19"/>
+              </w:rPr>
+              <w:t xml:space="preserve">Latest 20 blue posts about WoW Forever (title, reply, author, summary, publishedAt, url) and the credit of the source; no-cache with ETag, not tied to a deploy</w:t>
+            </w:r>
+            <w:r>
+              <w:rPr>
+                <w:rFonts w:ascii="Courier New" w:cs="Courier New" w:eastAsia="Courier New" w:hAnsi="Courier New"/>
+                <w:color w:val="1F2937"/>
+                <w:sz w:val="16"/>
+                <w:szCs w:val="16"/>
+                <w:shd w:fill="EEF1F6" w:color="auto" w:val="clear"/>
+              </w:rPr>
+              <w:t xml:space="preserve"/>
+            </w:r>
+            <w:r>
+              <w:rPr>
+                <w:rFonts w:ascii="Calibri" w:cs="Calibri" w:eastAsia="Calibri" w:hAnsi="Calibri"/>
+                <w:color w:val="1F2937"/>
+                <w:sz w:val="19"/>
+                <w:szCs w:val="19"/>
+              </w:rPr>
+              <w:t xml:space="preserve"/>
+            </w:r>
+            <w:r>
+              <w:rPr>
+                <w:rFonts w:ascii="Courier New" w:cs="Courier New" w:eastAsia="Courier New" w:hAnsi="Courier New"/>
+                <w:color w:val="1F2937"/>
+                <w:sz w:val="16"/>
+                <w:szCs w:val="16"/>
+                <w:shd w:fill="EEF1F6" w:color="auto" w:val="clear"/>
+              </w:rPr>
+              <w:t xml:space="preserve"/>
+            </w:r>
+            <w:r>
+              <w:rPr>
+                <w:rFonts w:ascii="Calibri" w:cs="Calibri" w:eastAsia="Calibri" w:hAnsi="Calibri"/>
+                <w:color w:val="1F2937"/>
+                <w:sz w:val="19"/>
+                <w:szCs w:val="19"/>
+              </w:rPr>
+              <w:t xml:space="preserve"/>
+            </w:r>
+            <w:r>
+              <w:rPr>
+                <w:rFonts w:ascii="Courier New" w:cs="Courier New" w:eastAsia="Courier New" w:hAnsi="Courier New"/>
+                <w:color w:val="1F2937"/>
+                <w:sz w:val="16"/>
+                <w:szCs w:val="16"/>
+                <w:shd w:fill="EEF1F6" w:color="auto" w:val="clear"/>
+              </w:rPr>
+              <w:t xml:space="preserve"/>
+            </w:r>
+            <w:r>
+              <w:rPr>
+                <w:rFonts w:ascii="Calibri" w:cs="Calibri" w:eastAsia="Calibri" w:hAnsi="Calibri"/>
+                <w:color w:val="1F2937"/>
+                <w:sz w:val="19"/>
+                <w:szCs w:val="19"/>
+              </w:rPr>
+              <w:t xml:space="preserve"/>
+            </w:r>
+          </w:p>
+        </w:tc>
+      </w:tr>
     </w:tbl>
     <w:p>
       <w:pPr>
@@ -32139,6 +32383,21 @@
           <w:szCs w:val="21"/>
         </w:rPr>
         <w:t xml:space="preserve">Launcher news. NewsService reads the RSS feed named in config.json only when someone opens the launcher and its copy is older than refreshMinutes (5): at most one download of about 130 KB per period, none while nobody visits, and visits that arrive during a download share it. It keeps the 15 newest items of the Forever category, strips the markup of the summary and keeps only http and https links; the XML parser accepts no DOCTYPE and loads nothing external. If Wowhead fails or takes more than 3 seconds, the last good news keep being served and Wowhead is not asked again until the period ends (503 only while no read has worked). A new item shows up within about five and a half minutes: the 5 minutes of the copy plus the 30 seconds Wowhead caches its own feed. Pictures load straight from Wowhead, so they cost the site no bandwidth. The panel shows the newest item with a large 16:9 picture and the rest as a list, each with its relative and absolute date in Spanish (Europe/Madrid), and opens the article on Wowhead in a new tab.</w:t>
+      </w:r>
+    </w:p>
+    <w:p>
+      <w:pPr>
+        <w:spacing w:after="120" w:line="264"/>
+        <w:ind w:left="720"/>
+      </w:pPr>
+      <w:r>
+        <w:rPr>
+          <w:rFonts w:ascii="Calibri" w:cs="Calibri" w:eastAsia="Calibri" w:hAnsi="Calibri"/>
+          <w:color w:val="1F2937"/>
+          <w:sz w:val="21"/>
+          <w:szCs w:val="21"/>
+        </w:rPr>
+        <w:t xml:space="preserve">Launcher blue posts. The news panel has two tabs, Noticias and Blue posts; the blue posts are only asked for the first time their tab is opened. BluePostsService reads the Blizzard tracker of the official forums (bluePosts.trackerUrl, the JSON list of the posts of Blizzard employees in every forum of the game, 20 per page, about 33 KB) with the same on-demand copy as the news (OnDemandCopy), kept for refreshMinutes (10). The tracker mixes every version of the game, so it reads page by page with ?before_post_id=&lt;id of the last post&gt; (at most maxPages, 5; usually 2 or 3) until it has the 20 newest posts about WoW Forever: those of the WoW Forever categories (346 to 349) and those of other categories whose topic title names the game (the official news are posted in the general news category). Moderator notes and hidden posts are skipped, answers inside a topic show as "Re: &lt;title&gt;", and when Blizzard opens the same announcement in two forums only the newest topic is kept. The summary is the excerpt of the forums without markup or the links that stand for pictures and videos. The panel shows the date, the title, the author in blue and the summary, and opens the post on the forums in a new tab. The posts are in English, as Blizzard writes them; the Spanish forums only carry the translated official news.</w:t>
       </w:r>
     </w:p>
     <w:p>
@@ -34156,6 +34415,76 @@
               <w:bottom w:val="single" w:color="C9D3E3" w:sz="4"/>
               <w:right w:val="single" w:color="C9D3E3" w:sz="4"/>
             </w:tcBorders>
+            <w:shd w:fill="F3F6FC" w:color="auto" w:val="clear"/>
+            <w:tcMar>
+              <w:top w:type="dxa" w:w="60"/>
+              <w:left w:type="dxa" w:w="100"/>
+              <w:bottom w:type="dxa" w:w="60"/>
+              <w:right w:type="dxa" w:w="100"/>
+            </w:tcMar>
+          </w:tcPr>
+          <w:p>
+            <w:pPr>
+              <w:spacing w:after="30" w:line="250"/>
+            </w:pPr>
+            <w:r>
+              <w:rPr>
+                <w:rFonts w:ascii="Courier New" w:cs="Courier New" w:eastAsia="Courier New" w:hAnsi="Courier New"/>
+                <w:color w:val="1F2937"/>
+                <w:sz w:val="16"/>
+                <w:szCs w:val="16"/>
+                <w:shd w:fill="EEF1F6" w:color="auto" w:val="clear"/>
+              </w:rPr>
+              <w:t xml:space="preserve">bluePosts</w:t>
+            </w:r>
+          </w:p>
+        </w:tc>
+        <w:tc>
+          <w:tcPr>
+            <w:tcW w:type="dxa" w:w="6116"/>
+            <w:tcBorders>
+              <w:top w:val="single" w:color="C9D3E3" w:sz="4"/>
+              <w:left w:val="single" w:color="C9D3E3" w:sz="4"/>
+              <w:bottom w:val="single" w:color="C9D3E3" w:sz="4"/>
+              <w:right w:val="single" w:color="C9D3E3" w:sz="4"/>
+            </w:tcBorders>
+            <w:shd w:fill="F3F6FC" w:color="auto" w:val="clear"/>
+            <w:tcMar>
+              <w:top w:type="dxa" w:w="60"/>
+              <w:left w:type="dxa" w:w="100"/>
+              <w:bottom w:type="dxa" w:w="60"/>
+              <w:right w:type="dxa" w:w="100"/>
+            </w:tcMar>
+          </w:tcPr>
+          <w:p>
+            <w:pPr>
+              <w:spacing w:after="30" w:line="250"/>
+            </w:pPr>
+            <w:r>
+              <w:rPr>
+                <w:rFonts w:ascii="Calibri" w:cs="Calibri" w:eastAsia="Calibri" w:hAnsi="Calibri"/>
+                <w:color w:val="1F2937"/>
+                <w:sz w:val="19"/>
+                <w:szCs w:val="19"/>
+              </w:rPr>
+              <w:t xml:space="preserve">Launcher blue posts: trackerUrl and forumUrl (Blizzard forums), categories (WoW Forever forums), titleKeyword (Forever), limit (20), maxPages (5), refreshMinutes (10), source and sourceUrl of the credit</w:t>
+            </w:r>
+          </w:p>
+        </w:tc>
+      </w:tr>
+      <w:tr>
+        <w:trPr>
+          <w:cantSplit/>
+        </w:trPr>
+        <w:tc>
+          <w:tcPr>
+            <w:tcW w:type="dxa" w:w="2484"/>
+            <w:tcBorders>
+              <w:top w:val="single" w:color="C9D3E3" w:sz="4"/>
+              <w:left w:val="single" w:color="C9D3E3" w:sz="4"/>
+              <w:bottom w:val="single" w:color="C9D3E3" w:sz="4"/>
+              <w:right w:val="single" w:color="C9D3E3" w:sz="4"/>
+            </w:tcBorders>
             <w:tcMar>
               <w:top w:type="dxa" w:w="60"/>
               <w:left w:type="dxa" w:w="100"/>
@@ -36529,6 +36858,45 @@
           <w:szCs w:val="21"/>
         </w:rPr>
         <w:t xml:space="preserve">Keep "Fuente: Wowhead" under the news panel and the link of every item to its article: only titles, summaries, dates and pictures are shown, never the articles. LICENSE records this use.</w:t>
+      </w:r>
+      <w:r>
+        <w:rPr>
+          <w:rFonts w:ascii="Courier New" w:cs="Courier New" w:eastAsia="Courier New" w:hAnsi="Courier New"/>
+          <w:color w:val="1F2937"/>
+          <w:sz w:val="18"/>
+          <w:szCs w:val="18"/>
+          <w:shd w:fill="EEF1F6" w:color="auto" w:val="clear"/>
+        </w:rPr>
+        <w:t xml:space="preserve"/>
+      </w:r>
+      <w:r>
+        <w:rPr>
+          <w:rFonts w:ascii="Calibri" w:cs="Calibri" w:eastAsia="Calibri" w:hAnsi="Calibri"/>
+          <w:color w:val="1F2937"/>
+          <w:sz w:val="21"/>
+          <w:szCs w:val="21"/>
+        </w:rPr>
+        <w:t xml:space="preserve"/>
+      </w:r>
+    </w:p>
+    <w:p>
+      <w:pPr>
+        <w:pStyle w:val="ListParagraph"/>
+        <w:numPr>
+          <w:ilvl w:val="0"/>
+          <w:numId w:val="3"/>
+        </w:numPr>
+        <w:spacing w:after="70" w:line="264"/>
+        <w:ind w:left="1080" w:hanging="300"/>
+      </w:pPr>
+      <w:r>
+        <w:rPr>
+          <w:rFonts w:ascii="Calibri" w:cs="Calibri" w:eastAsia="Calibri" w:hAnsi="Calibri"/>
+          <w:color w:val="1F2937"/>
+          <w:sz w:val="21"/>
+          <w:szCs w:val="21"/>
+        </w:rPr>
+        <w:t xml:space="preserve">Keep "Fuente: Blizzard Forums" under the Blue posts tab and the link of every post to the forums: only titles, authors, dates and excerpts are shown, never the posts. LICENSE records this use.</w:t>
       </w:r>
       <w:r>
         <w:rPr>
@@ -45181,7 +45549,7 @@
           <w:sz w:val="21"/>
           <w:szCs w:val="21"/>
         </w:rPr>
-        <w:t xml:space="preserve">Ticked Legacy challenges live in each browser; Dungeons y loot is not built; the launcher news are in English, as Wowhead publishes them.</w:t>
+        <w:t xml:space="preserve">Ticked Legacy challenges live in each browser; Dungeons y loot is not built; the launcher news and blue posts are in English, as Wowhead and Blizzard publish them.</w:t>
       </w:r>
     </w:p>
     <w:p>
@@ -45325,6 +45693,104 @@
                 <w:szCs w:val="19"/>
               </w:rPr>
               <w:t xml:space="preserve">Change</w:t>
+            </w:r>
+          </w:p>
+        </w:tc>
+      </w:tr>
+      <w:tr>
+        <w:trPr>
+          <w:cantSplit/>
+        </w:trPr>
+        <w:tc>
+          <w:tcPr>
+            <w:tcW w:type="dxa" w:w="955"/>
+            <w:tcBorders>
+              <w:top w:val="single" w:color="C9D3E3" w:sz="4"/>
+              <w:left w:val="single" w:color="C9D3E3" w:sz="4"/>
+              <w:bottom w:val="single" w:color="C9D3E3" w:sz="4"/>
+              <w:right w:val="single" w:color="C9D3E3" w:sz="4"/>
+            </w:tcBorders>
+            <w:tcMar>
+              <w:top w:type="dxa" w:w="60"/>
+              <w:left w:type="dxa" w:w="100"/>
+              <w:bottom w:type="dxa" w:w="60"/>
+              <w:right w:type="dxa" w:w="100"/>
+            </w:tcMar>
+          </w:tcPr>
+          <w:p>
+            <w:pPr>
+              <w:spacing w:after="30" w:line="250"/>
+            </w:pPr>
+            <w:r>
+              <w:rPr>
+                <w:rFonts w:ascii="Calibri" w:cs="Calibri" w:eastAsia="Calibri" w:hAnsi="Calibri"/>
+                <w:color w:val="1F2937"/>
+                <w:sz w:val="21"/>
+                <w:szCs w:val="21"/>
+              </w:rPr>
+              <w:t xml:space="preserve">2.8</w:t>
+            </w:r>
+          </w:p>
+        </w:tc>
+        <w:tc>
+          <w:tcPr>
+            <w:tcW w:type="dxa" w:w="1337"/>
+            <w:tcBorders>
+              <w:top w:val="single" w:color="C9D3E3" w:sz="4"/>
+              <w:left w:val="single" w:color="C9D3E3" w:sz="4"/>
+              <w:bottom w:val="single" w:color="C9D3E3" w:sz="4"/>
+              <w:right w:val="single" w:color="C9D3E3" w:sz="4"/>
+            </w:tcBorders>
+            <w:tcMar>
+              <w:top w:type="dxa" w:w="60"/>
+              <w:left w:type="dxa" w:w="100"/>
+              <w:bottom w:type="dxa" w:w="60"/>
+              <w:right w:type="dxa" w:w="100"/>
+            </w:tcMar>
+          </w:tcPr>
+          <w:p>
+            <w:pPr>
+              <w:spacing w:after="30" w:line="250"/>
+            </w:pPr>
+            <w:r>
+              <w:rPr>
+                <w:rFonts w:ascii="Calibri" w:cs="Calibri" w:eastAsia="Calibri" w:hAnsi="Calibri"/>
+                <w:color w:val="1F2937"/>
+                <w:sz w:val="21"/>
+                <w:szCs w:val="21"/>
+              </w:rPr>
+              <w:t xml:space="preserve">2026-10-29</w:t>
+            </w:r>
+          </w:p>
+        </w:tc>
+        <w:tc>
+          <w:tcPr>
+            <w:tcW w:type="dxa" w:w="6308"/>
+            <w:tcBorders>
+              <w:top w:val="single" w:color="C9D3E3" w:sz="4"/>
+              <w:left w:val="single" w:color="C9D3E3" w:sz="4"/>
+              <w:bottom w:val="single" w:color="C9D3E3" w:sz="4"/>
+              <w:right w:val="single" w:color="C9D3E3" w:sz="4"/>
+            </w:tcBorders>
+            <w:tcMar>
+              <w:top w:type="dxa" w:w="60"/>
+              <w:left w:type="dxa" w:w="100"/>
+              <w:bottom w:type="dxa" w:w="60"/>
+              <w:right w:type="dxa" w:w="100"/>
+            </w:tcMar>
+          </w:tcPr>
+          <w:p>
+            <w:pPr>
+              <w:spacing w:after="30" w:line="250"/>
+            </w:pPr>
+            <w:r>
+              <w:rPr>
+                <w:rFonts w:ascii="Calibri" w:cs="Calibri" w:eastAsia="Calibri" w:hAnsi="Calibri"/>
+                <w:color w:val="1F2937"/>
+                <w:sz w:val="21"/>
+                <w:szCs w:val="21"/>
+              </w:rPr>
+              <w:t xml:space="preserve">WoW Forever launcher blue posts: the news panel gets two tabs (Noticias, Blue posts); GET /wow-forever/blue-posts serves the 20 newest posts of Blizzard employees about WoW Forever from the Blizzard tracker of the official forums (on-demand copy of 10 minutes, cross-posted announcements kept once), bluePosts section in config.json; the on-demand copy and the HTML text cleaning are shared by the news and the blue posts; LICENSE credits the Blizzard forums</w:t>
             </w:r>
           </w:p>
         </w:tc>

</xml_diff>

<commit_message>
feat(platform): game icons, Team NTG logo and header clock on phones
Each catalog game gets an icon (platform/game-icons/<key>, stored at 128 px
and 100 KB at most) uploaded from the admin Games screen, sent as iconUrl in
GET /games and shown in the sidebar instead of the generic symbol (a game
without icon keeps it). Image slots may set their own limits
(ImageSlot.spec). Sidebar icons share one width so the labels line up, the
sidebar shows the Team NTG logo (favicon.png) instead of the hexagon, and the
header clock also shows on phones. Manual 2.9 and READMEs updated.

Co-Authored-By: Claude Opus 5.5 <noreply@anthropic.com>
</commit_message>
<xml_diff>
--- a/docs/NTG — Technical Manual.docx
+++ b/docs/NTG — Technical Manual.docx
@@ -119,7 +119,7 @@
           <w:sz w:val="22"/>
           <w:szCs w:val="22"/>
         </w:rPr>
-        <w:t xml:space="preserve">Version 2.8  ·  Oct 29, 2026</w:t>
+        <w:t xml:space="preserve">Version 2.9  ·  Oct 29, 2026</w:t>
       </w:r>
     </w:p>
     <w:p>
@@ -5209,7 +5209,7 @@
           <w:sz w:val="17"/>
           <w:szCs w:val="17"/>
         </w:rPr>
-        <w:t xml:space="preserve">    ├── public/                   favicon.png</w:t>
+        <w:t xml:space="preserve">    ├── public/                   favicon.png (Team NTG logo: browser tab and sidebar)</w:t>
       </w:r>
     </w:p>
     <w:p>
@@ -11153,7 +11153,7 @@
           <w:szCs w:val="18"/>
           <w:shd w:fill="EEF1F6" w:color="auto" w:val="clear"/>
         </w:rPr>
-        <w:t xml:space="preserve">coverUrl</w:t>
+        <w:t xml:space="preserve">coverUrl, iconUrl</w:t>
       </w:r>
       <w:r>
         <w:rPr>
@@ -11331,7 +11331,7 @@
           <w:sz w:val="21"/>
           <w:szCs w:val="21"/>
         </w:rPr>
-        <w:t xml:space="preserve"> deletes its cover but keeps its tag and its data.</w:t>
+        <w:t xml:space="preserve"> deletes its cover and its icon but keeps its tag and its data.</w:t>
       </w:r>
     </w:p>
     <w:p>
@@ -11347,6 +11347,37 @@
       <w:r>
         <w:rPr>
           <w:rFonts w:ascii="Calibri" w:cs="Calibri" w:eastAsia="Calibri" w:hAnsi="Calibri"/>
+          <w:b/>
+          <w:bCs/>
+          <w:color w:val="1F2937"/>
+          <w:sz w:val="21"/>
+          <w:szCs w:val="21"/>
+        </w:rPr>
+        <w:t xml:space="preserve">Game icons.</w:t>
+      </w:r>
+      <w:r>
+        <w:rPr>
+          <w:rFonts w:ascii="Calibri" w:cs="Calibri" w:eastAsia="Calibri" w:hAnsi="Calibri"/>
+          <w:color w:val="1F2937"/>
+          <w:sz w:val="21"/>
+          <w:szCs w:val="21"/>
+        </w:rPr>
+        <w:t xml:space="preserve"> Each game also has an icon, platform/game-icons/&lt;key&gt;, uploaded from the Games screen (⬆ ICONO) or the Pictures screen. The sidebar shows it at 20 px next to the name of the game, and alone when the sidebar is folded; while a game has no icon the sidebar keeps the generic ◎ symbol. It travels in the same GET /games answer, so it costs no extra call. A square PNG with transparency works best (the game logo or emblem); it is stored at 128 px and 100 KB at most.</w:t>
+      </w:r>
+    </w:p>
+    <w:p>
+      <w:pPr>
+        <w:pStyle w:val="ListParagraph"/>
+        <w:numPr>
+          <w:ilvl w:val="0"/>
+          <w:numId w:val="3"/>
+        </w:numPr>
+        <w:spacing w:after="70" w:line="264"/>
+        <w:ind w:left="1080" w:hanging="300"/>
+      </w:pPr>
+      <w:r>
+        <w:rPr>
+          <w:rFonts w:ascii="Calibri" w:cs="Calibri" w:eastAsia="Calibri" w:hAnsi="Calibri"/>
           <w:color w:val="1F2937"/>
           <w:sz w:val="21"/>
           <w:szCs w:val="21"/>
@@ -11384,7 +11415,7 @@
           <w:sz w:val="21"/>
           <w:szCs w:val="21"/>
         </w:rPr>
-        <w:t xml:space="preserve">Covers and game artwork are pictures that admins upload from the Pictures screen. Modules declare which ones they need (</w:t>
+        <w:t xml:space="preserve">Covers, game icons and game artwork are pictures that admins upload from the Pictures screen. Modules declare which ones they need (</w:t>
       </w:r>
       <w:r>
         <w:rPr>
@@ -11441,7 +11472,7 @@
           <w:sz w:val="21"/>
           <w:szCs w:val="21"/>
         </w:rPr>
-        <w:t xml:space="preserve">; uploads are only accepted for declared keys.</w:t>
+        <w:t xml:space="preserve">; uploads are only accepted for declared keys. A slot may set smaller limits for a picture only shown small (ImageSlot.spec): the game icons, platform/game-icons/&lt;key&gt;, use 128 px and 100 KB.</w:t>
       </w:r>
     </w:p>
     <w:tbl>
@@ -11677,7 +11708,7 @@
                 <w:sz w:val="19"/>
                 <w:szCs w:val="19"/>
               </w:rPr>
-              <w:t xml:space="preserve"> (JDK only): resize to the longest side allowed (1,920 px for public pictures), re-encode as JPEG, or PNG when there are transparent pixels, and lower the quality (0.82, 0.72, 0.62) and then the size until the file fits (1.5 MB). One picture at a time, to protect the memory of the free server</w:t>
+              <w:t xml:space="preserve"> (JDK only): resize to the longest side allowed (1,920 px for public pictures, 128 px for game icons), re-encode as JPEG, or PNG when there are transparent pixels, and lower the quality (0.82, 0.72, 0.62) and then the size until the file fits (1.5 MB, 100 KB for game icons). One picture at a time, to protect the memory of the free server</w:t>
             </w:r>
           </w:p>
         </w:tc>
@@ -19400,7 +19431,7 @@
                 <w:sz w:val="19"/>
                 <w:szCs w:val="19"/>
               </w:rPr>
-              <w:t xml:space="preserve">Covers and game artwork, one object per key</w:t>
+              <w:t xml:space="preserve">Covers, game icons and game artwork, one object per key</w:t>
             </w:r>
           </w:p>
         </w:tc>
@@ -41701,7 +41732,7 @@
                 <w:sz w:val="19"/>
                 <w:szCs w:val="19"/>
               </w:rPr>
-              <w:t xml:space="preserve">Catalog entry (creates the tag), cover, release</w:t>
+              <w:t xml:space="preserve">Catalog entry (creates the tag), cover, icon, release</w:t>
             </w:r>
           </w:p>
         </w:tc>
@@ -42815,7 +42846,7 @@
           <w:sz w:val="21"/>
           <w:szCs w:val="21"/>
         </w:rPr>
-        <w:t xml:space="preserve">Upload its cover from the same screen, and any other picture it declares in the Pictures screen.</w:t>
+        <w:t xml:space="preserve">Upload its cover and its icon from the same screen, and any other picture it declares in the Pictures screen.</w:t>
       </w:r>
     </w:p>
     <w:p>
@@ -45693,6 +45724,104 @@
                 <w:szCs w:val="19"/>
               </w:rPr>
               <w:t xml:space="preserve">Change</w:t>
+            </w:r>
+          </w:p>
+        </w:tc>
+      </w:tr>
+      <w:tr>
+        <w:trPr>
+          <w:cantSplit/>
+        </w:trPr>
+        <w:tc>
+          <w:tcPr>
+            <w:tcW w:type="dxa" w:w="955"/>
+            <w:tcBorders>
+              <w:top w:val="single" w:color="C9D3E3" w:sz="4"/>
+              <w:left w:val="single" w:color="C9D3E3" w:sz="4"/>
+              <w:bottom w:val="single" w:color="C9D3E3" w:sz="4"/>
+              <w:right w:val="single" w:color="C9D3E3" w:sz="4"/>
+            </w:tcBorders>
+            <w:tcMar>
+              <w:top w:type="dxa" w:w="60"/>
+              <w:left w:type="dxa" w:w="100"/>
+              <w:bottom w:type="dxa" w:w="60"/>
+              <w:right w:type="dxa" w:w="100"/>
+            </w:tcMar>
+          </w:tcPr>
+          <w:p>
+            <w:pPr>
+              <w:spacing w:after="30" w:line="250"/>
+            </w:pPr>
+            <w:r>
+              <w:rPr>
+                <w:rFonts w:ascii="Calibri" w:cs="Calibri" w:eastAsia="Calibri" w:hAnsi="Calibri"/>
+                <w:color w:val="1F2937"/>
+                <w:sz w:val="21"/>
+                <w:szCs w:val="21"/>
+              </w:rPr>
+              <w:t xml:space="preserve">2.9</w:t>
+            </w:r>
+          </w:p>
+        </w:tc>
+        <w:tc>
+          <w:tcPr>
+            <w:tcW w:type="dxa" w:w="1337"/>
+            <w:tcBorders>
+              <w:top w:val="single" w:color="C9D3E3" w:sz="4"/>
+              <w:left w:val="single" w:color="C9D3E3" w:sz="4"/>
+              <w:bottom w:val="single" w:color="C9D3E3" w:sz="4"/>
+              <w:right w:val="single" w:color="C9D3E3" w:sz="4"/>
+            </w:tcBorders>
+            <w:tcMar>
+              <w:top w:type="dxa" w:w="60"/>
+              <w:left w:type="dxa" w:w="100"/>
+              <w:bottom w:type="dxa" w:w="60"/>
+              <w:right w:type="dxa" w:w="100"/>
+            </w:tcMar>
+          </w:tcPr>
+          <w:p>
+            <w:pPr>
+              <w:spacing w:after="30" w:line="250"/>
+            </w:pPr>
+            <w:r>
+              <w:rPr>
+                <w:rFonts w:ascii="Calibri" w:cs="Calibri" w:eastAsia="Calibri" w:hAnsi="Calibri"/>
+                <w:color w:val="1F2937"/>
+                <w:sz w:val="21"/>
+                <w:szCs w:val="21"/>
+              </w:rPr>
+              <w:t xml:space="preserve">2026-10-29</w:t>
+            </w:r>
+          </w:p>
+        </w:tc>
+        <w:tc>
+          <w:tcPr>
+            <w:tcW w:type="dxa" w:w="6308"/>
+            <w:tcBorders>
+              <w:top w:val="single" w:color="C9D3E3" w:sz="4"/>
+              <w:left w:val="single" w:color="C9D3E3" w:sz="4"/>
+              <w:bottom w:val="single" w:color="C9D3E3" w:sz="4"/>
+              <w:right w:val="single" w:color="C9D3E3" w:sz="4"/>
+            </w:tcBorders>
+            <w:tcMar>
+              <w:top w:type="dxa" w:w="60"/>
+              <w:left w:type="dxa" w:w="100"/>
+              <w:bottom w:type="dxa" w:w="60"/>
+              <w:right w:type="dxa" w:w="100"/>
+            </w:tcMar>
+          </w:tcPr>
+          <w:p>
+            <w:pPr>
+              <w:spacing w:after="30" w:line="250"/>
+            </w:pPr>
+            <w:r>
+              <w:rPr>
+                <w:rFonts w:ascii="Calibri" w:cs="Calibri" w:eastAsia="Calibri" w:hAnsi="Calibri"/>
+                <w:color w:val="1F2937"/>
+                <w:sz w:val="21"/>
+                <w:szCs w:val="21"/>
+              </w:rPr>
+              <w:t xml:space="preserve">Game icons: each catalog game gets an icon (platform/game-icons/&lt;key&gt;, 128 px and 100 KB at most) uploaded from the Games screen, sent as iconUrl in GET /games and shown in the sidebar instead of the generic symbol; image slots may set their own limits (ImageSlot.spec); sidebar icons share one width so the labels line up; the sidebar shows the Team NTG logo (favicon.png) instead of the hexagon; the header clock also shows on phones</w:t>
             </w:r>
           </w:p>
         </w:tc>

</xml_diff>